<commit_message>
Create excel_ai/permalink_countryeditable (every module, both permalink folders); setup guide with git in brief as other/SetupGuide.docx and Appendix A of the quick start
Co-Authored-By: Claude Opus 5.5 <noreply@anthropic.com>
Claude-Session: https://claude.ai/code/session_01VSHkeGCB7nXrurxDYPdfYr
</commit_message>
<xml_diff>
--- a/HumanReadme-QuickStart.docx
+++ b/HumanReadme-QuickStart.docx
@@ -1821,7 +1821,7 @@
         <w:t xml:space="preserve">&lt;Name&gt;_latest.&lt;ext&gt;</w:t>
       </w:r>
       <w:r>
-        <w:t xml:space="preserve">) that other files link to, so links do not break when the version number changes. Today it holds </w:t>
+        <w:t xml:space="preserve">) that other files link to, so links do not break when the version number changes. It holds every module: today </w:t>
       </w:r>
       <w:r>
         <w:rPr>
@@ -1833,7 +1833,31 @@
         <w:t xml:space="preserve">CPAT-AI-Mitigation-Prototype_latest.xlsm</w:t>
       </w:r>
       <w:r>
-        <w:t xml:space="preserve">.</w:t>
+        <w:t xml:space="preserve">, </w:t>
+      </w:r>
+      <w:r>
+        <w:rPr>
+          <w:rFonts w:ascii="Consolas" w:cs="Consolas" w:eastAsia="Consolas" w:hAnsi="Consolas"/>
+          <w:color w:val="7F3F00"/>
+          <w:sz w:val="19"/>
+          <w:szCs w:val="19"/>
+        </w:rPr>
+        <w:t xml:space="preserve">CPAT-AI-Distribution-Prototype_latest.xlsm</w:t>
+      </w:r>
+      <w:r>
+        <w:t xml:space="preserve"> and </w:t>
+      </w:r>
+      <w:r>
+        <w:rPr>
+          <w:rFonts w:ascii="Consolas" w:cs="Consolas" w:eastAsia="Consolas" w:hAnsi="Consolas"/>
+          <w:color w:val="7F3F00"/>
+          <w:sz w:val="19"/>
+          <w:szCs w:val="19"/>
+        </w:rPr>
+        <w:t xml:space="preserve">CPAT-AI-Air-Pollution-Standalone_latest.xlsx</w:t>
+      </w:r>
+      <w:r>
+        <w:t xml:space="preserve"> (Transport Co-benefits when it exists). The builders publish to it.</w:t>
       </w:r>
     </w:p>
     <w:p>
@@ -1848,19 +1872,7 @@
         <w:t xml:space="preserve">New: `excel_ai/permalink_countryeditable/`</w:t>
       </w:r>
       <w:r>
-        <w:t xml:space="preserve"> (to be added; see </w:t>
-      </w:r>
-      <w:r>
-        <w:rPr>
-          <w:rFonts w:ascii="Consolas" w:cs="Consolas" w:eastAsia="Consolas" w:hAnsi="Consolas"/>
-          <w:color w:val="7F3F00"/>
-          <w:sz w:val="19"/>
-          <w:szCs w:val="19"/>
-        </w:rPr>
-        <w:t xml:space="preserve">excel_ai/plans/TODO.md</w:t>
-      </w:r>
-      <w:r>
-        <w:t xml:space="preserve">). It is a copy of </w:t>
+        <w:t xml:space="preserve"> is a copy of </w:t>
       </w:r>
       <w:r>
         <w:rPr>
@@ -1872,7 +1884,7 @@
         <w:t xml:space="preserve">permalink/</w:t>
       </w:r>
       <w:r>
-        <w:t xml:space="preserve">, and both should hold every module. It lets a user run, say, mitigation for a particular country on their local drive and edit it, while the modules keep reading each other through fixed names.</w:t>
+        <w:t xml:space="preserve"> with the same modules, and the builders refresh both. Open and edit the copies here to run, say, mitigation for a particular country on your local drive; the modules keep reading each other through the fixed names. Keep copies holding real data local: never commit them.</w:t>
       </w:r>
     </w:p>
     <w:p>
@@ -1916,7 +1928,7 @@
         <w:t xml:space="preserve">Update from Mitigation</w:t>
       </w:r>
       <w:r>
-        <w:t xml:space="preserve"> button on its Cover; the target design is a </w:t>
+        <w:t xml:space="preserve"> button on its Cover; next, a </w:t>
       </w:r>
       <w:r>
         <w:rPr>
@@ -1938,7 +1950,7 @@
         <w:t xml:space="preserve">permalink_countryeditable/</w:t>
       </w:r>
       <w:r>
-        <w:t xml:space="preserve">, so a country edit made locally flows straight into Distribution, AP and Transport Co-benefits.</w:t>
+        <w:t xml:space="preserve"> (TODO M6), so a country edit made locally flows straight into Distribution, AP and Transport Co-benefits.</w:t>
       </w:r>
     </w:p>
     <w:p>
@@ -2122,10 +2134,22 @@
           <w:b/>
           <w:bCs/>
         </w:rPr>
-        <w:t xml:space="preserve">Four main files</w:t>
-      </w:r>
-      <w:r>
-        <w:t xml:space="preserve"> are considered for information security: the Mitigation, Distribution, Air Pollution and Transport Co-benefits workbooks. Any of them can hold real data once loaded.</w:t>
+        <w:t xml:space="preserve">The four main files</w:t>
+      </w:r>
+      <w:r>
+        <w:t xml:space="preserve"> for information security are the core human-readable files at the top of </w:t>
+      </w:r>
+      <w:r>
+        <w:rPr>
+          <w:rFonts w:ascii="Consolas" w:cs="Consolas" w:eastAsia="Consolas" w:hAnsi="Consolas"/>
+          <w:color w:val="7F3F00"/>
+          <w:sz w:val="19"/>
+          <w:szCs w:val="19"/>
+        </w:rPr>
+        <w:t xml:space="preserve">excel_ai/</w:t>
+      </w:r>
+      <w:r>
+        <w:t xml:space="preserve">: the bugs document, the tracker, the codes map and the deck. They are shared beyond the team, so they must hold no proprietary data or values derived from it.</w:t>
       </w:r>
     </w:p>
     <w:p>
@@ -3897,7 +3921,7 @@
         <w:pStyle w:val="Heading1"/>
       </w:pPr>
       <w:r>
-        <w:t xml:space="preserve">8. Git in two minutes, and the repos</w:t>
+        <w:t xml:space="preserve">8. The repos and git</w:t>
       </w:r>
     </w:p>
     <w:p>
@@ -4104,7 +4128,7 @@
           </w:tcPr>
           <w:p>
             <w:r>
-              <w:t xml:space="preserve">The wider set of AI climate-fiscal tools beyond CPAT. Public, so never put CPAT data or internal material there.</w:t>
+              <w:t xml:space="preserve">The wider set of AI climate-fiscal tools beyond CPAT (e.g. the excise diagnostic, the tax dashboard). Public, so never put CPAT data or internal material there.</w:t>
             </w:r>
           </w:p>
         </w:tc>
@@ -4171,10 +4195,22 @@
                 <w:sz w:val="19"/>
                 <w:szCs w:val="19"/>
               </w:rPr>
+              <w:t xml:space="preserve">CloneRepos.bat</w:t>
+            </w:r>
+            <w:r>
+              <w:t xml:space="preserve">, </w:t>
+            </w:r>
+            <w:r>
+              <w:rPr>
+                <w:rFonts w:ascii="Consolas" w:cs="Consolas" w:eastAsia="Consolas" w:hAnsi="Consolas"/>
+                <w:color w:val="7F3F00"/>
+                <w:sz w:val="19"/>
+                <w:szCs w:val="19"/>
+              </w:rPr>
               <w:t xml:space="preserve">SyncRepo.bat</w:t>
             </w:r>
             <w:r>
-              <w:t xml:space="preserve"> and </w:t>
+              <w:t xml:space="preserve">, </w:t>
             </w:r>
             <w:r>
               <w:rPr>
@@ -4186,7 +4222,19 @@
               <w:t xml:space="preserve">SyncAllRepos.bat</w:t>
             </w:r>
             <w:r>
-              <w:t xml:space="preserve">.</w:t>
+              <w:t xml:space="preserve">, </w:t>
+            </w:r>
+            <w:r>
+              <w:rPr>
+                <w:rFonts w:ascii="Consolas" w:cs="Consolas" w:eastAsia="Consolas" w:hAnsi="Consolas"/>
+                <w:color w:val="7F3F00"/>
+                <w:sz w:val="19"/>
+                <w:szCs w:val="19"/>
+              </w:rPr>
+              <w:t xml:space="preserve">RepoDirectory.csv</w:t>
+            </w:r>
+            <w:r>
+              <w:t xml:space="preserve"> (in Repos.zip).</w:t>
             </w:r>
           </w:p>
         </w:tc>
@@ -4194,10 +4242,335 @@
     </w:tbl>
     <w:p>
       <w:pPr>
+        <w:spacing w:after="100" w:before="120"/>
+      </w:pPr>
+      <w:r>
+        <w:t xml:space="preserve">Getting set up and a short guide to git are in </w:t>
+      </w:r>
+      <w:r>
+        <w:rPr>
+          <w:b/>
+          <w:bCs/>
+        </w:rPr>
+        <w:t xml:space="preserve">Appendix A</w:t>
+      </w:r>
+      <w:r>
+        <w:t xml:space="preserve"> (also </w:t>
+      </w:r>
+      <w:r>
+        <w:rPr>
+          <w:rFonts w:ascii="Consolas" w:cs="Consolas" w:eastAsia="Consolas" w:hAnsi="Consolas"/>
+          <w:color w:val="7F3F00"/>
+          <w:sz w:val="19"/>
+          <w:szCs w:val="19"/>
+        </w:rPr>
+        <w:t xml:space="preserve">other/SetupGuide.docx</w:t>
+      </w:r>
+      <w:r>
+        <w:t xml:space="preserve">). In short: double-click </w:t>
+      </w:r>
+      <w:r>
+        <w:rPr>
+          <w:rFonts w:ascii="Consolas" w:cs="Consolas" w:eastAsia="Consolas" w:hAnsi="Consolas"/>
+          <w:color w:val="7F3F00"/>
+          <w:sz w:val="19"/>
+          <w:szCs w:val="19"/>
+        </w:rPr>
+        <w:t xml:space="preserve">SyncAllRepos.bat</w:t>
+      </w:r>
+      <w:r>
+        <w:t xml:space="preserve"> to pull and push every repo; if it stops with a merge conflict, </w:t>
+      </w:r>
+      <w:r>
+        <w:rPr>
+          <w:b/>
+          <w:bCs/>
+        </w:rPr>
+        <w:t xml:space="preserve">GitHub Desktop</w:t>
+      </w:r>
+      <w:r>
+        <w:t xml:space="preserve"> shows the clashing files and helps you resolve them.</w:t>
+      </w:r>
+    </w:p>
+    <w:p>
+      <w:pPr>
+        <w:pStyle w:val="Heading1"/>
+      </w:pPr>
+      <w:r>
+        <w:t xml:space="preserve">9. Further information</w:t>
+      </w:r>
+    </w:p>
+    <w:p>
+      <w:pPr>
+        <w:pStyle w:val="ListParagraph"/>
+        <w:numPr>
+          <w:ilvl w:val="0"/>
+          <w:numId w:val="3"/>
+        </w:numPr>
+        <w:spacing w:after="40"/>
+      </w:pPr>
+      <w:r>
+        <w:t xml:space="preserve">Folder map: </w:t>
+      </w:r>
+      <w:r>
+        <w:rPr>
+          <w:rFonts w:ascii="Consolas" w:cs="Consolas" w:eastAsia="Consolas" w:hAnsi="Consolas"/>
+          <w:color w:val="7F3F00"/>
+          <w:sz w:val="19"/>
+          <w:szCs w:val="19"/>
+        </w:rPr>
+        <w:t xml:space="preserve">README.md</w:t>
+      </w:r>
+      <w:r>
+        <w:t xml:space="preserve"> (root) and </w:t>
+      </w:r>
+      <w:r>
+        <w:rPr>
+          <w:rFonts w:ascii="Consolas" w:cs="Consolas" w:eastAsia="Consolas" w:hAnsi="Consolas"/>
+          <w:color w:val="7F3F00"/>
+          <w:sz w:val="19"/>
+          <w:szCs w:val="19"/>
+        </w:rPr>
+        <w:t xml:space="preserve">excel_ai/README.md</w:t>
+      </w:r>
+      <w:r>
+        <w:t xml:space="preserve">; each module folder has its own README.</w:t>
+      </w:r>
+    </w:p>
+    <w:p>
+      <w:pPr>
+        <w:pStyle w:val="ListParagraph"/>
+        <w:numPr>
+          <w:ilvl w:val="0"/>
+          <w:numId w:val="3"/>
+        </w:numPr>
+        <w:spacing w:after="40"/>
+      </w:pPr>
+      <w:r>
+        <w:t xml:space="preserve">How-to guides: the setup and tools guide </w:t>
+      </w:r>
+      <w:r>
+        <w:rPr>
+          <w:rFonts w:ascii="Consolas" w:cs="Consolas" w:eastAsia="Consolas" w:hAnsi="Consolas"/>
+          <w:color w:val="7F3F00"/>
+          <w:sz w:val="19"/>
+          <w:szCs w:val="19"/>
+        </w:rPr>
+        <w:t xml:space="preserve">other/SetupGuide.docx</w:t>
+      </w:r>
+      <w:r>
+        <w:t xml:space="preserve"> (Appendix A); the quick start in the mitigation Documentation; linking data in </w:t>
+      </w:r>
+      <w:r>
+        <w:rPr>
+          <w:rFonts w:ascii="Consolas" w:cs="Consolas" w:eastAsia="Consolas" w:hAnsi="Consolas"/>
+          <w:color w:val="7F3F00"/>
+          <w:sz w:val="19"/>
+          <w:szCs w:val="19"/>
+        </w:rPr>
+        <w:t xml:space="preserve">data/README.md</w:t>
+      </w:r>
+      <w:r>
+        <w:t xml:space="preserve">; regenerating the distribution data in </w:t>
+      </w:r>
+      <w:r>
+        <w:rPr>
+          <w:rFonts w:ascii="Consolas" w:cs="Consolas" w:eastAsia="Consolas" w:hAnsi="Consolas"/>
+          <w:color w:val="7F3F00"/>
+          <w:sz w:val="19"/>
+          <w:szCs w:val="19"/>
+        </w:rPr>
+        <w:t xml:space="preserve">other/distribution/REGENERATING_THE_DISTRIBUTIONAL_WORKBOOK.md</w:t>
+      </w:r>
+      <w:r>
+        <w:t xml:space="preserve">.</w:t>
+      </w:r>
+    </w:p>
+    <w:p>
+      <w:pPr>
+        <w:pStyle w:val="ListParagraph"/>
+        <w:numPr>
+          <w:ilvl w:val="0"/>
+          <w:numId w:val="3"/>
+        </w:numPr>
+        <w:spacing w:after="40"/>
+      </w:pPr>
+      <w:r>
+        <w:t xml:space="preserve">Supporting material in </w:t>
+      </w:r>
+      <w:r>
+        <w:rPr>
+          <w:rFonts w:ascii="Consolas" w:cs="Consolas" w:eastAsia="Consolas" w:hAnsi="Consolas"/>
+          <w:color w:val="7F3F00"/>
+          <w:sz w:val="19"/>
+          <w:szCs w:val="19"/>
+        </w:rPr>
+        <w:t xml:space="preserve">other/</w:t>
+      </w:r>
+      <w:r>
+        <w:t xml:space="preserve">: research papers, decks (</w:t>
+      </w:r>
+      <w:r>
+        <w:rPr>
+          <w:rFonts w:ascii="Consolas" w:cs="Consolas" w:eastAsia="Consolas" w:hAnsi="Consolas"/>
+          <w:color w:val="7F3F00"/>
+          <w:sz w:val="19"/>
+          <w:szCs w:val="19"/>
+        </w:rPr>
+        <w:t xml:space="preserve">other/presentations/</w:t>
+      </w:r>
+      <w:r>
+        <w:t xml:space="preserve">), the distribution pseudocode and earlier prototypes.</w:t>
+      </w:r>
+    </w:p>
+    <w:p>
+      <w:pPr>
+        <w:pStyle w:val="ListParagraph"/>
+        <w:numPr>
+          <w:ilvl w:val="0"/>
+          <w:numId w:val="3"/>
+        </w:numPr>
+        <w:spacing w:after="40"/>
+      </w:pPr>
+      <w:r>
+        <w:t xml:space="preserve">Plans: </w:t>
+      </w:r>
+      <w:r>
+        <w:rPr>
+          <w:rFonts w:ascii="Consolas" w:cs="Consolas" w:eastAsia="Consolas" w:hAnsi="Consolas"/>
+          <w:color w:val="7F3F00"/>
+          <w:sz w:val="19"/>
+          <w:szCs w:val="19"/>
+        </w:rPr>
+        <w:t xml:space="preserve">excel_ai/plans/</w:t>
+      </w:r>
+      <w:r>
+        <w:t xml:space="preserve"> (e.g. </w:t>
+      </w:r>
+      <w:r>
+        <w:rPr>
+          <w:rFonts w:ascii="Consolas" w:cs="Consolas" w:eastAsia="Consolas" w:hAnsi="Consolas"/>
+          <w:color w:val="7F3F00"/>
+          <w:sz w:val="19"/>
+          <w:szCs w:val="19"/>
+        </w:rPr>
+        <w:t xml:space="preserve">Modules.md</w:t>
+      </w:r>
+      <w:r>
+        <w:t xml:space="preserve"> for the modular design).</w:t>
+      </w:r>
+    </w:p>
+    <w:p>
+      <w:pPr>
+        <w:pStyle w:val="ListParagraph"/>
+        <w:numPr>
+          <w:ilvl w:val="0"/>
+          <w:numId w:val="3"/>
+        </w:numPr>
+        <w:spacing w:after="40"/>
+      </w:pPr>
+      <w:r>
+        <w:t xml:space="preserve">Python model: </w:t>
+      </w:r>
+      <w:r>
+        <w:rPr>
+          <w:rFonts w:ascii="Consolas" w:cs="Consolas" w:eastAsia="Consolas" w:hAnsi="Consolas"/>
+          <w:color w:val="7F3F00"/>
+          <w:sz w:val="19"/>
+          <w:szCs w:val="19"/>
+        </w:rPr>
+        <w:t xml:space="preserve">coded/README.md</w:t>
+      </w:r>
+      <w:r>
+        <w:t xml:space="preserve"> and </w:t>
+      </w:r>
+      <w:r>
+        <w:rPr>
+          <w:rFonts w:ascii="Consolas" w:cs="Consolas" w:eastAsia="Consolas" w:hAnsi="Consolas"/>
+          <w:color w:val="7F3F00"/>
+          <w:sz w:val="19"/>
+          <w:szCs w:val="19"/>
+        </w:rPr>
+        <w:t xml:space="preserve">coded/TODO.md</w:t>
+      </w:r>
+      <w:r>
+        <w:t xml:space="preserve">.</w:t>
+      </w:r>
+    </w:p>
+    <w:p>
+      <w:pPr>
+        <w:pStyle w:val="ListParagraph"/>
+        <w:numPr>
+          <w:ilvl w:val="0"/>
+          <w:numId w:val="3"/>
+        </w:numPr>
+        <w:spacing w:after="40"/>
+      </w:pPr>
+      <w:r>
+        <w:t xml:space="preserve">Personal working folders: </w:t>
+      </w:r>
+      <w:r>
+        <w:rPr>
+          <w:rFonts w:ascii="Consolas" w:cs="Consolas" w:eastAsia="Consolas" w:hAnsi="Consolas"/>
+          <w:color w:val="7F3F00"/>
+          <w:sz w:val="19"/>
+          <w:szCs w:val="19"/>
+        </w:rPr>
+        <w:t xml:space="preserve">users/</w:t>
+      </w:r>
+      <w:r>
+        <w:t xml:space="preserve">.</w:t>
+      </w:r>
+    </w:p>
+    <w:p>
+      <w:r>
+        <w:br w:type="page"/>
+      </w:r>
+    </w:p>
+    <w:p>
+      <w:pPr>
+        <w:pStyle w:val="Heading1"/>
+      </w:pPr>
+      <w:r>
+        <w:t xml:space="preserve">Appendix A. Getting set up with AI in the Climate-Fiscal team</w:t>
+      </w:r>
+    </w:p>
+    <w:p>
+      <w:pPr>
+        <w:spacing w:after="100"/>
+      </w:pPr>
+      <w:r>
+        <w:rPr>
+          <w:b/>
+          <w:bCs/>
+        </w:rPr>
+        <w:t xml:space="preserve">This guide has four parts.</w:t>
+      </w:r>
+      <w:r>
+        <w:t xml:space="preserve"> Part 1, Setup: new users, once. Part 2, Update: if you set up before the repos moved to github.com/cpmodelai, once. Part 3, Tools: how to use the three tools. Part 4, Git in brief: what git does and how to fix a clash.</w:t>
+      </w:r>
+    </w:p>
+    <w:p>
+      <w:pPr>
         <w:pStyle w:val="Heading2"/>
       </w:pPr>
       <w:r>
-        <w:t xml:space="preserve">The simple version</w:t>
+        <w:t xml:space="preserve">Part 1. Setup (new users)</w:t>
+      </w:r>
+    </w:p>
+    <w:p>
+      <w:pPr>
+        <w:spacing w:after="100"/>
+      </w:pPr>
+      <w:r>
+        <w:rPr>
+          <w:b/>
+          <w:bCs/>
+        </w:rPr>
+        <w:t xml:space="preserve">Action A:</w:t>
+      </w:r>
+      <w:r>
+        <w:t xml:space="preserve"> Please create a GitHub ID (using a work or personal email address).</w:t>
       </w:r>
     </w:p>
     <w:p>
@@ -4210,16 +4583,14 @@
         <w:spacing w:after="40"/>
       </w:pPr>
       <w:r>
-        <w:t xml:space="preserve">Install Git for Windows and clone the repos into </w:t>
-      </w:r>
-      <w:r>
-        <w:rPr>
-          <w:rFonts w:ascii="Consolas" w:cs="Consolas" w:eastAsia="Consolas" w:hAnsi="Consolas"/>
-          <w:color w:val="7F3F00"/>
-          <w:sz w:val="19"/>
-          <w:szCs w:val="19"/>
-        </w:rPr>
-        <w:t xml:space="preserve">C:\Users\&lt;you&gt;\Repos</w:t>
+        <w:t xml:space="preserve">Go to https://github.com and click </w:t>
+      </w:r>
+      <w:r>
+        <w:rPr>
+          <w:b/>
+          <w:bCs/>
+        </w:rPr>
+        <w:t xml:space="preserve">Sign up</w:t>
       </w:r>
       <w:r>
         <w:t xml:space="preserve">.</w:t>
@@ -4235,31 +4606,7 @@
         <w:spacing w:after="40"/>
       </w:pPr>
       <w:r>
-        <w:t xml:space="preserve">Double-click </w:t>
-      </w:r>
-      <w:r>
-        <w:rPr>
-          <w:rFonts w:ascii="Consolas" w:cs="Consolas" w:eastAsia="Consolas" w:hAnsi="Consolas"/>
-          <w:color w:val="7F3F00"/>
-          <w:sz w:val="19"/>
-          <w:szCs w:val="19"/>
-        </w:rPr>
-        <w:t xml:space="preserve">SyncRepo.bat</w:t>
-      </w:r>
-      <w:r>
-        <w:t xml:space="preserve"> in the repo root: it switches to </w:t>
-      </w:r>
-      <w:r>
-        <w:rPr>
-          <w:rFonts w:ascii="Consolas" w:cs="Consolas" w:eastAsia="Consolas" w:hAnsi="Consolas"/>
-          <w:color w:val="7F3F00"/>
-          <w:sz w:val="19"/>
-          <w:szCs w:val="19"/>
-        </w:rPr>
-        <w:t xml:space="preserve">main</w:t>
-      </w:r>
-      <w:r>
-        <w:t xml:space="preserve">, pulls the latest changes, then commits and pushes yours (it asks for a one-line message).</w:t>
+        <w:t xml:space="preserve">Enter your email address and a password.</w:t>
       </w:r>
     </w:p>
     <w:p>
@@ -4272,7 +4619,227 @@
         <w:spacing w:after="40"/>
       </w:pPr>
       <w:r>
-        <w:t xml:space="preserve">To sync every repo at once, use </w:t>
+        <w:t xml:space="preserve">Type the username you want. GitHub will tell you right away if it’s taken.</w:t>
+      </w:r>
+    </w:p>
+    <w:p>
+      <w:pPr>
+        <w:pStyle w:val="ListParagraph"/>
+        <w:numPr>
+          <w:ilvl w:val="0"/>
+          <w:numId w:val="4"/>
+        </w:numPr>
+        <w:spacing w:after="40"/>
+      </w:pPr>
+      <w:r>
+        <w:t xml:space="preserve">Complete the verification puzzle, then enter the code GitHub emails you.</w:t>
+      </w:r>
+    </w:p>
+    <w:p>
+      <w:pPr>
+        <w:spacing w:after="100"/>
+      </w:pPr>
+      <w:r>
+        <w:rPr>
+          <w:b/>
+          <w:bCs/>
+        </w:rPr>
+        <w:t xml:space="preserve">Action B:</w:t>
+      </w:r>
+      <w:r>
+        <w:t xml:space="preserve"> Please get </w:t>
+      </w:r>
+      <w:r>
+        <w:rPr>
+          <w:b/>
+          <w:bCs/>
+        </w:rPr>
+        <w:t xml:space="preserve">Git for Windows</w:t>
+      </w:r>
+      <w:r>
+        <w:t xml:space="preserve"> from the WB Software Center, and </w:t>
+      </w:r>
+      <w:r>
+        <w:rPr>
+          <w:b/>
+          <w:bCs/>
+        </w:rPr>
+        <w:t xml:space="preserve">GitHub Copilot</w:t>
+      </w:r>
+      <w:r>
+        <w:t xml:space="preserve"> from the Microsoft Store. </w:t>
+      </w:r>
+      <w:r>
+        <w:rPr>
+          <w:b/>
+          <w:bCs/>
+        </w:rPr>
+        <w:t xml:space="preserve">GitHub Desktop</w:t>
+      </w:r>
+      <w:r>
+        <w:t xml:space="preserve"> (also in the Software Center, or desktop.github.com) is recommended too: it shows your changes and helps resolve merge issues (Part 4).</w:t>
+      </w:r>
+    </w:p>
+    <w:p>
+      <w:pPr>
+        <w:spacing w:after="60"/>
+      </w:pPr>
+      <w:r>
+        <w:drawing>
+          <wp:inline distT="0" distB="0" distL="0" distR="0">
+            <wp:extent cx="3114675" cy="1000125"/>
+            <wp:effectExtent t="0" r="0" b="0" l="0"/>
+            <wp:docPr id="1" name="" descr="" title=""/>
+            <wp:cNvGraphicFramePr>
+              <a:graphicFrameLocks xmlns:a="http://schemas.openxmlformats.org/drawingml/2006/main" noChangeAspect="1"/>
+            </wp:cNvGraphicFramePr>
+            <a:graphic xmlns:a="http://schemas.openxmlformats.org/drawingml/2006/main">
+              <a:graphicData uri="http://schemas.openxmlformats.org/drawingml/2006/picture">
+                <pic:pic xmlns:pic="http://schemas.openxmlformats.org/drawingml/2006/picture">
+                  <pic:nvPicPr>
+                    <pic:cNvPr id="0" name="" descr=""/>
+                    <pic:cNvPicPr>
+                      <a:picLocks noChangeAspect="1" noChangeArrowheads="1"/>
+                    </pic:cNvPicPr>
+                  </pic:nvPicPr>
+                  <pic:blipFill>
+                    <a:blip r:embed="rId7" cstate="none"/>
+                    <a:srcRect/>
+                    <a:stretch>
+                      <a:fillRect/>
+                    </a:stretch>
+                  </pic:blipFill>
+                  <pic:spPr bwMode="auto">
+                    <a:xfrm>
+                      <a:off x="0" y="0"/>
+                      <a:ext cx="3114675" cy="1000125"/>
+                    </a:xfrm>
+                    <a:prstGeom prst="rect">
+                      <a:avLst/>
+                    </a:prstGeom>
+                  </pic:spPr>
+                </pic:pic>
+              </a:graphicData>
+            </a:graphic>
+          </wp:inline>
+        </w:drawing>
+      </w:r>
+      <w:r>
+        <w:t xml:space="preserve">  </w:t>
+      </w:r>
+      <w:r>
+        <w:drawing>
+          <wp:inline distT="0" distB="0" distL="0" distR="0">
+            <wp:extent cx="2219325" cy="1200150"/>
+            <wp:effectExtent t="0" r="0" b="0" l="0"/>
+            <wp:docPr id="1" name="" descr="" title=""/>
+            <wp:cNvGraphicFramePr>
+              <a:graphicFrameLocks xmlns:a="http://schemas.openxmlformats.org/drawingml/2006/main" noChangeAspect="1"/>
+            </wp:cNvGraphicFramePr>
+            <a:graphic xmlns:a="http://schemas.openxmlformats.org/drawingml/2006/main">
+              <a:graphicData uri="http://schemas.openxmlformats.org/drawingml/2006/picture">
+                <pic:pic xmlns:pic="http://schemas.openxmlformats.org/drawingml/2006/picture">
+                  <pic:nvPicPr>
+                    <pic:cNvPr id="0" name="" descr=""/>
+                    <pic:cNvPicPr>
+                      <a:picLocks noChangeAspect="1" noChangeArrowheads="1"/>
+                    </pic:cNvPicPr>
+                  </pic:nvPicPr>
+                  <pic:blipFill>
+                    <a:blip r:embed="rId8" cstate="none"/>
+                    <a:srcRect/>
+                    <a:stretch>
+                      <a:fillRect/>
+                    </a:stretch>
+                  </pic:blipFill>
+                  <pic:spPr bwMode="auto">
+                    <a:xfrm>
+                      <a:off x="0" y="0"/>
+                      <a:ext cx="2219325" cy="1200150"/>
+                    </a:xfrm>
+                    <a:prstGeom prst="rect">
+                      <a:avLst/>
+                    </a:prstGeom>
+                  </pic:spPr>
+                </pic:pic>
+              </a:graphicData>
+            </a:graphic>
+          </wp:inline>
+        </w:drawing>
+      </w:r>
+    </w:p>
+    <w:p>
+      <w:pPr>
+        <w:spacing w:after="100"/>
+      </w:pPr>
+      <w:r>
+        <w:rPr>
+          <w:b/>
+          <w:bCs/>
+        </w:rPr>
+        <w:t xml:space="preserve">Action C:</w:t>
+      </w:r>
+      <w:r>
+        <w:t xml:space="preserve"> Go to </w:t>
+      </w:r>
+      <w:r>
+        <w:rPr>
+          <w:rFonts w:ascii="Consolas" w:cs="Consolas" w:eastAsia="Consolas" w:hAnsi="Consolas"/>
+          <w:color w:val="7F3F00"/>
+          <w:sz w:val="19"/>
+          <w:szCs w:val="19"/>
+        </w:rPr>
+        <w:t xml:space="preserve">C:\Users\WB&lt;PID&gt;</w:t>
+      </w:r>
+      <w:r>
+        <w:t xml:space="preserve"> (go to </w:t>
+      </w:r>
+      <w:r>
+        <w:rPr>
+          <w:rFonts w:ascii="Consolas" w:cs="Consolas" w:eastAsia="Consolas" w:hAnsi="Consolas"/>
+          <w:color w:val="7F3F00"/>
+          <w:sz w:val="19"/>
+          <w:szCs w:val="19"/>
+        </w:rPr>
+        <w:t xml:space="preserve">C:\Users</w:t>
+      </w:r>
+      <w:r>
+        <w:t xml:space="preserve"> and find your folder: WB followed by your PID). Download </w:t>
+      </w:r>
+      <w:hyperlink w:history="1" r:id="rIdxjhqssjcs7cpwydyodsjf">
+        <w:r>
+          <w:rPr>
+            <w:rStyle w:val="Hyperlink"/>
+          </w:rPr>
+          <w:t xml:space="preserve">Repos.zip</w:t>
+        </w:r>
+      </w:hyperlink>
+      <w:r>
+        <w:t xml:space="preserve"> (or get it from github.com/cpmodelai/repo-tools) and extract it there, then go to </w:t>
+      </w:r>
+      <w:r>
+        <w:rPr>
+          <w:rFonts w:ascii="Consolas" w:cs="Consolas" w:eastAsia="Consolas" w:hAnsi="Consolas"/>
+          <w:color w:val="7F3F00"/>
+          <w:sz w:val="19"/>
+          <w:szCs w:val="19"/>
+        </w:rPr>
+        <w:t xml:space="preserve">C:\Users\WB&lt;PID&gt;\Repos</w:t>
+      </w:r>
+      <w:r>
+        <w:t xml:space="preserve">. Click </w:t>
+      </w:r>
+      <w:r>
+        <w:rPr>
+          <w:rFonts w:ascii="Consolas" w:cs="Consolas" w:eastAsia="Consolas" w:hAnsi="Consolas"/>
+          <w:color w:val="7F3F00"/>
+          <w:sz w:val="19"/>
+          <w:szCs w:val="19"/>
+        </w:rPr>
+        <w:t xml:space="preserve">CloneRepos.bat</w:t>
+      </w:r>
+      <w:r>
+        <w:t xml:space="preserve"> to clone the selected repos. Then click </w:t>
       </w:r>
       <w:r>
         <w:rPr>
@@ -4284,87 +4851,22 @@
         <w:t xml:space="preserve">SyncAllRepos.bat</w:t>
       </w:r>
       <w:r>
-        <w:t xml:space="preserve"> one level up (it reads </w:t>
-      </w:r>
-      <w:r>
-        <w:rPr>
-          <w:rFonts w:ascii="Consolas" w:cs="Consolas" w:eastAsia="Consolas" w:hAnsi="Consolas"/>
-          <w:color w:val="7F3F00"/>
-          <w:sz w:val="19"/>
-          <w:szCs w:val="19"/>
-        </w:rPr>
-        <w:t xml:space="preserve">RepoDirectory.csv</w:t>
-      </w:r>
-      <w:r>
-        <w:t xml:space="preserve">).</w:t>
-      </w:r>
-    </w:p>
-    <w:p>
-      <w:pPr>
-        <w:spacing w:after="100" w:before="100"/>
-      </w:pPr>
-      <w:r>
-        <w:t xml:space="preserve">Git words: </w:t>
-      </w:r>
-      <w:r>
-        <w:rPr>
-          <w:b/>
-          <w:bCs/>
-        </w:rPr>
-        <w:t xml:space="preserve">pull</w:t>
-      </w:r>
-      <w:r>
-        <w:t xml:space="preserve"> = get others’ changes; </w:t>
-      </w:r>
-      <w:r>
-        <w:rPr>
-          <w:b/>
-          <w:bCs/>
-        </w:rPr>
-        <w:t xml:space="preserve">commit</w:t>
-      </w:r>
-      <w:r>
-        <w:t xml:space="preserve"> = save a snapshot with a message; </w:t>
-      </w:r>
-      <w:r>
-        <w:rPr>
-          <w:b/>
-          <w:bCs/>
-        </w:rPr>
-        <w:t xml:space="preserve">push</w:t>
-      </w:r>
-      <w:r>
-        <w:t xml:space="preserve"> = send your commits to GitHub; </w:t>
-      </w:r>
-      <w:r>
-        <w:rPr>
-          <w:b/>
-          <w:bCs/>
-        </w:rPr>
-        <w:t xml:space="preserve">branch</w:t>
-      </w:r>
-      <w:r>
-        <w:t xml:space="preserve"> = a parallel line of work (AI sessions work on their own branches, merged into </w:t>
-      </w:r>
-      <w:r>
-        <w:rPr>
-          <w:rFonts w:ascii="Consolas" w:cs="Consolas" w:eastAsia="Consolas" w:hAnsi="Consolas"/>
-          <w:color w:val="7F3F00"/>
-          <w:sz w:val="19"/>
-          <w:szCs w:val="19"/>
-        </w:rPr>
-        <w:t xml:space="preserve">main</w:t>
-      </w:r>
-      <w:r>
-        <w:t xml:space="preserve"> when approved). Before you sync, check that no real-data file is among your changes.</w:t>
-      </w:r>
-    </w:p>
-    <w:p>
-      <w:pPr>
-        <w:pStyle w:val="Heading1"/>
-      </w:pPr>
-      <w:r>
-        <w:t xml:space="preserve">9. Further information</w:t>
+        <w:t xml:space="preserve"> for any changes later.</w:t>
+      </w:r>
+    </w:p>
+    <w:p>
+      <w:pPr>
+        <w:spacing w:after="100"/>
+      </w:pPr>
+      <w:r>
+        <w:rPr>
+          <w:b/>
+          <w:bCs/>
+        </w:rPr>
+        <w:t xml:space="preserve">Action D:</w:t>
+      </w:r>
+      <w:r>
+        <w:t xml:space="preserve"> Add your GitHub ID (and get an Enterprise account).</w:t>
       </w:r>
     </w:p>
     <w:p>
@@ -4377,31 +4879,17 @@
         <w:spacing w:after="40"/>
       </w:pPr>
       <w:r>
-        <w:t xml:space="preserve">Folder map: </w:t>
-      </w:r>
-      <w:r>
-        <w:rPr>
-          <w:rFonts w:ascii="Consolas" w:cs="Consolas" w:eastAsia="Consolas" w:hAnsi="Consolas"/>
-          <w:color w:val="7F3F00"/>
-          <w:sz w:val="19"/>
-          <w:szCs w:val="19"/>
-        </w:rPr>
-        <w:t xml:space="preserve">README.md</w:t>
-      </w:r>
-      <w:r>
-        <w:t xml:space="preserve"> (root) and </w:t>
-      </w:r>
-      <w:r>
-        <w:rPr>
-          <w:rFonts w:ascii="Consolas" w:cs="Consolas" w:eastAsia="Consolas" w:hAnsi="Consolas"/>
-          <w:color w:val="7F3F00"/>
-          <w:sz w:val="19"/>
-          <w:szCs w:val="19"/>
-        </w:rPr>
-        <w:t xml:space="preserve">excel_ai/README.md</w:t>
-      </w:r>
-      <w:r>
-        <w:t xml:space="preserve">; each module folder has its own README.</w:t>
+        <w:t xml:space="preserve">Once you have your ID, ask Kacper (klukaszewicz@worldbank.org) to add you to </w:t>
+      </w:r>
+      <w:r>
+        <w:rPr>
+          <w:b/>
+          <w:bCs/>
+        </w:rPr>
+        <w:t xml:space="preserve">cpmodelai</w:t>
+      </w:r>
+      <w:r>
+        <w:t xml:space="preserve">, where our repos are. Copy in Paulina and Stephen for information.</w:t>
       </w:r>
     </w:p>
     <w:p>
@@ -4414,31 +4902,7 @@
         <w:spacing w:after="40"/>
       </w:pPr>
       <w:r>
-        <w:t xml:space="preserve">How-to guides: the quick start in the mitigation Documentation; linking data in </w:t>
-      </w:r>
-      <w:r>
-        <w:rPr>
-          <w:rFonts w:ascii="Consolas" w:cs="Consolas" w:eastAsia="Consolas" w:hAnsi="Consolas"/>
-          <w:color w:val="7F3F00"/>
-          <w:sz w:val="19"/>
-          <w:szCs w:val="19"/>
-        </w:rPr>
-        <w:t xml:space="preserve">data/README.md</w:t>
-      </w:r>
-      <w:r>
-        <w:t xml:space="preserve">; regenerating the distribution data in </w:t>
-      </w:r>
-      <w:r>
-        <w:rPr>
-          <w:rFonts w:ascii="Consolas" w:cs="Consolas" w:eastAsia="Consolas" w:hAnsi="Consolas"/>
-          <w:color w:val="7F3F00"/>
-          <w:sz w:val="19"/>
-          <w:szCs w:val="19"/>
-        </w:rPr>
-        <w:t xml:space="preserve">other/distribution/REGENERATING_THE_DISTRIBUTIONAL_WORKBOOK.md</w:t>
-      </w:r>
-      <w:r>
-        <w:t xml:space="preserve">.</w:t>
+        <w:t xml:space="preserve">Ask for your user ID to be added to the WB GitHub organisation: http://githubmemberrequest/</w:t>
       </w:r>
     </w:p>
     <w:p>
@@ -4451,31 +4915,898 @@
         <w:spacing w:after="40"/>
       </w:pPr>
       <w:r>
-        <w:t xml:space="preserve">Supporting material in </w:t>
-      </w:r>
-      <w:r>
-        <w:rPr>
-          <w:rFonts w:ascii="Consolas" w:cs="Consolas" w:eastAsia="Consolas" w:hAnsi="Consolas"/>
-          <w:color w:val="7F3F00"/>
-          <w:sz w:val="19"/>
-          <w:szCs w:val="19"/>
-        </w:rPr>
-        <w:t xml:space="preserve">other/</w:t>
-      </w:r>
-      <w:r>
-        <w:t xml:space="preserve">: research papers, decks (</w:t>
-      </w:r>
-      <w:r>
-        <w:rPr>
-          <w:rFonts w:ascii="Consolas" w:cs="Consolas" w:eastAsia="Consolas" w:hAnsi="Consolas"/>
-          <w:color w:val="7F3F00"/>
-          <w:sz w:val="19"/>
-          <w:szCs w:val="19"/>
-        </w:rPr>
-        <w:t xml:space="preserve">other/presentations/</w:t>
-      </w:r>
-      <w:r>
-        <w:t xml:space="preserve">), the distribution pseudocode and earlier prototypes.</w:t>
+        <w:t xml:space="preserve">Get a GitHub Enterprise account by emailing GitHub_Enterprise_Admin@worldbankgroup.org with your GitHub ID.</w:t>
+      </w:r>
+    </w:p>
+    <w:p>
+      <w:pPr>
+        <w:pStyle w:val="Heading3"/>
+      </w:pPr>
+      <w:r>
+        <w:t xml:space="preserve">Optional: linking Claude to the repos</w:t>
+      </w:r>
+    </w:p>
+    <w:p>
+      <w:pPr>
+        <w:spacing w:after="100"/>
+      </w:pPr>
+      <w:r>
+        <w:rPr>
+          <w:b/>
+          <w:bCs/>
+        </w:rPr>
+        <w:t xml:space="preserve">1. Create a Claude account.</w:t>
+      </w:r>
+      <w:r>
+        <w:t xml:space="preserve"> Go to claude.ai (or get the Claude app) and click </w:t>
+      </w:r>
+      <w:r>
+        <w:rPr>
+          <w:b/>
+          <w:bCs/>
+        </w:rPr>
+        <w:t xml:space="preserve">Sign up</w:t>
+      </w:r>
+      <w:r>
+        <w:t xml:space="preserve">, with an email address or a Google account. If you used email, click the sign-in link Claude sends you, then enter your name. You are on the free plan; you can upgrade later from Settings.</w:t>
+      </w:r>
+    </w:p>
+    <w:p>
+      <w:pPr>
+        <w:spacing w:after="100"/>
+      </w:pPr>
+      <w:r>
+        <w:rPr>
+          <w:b/>
+          <w:bCs/>
+        </w:rPr>
+        <w:t xml:space="preserve">2. Connect GitHub.</w:t>
+      </w:r>
+      <w:r>
+        <w:t xml:space="preserve"> A “repo” (repository) is a folder of files stored on GitHub. In Claude, go to Settings → Connectors, find GitHub and click Connect; GitHub asks you to approve access (support.claude.com, “Use the GitHub integration”).</w:t>
+      </w:r>
+    </w:p>
+    <w:p>
+      <w:pPr>
+        <w:spacing w:after="100"/>
+      </w:pPr>
+      <w:r>
+        <w:rPr>
+          <w:b/>
+          <w:bCs/>
+        </w:rPr>
+        <w:t xml:space="preserve">3. Add a repo.</w:t>
+      </w:r>
+      <w:r>
+        <w:t xml:space="preserve"> Open a chat (or a Project), click </w:t>
+      </w:r>
+      <w:r>
+        <w:rPr>
+          <w:b/>
+          <w:bCs/>
+        </w:rPr>
+        <w:t xml:space="preserve">+</w:t>
+      </w:r>
+      <w:r>
+        <w:t xml:space="preserve"> next to the message box, choose “Add from GitHub”, then search or paste the repo URL. Claude can now read its files; you can add several repos.</w:t>
+      </w:r>
+    </w:p>
+    <w:p>
+      <w:pPr>
+        <w:pStyle w:val="Heading2"/>
+      </w:pPr>
+      <w:r>
+        <w:t xml:space="preserve">Part 2. Update to the new repos (existing users)</w:t>
+      </w:r>
+    </w:p>
+    <w:p>
+      <w:pPr>
+        <w:spacing w:after="100"/>
+      </w:pPr>
+      <w:r>
+        <w:t xml:space="preserve">The repos have moved from github.com/cpmodel to github.com/cpmodelai, and some default folder names have changed. If you set up before this, do these steps once. The new </w:t>
+      </w:r>
+      <w:r>
+        <w:rPr>
+          <w:rFonts w:ascii="Consolas" w:cs="Consolas" w:eastAsia="Consolas" w:hAnsi="Consolas"/>
+          <w:color w:val="7F3F00"/>
+          <w:sz w:val="19"/>
+          <w:szCs w:val="19"/>
+        </w:rPr>
+        <w:t xml:space="preserve">RepoDirectory.csv</w:t>
+      </w:r>
+      <w:r>
+        <w:t xml:space="preserve"> in Repos.zip lists the new addresses.</w:t>
+      </w:r>
+    </w:p>
+    <w:tbl>
+      <w:tblPr>
+        <w:tblW w:type="dxa" w:w="9638"/>
+        <w:tblBorders>
+          <w:top w:val="single" w:color="auto" w:sz="4"/>
+          <w:left w:val="single" w:color="auto" w:sz="4"/>
+          <w:bottom w:val="single" w:color="auto" w:sz="4"/>
+          <w:right w:val="single" w:color="auto" w:sz="4"/>
+          <w:insideH w:val="single" w:color="auto" w:sz="4"/>
+          <w:insideV w:val="single" w:color="auto" w:sz="4"/>
+        </w:tblBorders>
+      </w:tblPr>
+      <w:tblGrid>
+        <w:gridCol w:w="1900"/>
+        <w:gridCol w:w="2500"/>
+        <w:gridCol w:w="3100"/>
+        <w:gridCol w:w="2138"/>
+      </w:tblGrid>
+      <w:tr>
+        <w:trPr>
+          <w:tblHeader/>
+        </w:trPr>
+        <w:tc>
+          <w:tcPr>
+            <w:tcW w:type="dxa" w:w="1900"/>
+            <w:tcBorders>
+              <w:top w:val="single" w:color="BFBFBF" w:sz="4"/>
+              <w:left w:val="single" w:color="BFBFBF" w:sz="4"/>
+              <w:bottom w:val="single" w:color="BFBFBF" w:sz="4"/>
+              <w:right w:val="single" w:color="BFBFBF" w:sz="4"/>
+            </w:tcBorders>
+            <w:shd w:fill="DCE6F1" w:color="auto" w:val="clear"/>
+            <w:tcMar>
+              <w:top w:type="dxa" w:w="50"/>
+              <w:left w:type="dxa" w:w="90"/>
+              <w:bottom w:type="dxa" w:w="50"/>
+              <w:right w:type="dxa" w:w="90"/>
+            </w:tcMar>
+          </w:tcPr>
+          <w:p>
+            <w:r>
+              <w:rPr>
+                <w:b/>
+                <w:bCs/>
+              </w:rPr>
+              <w:t xml:space="preserve">Repo</w:t>
+            </w:r>
+          </w:p>
+        </w:tc>
+        <w:tc>
+          <w:tcPr>
+            <w:tcW w:type="dxa" w:w="2500"/>
+            <w:tcBorders>
+              <w:top w:val="single" w:color="BFBFBF" w:sz="4"/>
+              <w:left w:val="single" w:color="BFBFBF" w:sz="4"/>
+              <w:bottom w:val="single" w:color="BFBFBF" w:sz="4"/>
+              <w:right w:val="single" w:color="BFBFBF" w:sz="4"/>
+            </w:tcBorders>
+            <w:shd w:fill="DCE6F1" w:color="auto" w:val="clear"/>
+            <w:tcMar>
+              <w:top w:type="dxa" w:w="50"/>
+              <w:left w:type="dxa" w:w="90"/>
+              <w:bottom w:type="dxa" w:w="50"/>
+              <w:right w:type="dxa" w:w="90"/>
+            </w:tcMar>
+          </w:tcPr>
+          <w:p>
+            <w:r>
+              <w:rPr>
+                <w:b/>
+                <w:bCs/>
+              </w:rPr>
+              <w:t xml:space="preserve">Old address</w:t>
+            </w:r>
+          </w:p>
+        </w:tc>
+        <w:tc>
+          <w:tcPr>
+            <w:tcW w:type="dxa" w:w="3100"/>
+            <w:tcBorders>
+              <w:top w:val="single" w:color="BFBFBF" w:sz="4"/>
+              <w:left w:val="single" w:color="BFBFBF" w:sz="4"/>
+              <w:bottom w:val="single" w:color="BFBFBF" w:sz="4"/>
+              <w:right w:val="single" w:color="BFBFBF" w:sz="4"/>
+            </w:tcBorders>
+            <w:shd w:fill="DCE6F1" w:color="auto" w:val="clear"/>
+            <w:tcMar>
+              <w:top w:type="dxa" w:w="50"/>
+              <w:left w:type="dxa" w:w="90"/>
+              <w:bottom w:type="dxa" w:w="50"/>
+              <w:right w:type="dxa" w:w="90"/>
+            </w:tcMar>
+          </w:tcPr>
+          <w:p>
+            <w:r>
+              <w:rPr>
+                <w:b/>
+                <w:bCs/>
+              </w:rPr>
+              <w:t xml:space="preserve">New address (RepoName)</w:t>
+            </w:r>
+          </w:p>
+        </w:tc>
+        <w:tc>
+          <w:tcPr>
+            <w:tcW w:type="dxa" w:w="2138"/>
+            <w:tcBorders>
+              <w:top w:val="single" w:color="BFBFBF" w:sz="4"/>
+              <w:left w:val="single" w:color="BFBFBF" w:sz="4"/>
+              <w:bottom w:val="single" w:color="BFBFBF" w:sz="4"/>
+              <w:right w:val="single" w:color="BFBFBF" w:sz="4"/>
+            </w:tcBorders>
+            <w:shd w:fill="DCE6F1" w:color="auto" w:val="clear"/>
+            <w:tcMar>
+              <w:top w:type="dxa" w:w="50"/>
+              <w:left w:type="dxa" w:w="90"/>
+              <w:bottom w:type="dxa" w:w="50"/>
+              <w:right w:type="dxa" w:w="90"/>
+            </w:tcMar>
+          </w:tcPr>
+          <w:p>
+            <w:r>
+              <w:rPr>
+                <w:b/>
+                <w:bCs/>
+              </w:rPr>
+              <w:t xml:space="preserve">Default folder (FolderName)</w:t>
+            </w:r>
+          </w:p>
+        </w:tc>
+      </w:tr>
+      <w:tr>
+        <w:trPr>
+          <w:tblHeader w:val="false"/>
+        </w:trPr>
+        <w:tc>
+          <w:tcPr>
+            <w:tcW w:type="dxa" w:w="1900"/>
+            <w:tcBorders>
+              <w:top w:val="single" w:color="BFBFBF" w:sz="4"/>
+              <w:left w:val="single" w:color="BFBFBF" w:sz="4"/>
+              <w:bottom w:val="single" w:color="BFBFBF" w:sz="4"/>
+              <w:right w:val="single" w:color="BFBFBF" w:sz="4"/>
+            </w:tcBorders>
+            <w:tcMar>
+              <w:top w:type="dxa" w:w="50"/>
+              <w:left w:type="dxa" w:w="90"/>
+              <w:bottom w:type="dxa" w:w="50"/>
+              <w:right w:type="dxa" w:w="90"/>
+            </w:tcMar>
+          </w:tcPr>
+          <w:p>
+            <w:r>
+              <w:t xml:space="preserve">Climate-fiscal AI tools</w:t>
+            </w:r>
+          </w:p>
+        </w:tc>
+        <w:tc>
+          <w:tcPr>
+            <w:tcW w:type="dxa" w:w="2500"/>
+            <w:tcBorders>
+              <w:top w:val="single" w:color="BFBFBF" w:sz="4"/>
+              <w:left w:val="single" w:color="BFBFBF" w:sz="4"/>
+              <w:bottom w:val="single" w:color="BFBFBF" w:sz="4"/>
+              <w:right w:val="single" w:color="BFBFBF" w:sz="4"/>
+            </w:tcBorders>
+            <w:tcMar>
+              <w:top w:type="dxa" w:w="50"/>
+              <w:left w:type="dxa" w:w="90"/>
+              <w:bottom w:type="dxa" w:w="50"/>
+              <w:right w:type="dxa" w:w="90"/>
+            </w:tcMar>
+          </w:tcPr>
+          <w:p>
+            <w:r>
+              <w:t xml:space="preserve">github.com/cpmodel/new-ai-tools</w:t>
+            </w:r>
+          </w:p>
+        </w:tc>
+        <w:tc>
+          <w:tcPr>
+            <w:tcW w:type="dxa" w:w="3100"/>
+            <w:tcBorders>
+              <w:top w:val="single" w:color="BFBFBF" w:sz="4"/>
+              <w:left w:val="single" w:color="BFBFBF" w:sz="4"/>
+              <w:bottom w:val="single" w:color="BFBFBF" w:sz="4"/>
+              <w:right w:val="single" w:color="BFBFBF" w:sz="4"/>
+            </w:tcBorders>
+            <w:tcMar>
+              <w:top w:type="dxa" w:w="50"/>
+              <w:left w:type="dxa" w:w="90"/>
+              <w:bottom w:type="dxa" w:w="50"/>
+              <w:right w:type="dxa" w:w="90"/>
+            </w:tcMar>
+          </w:tcPr>
+          <w:p>
+            <w:r>
+              <w:t xml:space="preserve">github.com/cpmodelai/climate-fiscal-ai-tools</w:t>
+            </w:r>
+          </w:p>
+        </w:tc>
+        <w:tc>
+          <w:tcPr>
+            <w:tcW w:type="dxa" w:w="2138"/>
+            <w:tcBorders>
+              <w:top w:val="single" w:color="BFBFBF" w:sz="4"/>
+              <w:left w:val="single" w:color="BFBFBF" w:sz="4"/>
+              <w:bottom w:val="single" w:color="BFBFBF" w:sz="4"/>
+              <w:right w:val="single" w:color="BFBFBF" w:sz="4"/>
+            </w:tcBorders>
+            <w:tcMar>
+              <w:top w:type="dxa" w:w="50"/>
+              <w:left w:type="dxa" w:w="90"/>
+              <w:bottom w:type="dxa" w:w="50"/>
+              <w:right w:type="dxa" w:w="90"/>
+            </w:tcMar>
+          </w:tcPr>
+          <w:p>
+            <w:r>
+              <w:t xml:space="preserve">climate-fiscal-ai-tools (was new-ai-tools)</w:t>
+            </w:r>
+          </w:p>
+        </w:tc>
+      </w:tr>
+      <w:tr>
+        <w:trPr>
+          <w:tblHeader w:val="false"/>
+        </w:trPr>
+        <w:tc>
+          <w:tcPr>
+            <w:tcW w:type="dxa" w:w="1900"/>
+            <w:tcBorders>
+              <w:top w:val="single" w:color="BFBFBF" w:sz="4"/>
+              <w:left w:val="single" w:color="BFBFBF" w:sz="4"/>
+              <w:bottom w:val="single" w:color="BFBFBF" w:sz="4"/>
+              <w:right w:val="single" w:color="BFBFBF" w:sz="4"/>
+            </w:tcBorders>
+            <w:tcMar>
+              <w:top w:type="dxa" w:w="50"/>
+              <w:left w:type="dxa" w:w="90"/>
+              <w:bottom w:type="dxa" w:w="50"/>
+              <w:right w:type="dxa" w:w="90"/>
+            </w:tcMar>
+          </w:tcPr>
+          <w:p>
+            <w:r>
+              <w:t xml:space="preserve">CPAT-AI</w:t>
+            </w:r>
+          </w:p>
+        </w:tc>
+        <w:tc>
+          <w:tcPr>
+            <w:tcW w:type="dxa" w:w="2500"/>
+            <w:tcBorders>
+              <w:top w:val="single" w:color="BFBFBF" w:sz="4"/>
+              <w:left w:val="single" w:color="BFBFBF" w:sz="4"/>
+              <w:bottom w:val="single" w:color="BFBFBF" w:sz="4"/>
+              <w:right w:val="single" w:color="BFBFBF" w:sz="4"/>
+            </w:tcBorders>
+            <w:tcMar>
+              <w:top w:type="dxa" w:w="50"/>
+              <w:left w:type="dxa" w:w="90"/>
+              <w:bottom w:type="dxa" w:w="50"/>
+              <w:right w:type="dxa" w:w="90"/>
+            </w:tcMar>
+          </w:tcPr>
+          <w:p>
+            <w:r>
+              <w:t xml:space="preserve">github.com/cpmodel/CPAT-AI</w:t>
+            </w:r>
+          </w:p>
+        </w:tc>
+        <w:tc>
+          <w:tcPr>
+            <w:tcW w:type="dxa" w:w="3100"/>
+            <w:tcBorders>
+              <w:top w:val="single" w:color="BFBFBF" w:sz="4"/>
+              <w:left w:val="single" w:color="BFBFBF" w:sz="4"/>
+              <w:bottom w:val="single" w:color="BFBFBF" w:sz="4"/>
+              <w:right w:val="single" w:color="BFBFBF" w:sz="4"/>
+            </w:tcBorders>
+            <w:tcMar>
+              <w:top w:type="dxa" w:w="50"/>
+              <w:left w:type="dxa" w:w="90"/>
+              <w:bottom w:type="dxa" w:w="50"/>
+              <w:right w:type="dxa" w:w="90"/>
+            </w:tcMar>
+          </w:tcPr>
+          <w:p>
+            <w:r>
+              <w:t xml:space="preserve">github.com/cpmodelai/cpat_ai</w:t>
+            </w:r>
+          </w:p>
+        </w:tc>
+        <w:tc>
+          <w:tcPr>
+            <w:tcW w:type="dxa" w:w="2138"/>
+            <w:tcBorders>
+              <w:top w:val="single" w:color="BFBFBF" w:sz="4"/>
+              <w:left w:val="single" w:color="BFBFBF" w:sz="4"/>
+              <w:bottom w:val="single" w:color="BFBFBF" w:sz="4"/>
+              <w:right w:val="single" w:color="BFBFBF" w:sz="4"/>
+            </w:tcBorders>
+            <w:tcMar>
+              <w:top w:type="dxa" w:w="50"/>
+              <w:left w:type="dxa" w:w="90"/>
+              <w:bottom w:type="dxa" w:w="50"/>
+              <w:right w:type="dxa" w:w="90"/>
+            </w:tcMar>
+          </w:tcPr>
+          <w:p>
+            <w:r>
+              <w:t xml:space="preserve">CPAT-AI</w:t>
+            </w:r>
+          </w:p>
+        </w:tc>
+      </w:tr>
+      <w:tr>
+        <w:trPr>
+          <w:tblHeader w:val="false"/>
+        </w:trPr>
+        <w:tc>
+          <w:tcPr>
+            <w:tcW w:type="dxa" w:w="1900"/>
+            <w:tcBorders>
+              <w:top w:val="single" w:color="BFBFBF" w:sz="4"/>
+              <w:left w:val="single" w:color="BFBFBF" w:sz="4"/>
+              <w:bottom w:val="single" w:color="BFBFBF" w:sz="4"/>
+              <w:right w:val="single" w:color="BFBFBF" w:sz="4"/>
+            </w:tcBorders>
+            <w:tcMar>
+              <w:top w:type="dxa" w:w="50"/>
+              <w:left w:type="dxa" w:w="90"/>
+              <w:bottom w:type="dxa" w:w="50"/>
+              <w:right w:type="dxa" w:w="90"/>
+            </w:tcMar>
+          </w:tcPr>
+          <w:p>
+            <w:r>
+              <w:t xml:space="preserve">Repo tools</w:t>
+            </w:r>
+          </w:p>
+        </w:tc>
+        <w:tc>
+          <w:tcPr>
+            <w:tcW w:type="dxa" w:w="2500"/>
+            <w:tcBorders>
+              <w:top w:val="single" w:color="BFBFBF" w:sz="4"/>
+              <w:left w:val="single" w:color="BFBFBF" w:sz="4"/>
+              <w:bottom w:val="single" w:color="BFBFBF" w:sz="4"/>
+              <w:right w:val="single" w:color="BFBFBF" w:sz="4"/>
+            </w:tcBorders>
+            <w:tcMar>
+              <w:top w:type="dxa" w:w="50"/>
+              <w:left w:type="dxa" w:w="90"/>
+              <w:bottom w:type="dxa" w:w="50"/>
+              <w:right w:type="dxa" w:w="90"/>
+            </w:tcMar>
+          </w:tcPr>
+          <w:p>
+            <w:r>
+              <w:t xml:space="preserve">(new)</w:t>
+            </w:r>
+          </w:p>
+        </w:tc>
+        <w:tc>
+          <w:tcPr>
+            <w:tcW w:type="dxa" w:w="3100"/>
+            <w:tcBorders>
+              <w:top w:val="single" w:color="BFBFBF" w:sz="4"/>
+              <w:left w:val="single" w:color="BFBFBF" w:sz="4"/>
+              <w:bottom w:val="single" w:color="BFBFBF" w:sz="4"/>
+              <w:right w:val="single" w:color="BFBFBF" w:sz="4"/>
+            </w:tcBorders>
+            <w:tcMar>
+              <w:top w:type="dxa" w:w="50"/>
+              <w:left w:type="dxa" w:w="90"/>
+              <w:bottom w:type="dxa" w:w="50"/>
+              <w:right w:type="dxa" w:w="90"/>
+            </w:tcMar>
+          </w:tcPr>
+          <w:p>
+            <w:r>
+              <w:t xml:space="preserve">github.com/cpmodelai/repo-tools</w:t>
+            </w:r>
+          </w:p>
+        </w:tc>
+        <w:tc>
+          <w:tcPr>
+            <w:tcW w:type="dxa" w:w="2138"/>
+            <w:tcBorders>
+              <w:top w:val="single" w:color="BFBFBF" w:sz="4"/>
+              <w:left w:val="single" w:color="BFBFBF" w:sz="4"/>
+              <w:bottom w:val="single" w:color="BFBFBF" w:sz="4"/>
+              <w:right w:val="single" w:color="BFBFBF" w:sz="4"/>
+            </w:tcBorders>
+            <w:tcMar>
+              <w:top w:type="dxa" w:w="50"/>
+              <w:left w:type="dxa" w:w="90"/>
+              <w:bottom w:type="dxa" w:w="50"/>
+              <w:right w:type="dxa" w:w="90"/>
+            </w:tcMar>
+          </w:tcPr>
+          <w:p>
+            <w:r>
+              <w:t xml:space="preserve">repo-tools</w:t>
+            </w:r>
+          </w:p>
+        </w:tc>
+      </w:tr>
+    </w:tbl>
+    <w:p>
+      <w:pPr>
+        <w:spacing w:after="100" w:before="120"/>
+      </w:pPr>
+      <w:r>
+        <w:rPr>
+          <w:b/>
+          <w:bCs/>
+        </w:rPr>
+        <w:t xml:space="preserve">1. Save your work first.</w:t>
+      </w:r>
+      <w:r>
+        <w:t xml:space="preserve"> Double-click </w:t>
+      </w:r>
+      <w:r>
+        <w:rPr>
+          <w:rFonts w:ascii="Consolas" w:cs="Consolas" w:eastAsia="Consolas" w:hAnsi="Consolas"/>
+          <w:color w:val="7F3F00"/>
+          <w:sz w:val="19"/>
+          <w:szCs w:val="19"/>
+        </w:rPr>
+        <w:t xml:space="preserve">SyncAllRepos.bat</w:t>
+      </w:r>
+      <w:r>
+        <w:t xml:space="preserve"> (or see Part 3, Step 3) so nothing is lost. If a push fails, copy the files you changed somewhere safe.</w:t>
+      </w:r>
+    </w:p>
+    <w:p>
+      <w:pPr>
+        <w:spacing w:after="100"/>
+      </w:pPr>
+      <w:r>
+        <w:rPr>
+          <w:b/>
+          <w:bCs/>
+        </w:rPr>
+        <w:t xml:space="preserve">2. Get the new files.</w:t>
+      </w:r>
+      <w:r>
+        <w:t xml:space="preserve"> Download Repos.zip (Action C) and extract it into </w:t>
+      </w:r>
+      <w:r>
+        <w:rPr>
+          <w:rFonts w:ascii="Consolas" w:cs="Consolas" w:eastAsia="Consolas" w:hAnsi="Consolas"/>
+          <w:color w:val="7F3F00"/>
+          <w:sz w:val="19"/>
+          <w:szCs w:val="19"/>
+        </w:rPr>
+        <w:t xml:space="preserve">C:\Users\WB&lt;PID&gt;\Repos</w:t>
+      </w:r>
+      <w:r>
+        <w:t xml:space="preserve">. Let it replace </w:t>
+      </w:r>
+      <w:r>
+        <w:rPr>
+          <w:rFonts w:ascii="Consolas" w:cs="Consolas" w:eastAsia="Consolas" w:hAnsi="Consolas"/>
+          <w:color w:val="7F3F00"/>
+          <w:sz w:val="19"/>
+          <w:szCs w:val="19"/>
+        </w:rPr>
+        <w:t xml:space="preserve">RepoDirectory.csv</w:t>
+      </w:r>
+      <w:r>
+        <w:t xml:space="preserve">, </w:t>
+      </w:r>
+      <w:r>
+        <w:rPr>
+          <w:rFonts w:ascii="Consolas" w:cs="Consolas" w:eastAsia="Consolas" w:hAnsi="Consolas"/>
+          <w:color w:val="7F3F00"/>
+          <w:sz w:val="19"/>
+          <w:szCs w:val="19"/>
+        </w:rPr>
+        <w:t xml:space="preserve">SyncAllRepos.bat</w:t>
+      </w:r>
+      <w:r>
+        <w:t xml:space="preserve"> and </w:t>
+      </w:r>
+      <w:r>
+        <w:rPr>
+          <w:rFonts w:ascii="Consolas" w:cs="Consolas" w:eastAsia="Consolas" w:hAnsi="Consolas"/>
+          <w:color w:val="7F3F00"/>
+          <w:sz w:val="19"/>
+          <w:szCs w:val="19"/>
+        </w:rPr>
+        <w:t xml:space="preserve">CloneRepos.bat</w:t>
+      </w:r>
+      <w:r>
+        <w:t xml:space="preserve">.</w:t>
+      </w:r>
+    </w:p>
+    <w:p>
+      <w:pPr>
+        <w:spacing w:after="100"/>
+      </w:pPr>
+      <w:r>
+        <w:rPr>
+          <w:b/>
+          <w:bCs/>
+        </w:rPr>
+        <w:t xml:space="preserve">3. Check the addresses.</w:t>
+      </w:r>
+      <w:r>
+        <w:t xml:space="preserve"> Open </w:t>
+      </w:r>
+      <w:r>
+        <w:rPr>
+          <w:rFonts w:ascii="Consolas" w:cs="Consolas" w:eastAsia="Consolas" w:hAnsi="Consolas"/>
+          <w:color w:val="7F3F00"/>
+          <w:sz w:val="19"/>
+          <w:szCs w:val="19"/>
+        </w:rPr>
+        <w:t xml:space="preserve">RepoDirectory.csv</w:t>
+      </w:r>
+      <w:r>
+        <w:t xml:space="preserve"> in Notepad. Every RepoName must start with https://github.com/cpmodelai/ (not cpmodel).</w:t>
+      </w:r>
+    </w:p>
+    <w:p>
+      <w:pPr>
+        <w:spacing w:after="100"/>
+      </w:pPr>
+      <w:r>
+        <w:rPr>
+          <w:b/>
+          <w:bCs/>
+        </w:rPr>
+        <w:t xml:space="preserve">4. Check the folder names.</w:t>
+      </w:r>
+      <w:r>
+        <w:t xml:space="preserve"> FolderName is the folder inside Repos for each repo, and it must match exactly. The defaults have changed (table above): use the default (and move the old folder aside, step 5), or change FolderName to the name you want.</w:t>
+      </w:r>
+    </w:p>
+    <w:p>
+      <w:pPr>
+        <w:spacing w:after="100"/>
+      </w:pPr>
+      <w:r>
+        <w:rPr>
+          <w:b/>
+          <w:bCs/>
+        </w:rPr>
+        <w:t xml:space="preserve">5. Move the old folders aside.</w:t>
+      </w:r>
+      <w:r>
+        <w:t xml:space="preserve"> Rename each old folder, for example </w:t>
+      </w:r>
+      <w:r>
+        <w:rPr>
+          <w:rFonts w:ascii="Consolas" w:cs="Consolas" w:eastAsia="Consolas" w:hAnsi="Consolas"/>
+          <w:color w:val="7F3F00"/>
+          <w:sz w:val="19"/>
+          <w:szCs w:val="19"/>
+        </w:rPr>
+        <w:t xml:space="preserve">new-ai-tools</w:t>
+      </w:r>
+      <w:r>
+        <w:t xml:space="preserve"> to </w:t>
+      </w:r>
+      <w:r>
+        <w:rPr>
+          <w:rFonts w:ascii="Consolas" w:cs="Consolas" w:eastAsia="Consolas" w:hAnsi="Consolas"/>
+          <w:color w:val="7F3F00"/>
+          <w:sz w:val="19"/>
+          <w:szCs w:val="19"/>
+        </w:rPr>
+        <w:t xml:space="preserve">new-ai-tools_old</w:t>
+      </w:r>
+      <w:r>
+        <w:t xml:space="preserve"> and </w:t>
+      </w:r>
+      <w:r>
+        <w:rPr>
+          <w:rFonts w:ascii="Consolas" w:cs="Consolas" w:eastAsia="Consolas" w:hAnsi="Consolas"/>
+          <w:color w:val="7F3F00"/>
+          <w:sz w:val="19"/>
+          <w:szCs w:val="19"/>
+        </w:rPr>
+        <w:t xml:space="preserve">CPAT-AI</w:t>
+      </w:r>
+      <w:r>
+        <w:t xml:space="preserve"> to </w:t>
+      </w:r>
+      <w:r>
+        <w:rPr>
+          <w:rFonts w:ascii="Consolas" w:cs="Consolas" w:eastAsia="Consolas" w:hAnsi="Consolas"/>
+          <w:color w:val="7F3F00"/>
+          <w:sz w:val="19"/>
+          <w:szCs w:val="19"/>
+        </w:rPr>
+        <w:t xml:space="preserve">CPAT-AI_old</w:t>
+      </w:r>
+      <w:r>
+        <w:t xml:space="preserve">. They still point to the old addresses.</w:t>
+      </w:r>
+    </w:p>
+    <w:p>
+      <w:pPr>
+        <w:spacing w:after="100"/>
+      </w:pPr>
+      <w:r>
+        <w:rPr>
+          <w:b/>
+          <w:bCs/>
+        </w:rPr>
+        <w:t xml:space="preserve">6. Download the new repos.</w:t>
+      </w:r>
+      <w:r>
+        <w:t xml:space="preserve"> Double-click </w:t>
+      </w:r>
+      <w:r>
+        <w:rPr>
+          <w:rFonts w:ascii="Consolas" w:cs="Consolas" w:eastAsia="Consolas" w:hAnsi="Consolas"/>
+          <w:color w:val="7F3F00"/>
+          <w:sz w:val="19"/>
+          <w:szCs w:val="19"/>
+        </w:rPr>
+        <w:t xml:space="preserve">CloneRepos.bat</w:t>
+      </w:r>
+      <w:r>
+        <w:t xml:space="preserve">. It downloads every repo in </w:t>
+      </w:r>
+      <w:r>
+        <w:rPr>
+          <w:rFonts w:ascii="Consolas" w:cs="Consolas" w:eastAsia="Consolas" w:hAnsi="Consolas"/>
+          <w:color w:val="7F3F00"/>
+          <w:sz w:val="19"/>
+          <w:szCs w:val="19"/>
+        </w:rPr>
+        <w:t xml:space="preserve">RepoDirectory.csv</w:t>
+      </w:r>
+      <w:r>
+        <w:t xml:space="preserve"> whose folder is missing, and warns about any folder that points to another address. Sign in to GitHub if asked; your ID must be in cpmodelai (Action D).</w:t>
+      </w:r>
+    </w:p>
+    <w:p>
+      <w:pPr>
+        <w:spacing w:after="100"/>
+      </w:pPr>
+      <w:r>
+        <w:rPr>
+          <w:b/>
+          <w:bCs/>
+        </w:rPr>
+        <w:t xml:space="preserve">7. Copy across and check.</w:t>
+      </w:r>
+      <w:r>
+        <w:t xml:space="preserve"> Copy any unsaved files from the </w:t>
+      </w:r>
+      <w:r>
+        <w:rPr>
+          <w:rFonts w:ascii="Consolas" w:cs="Consolas" w:eastAsia="Consolas" w:hAnsi="Consolas"/>
+          <w:color w:val="7F3F00"/>
+          <w:sz w:val="19"/>
+          <w:szCs w:val="19"/>
+        </w:rPr>
+        <w:t xml:space="preserve">_old</w:t>
+      </w:r>
+      <w:r>
+        <w:t xml:space="preserve"> folders into the new ones. Double-click </w:t>
+      </w:r>
+      <w:r>
+        <w:rPr>
+          <w:rFonts w:ascii="Consolas" w:cs="Consolas" w:eastAsia="Consolas" w:hAnsi="Consolas"/>
+          <w:color w:val="7F3F00"/>
+          <w:sz w:val="19"/>
+          <w:szCs w:val="19"/>
+        </w:rPr>
+        <w:t xml:space="preserve">SyncAllRepos.bat</w:t>
+      </w:r>
+      <w:r>
+        <w:t xml:space="preserve">: every repo shows Pulling, none shows [SKIP] Folder not found. Then delete the </w:t>
+      </w:r>
+      <w:r>
+        <w:rPr>
+          <w:rFonts w:ascii="Consolas" w:cs="Consolas" w:eastAsia="Consolas" w:hAnsi="Consolas"/>
+          <w:color w:val="7F3F00"/>
+          <w:sz w:val="19"/>
+          <w:szCs w:val="19"/>
+        </w:rPr>
+        <w:t xml:space="preserve">_old</w:t>
+      </w:r>
+      <w:r>
+        <w:t xml:space="preserve"> folders.</w:t>
+      </w:r>
+    </w:p>
+    <w:p>
+      <w:pPr>
+        <w:spacing w:after="100"/>
+      </w:pPr>
+      <w:r>
+        <w:rPr>
+          <w:b/>
+          <w:bCs/>
+        </w:rPr>
+        <w:t xml:space="preserve">8. Update the Copilot app.</w:t>
+      </w:r>
+      <w:r>
+        <w:t xml:space="preserve"> Add the new folders in the sidebar (Part 3, Step 1) and remove the old ones.</w:t>
+      </w:r>
+    </w:p>
+    <w:p>
+      <w:pPr>
+        <w:spacing w:after="100"/>
+      </w:pPr>
+      <w:r>
+        <w:rPr>
+          <w:b/>
+          <w:bCs/>
+        </w:rPr>
+        <w:t xml:space="preserve">Check:</w:t>
+      </w:r>
+      <w:r>
+        <w:t xml:space="preserve"> </w:t>
+      </w:r>
+      <w:r>
+        <w:rPr>
+          <w:rFonts w:ascii="Consolas" w:cs="Consolas" w:eastAsia="Consolas" w:hAnsi="Consolas"/>
+          <w:color w:val="7F3F00"/>
+          <w:sz w:val="19"/>
+          <w:szCs w:val="19"/>
+        </w:rPr>
+        <w:t xml:space="preserve">CloneRepos.bat</w:t>
+      </w:r>
+      <w:r>
+        <w:t xml:space="preserve"> shows [OK] for every repo. In each repo folder, </w:t>
+      </w:r>
+      <w:r>
+        <w:rPr>
+          <w:rFonts w:ascii="Consolas" w:cs="Consolas" w:eastAsia="Consolas" w:hAnsi="Consolas"/>
+          <w:color w:val="7F3F00"/>
+          <w:sz w:val="19"/>
+          <w:szCs w:val="19"/>
+        </w:rPr>
+        <w:t xml:space="preserve">git remote -v</w:t>
+      </w:r>
+      <w:r>
+        <w:t xml:space="preserve"> shows https://github.com/cpmodelai/...</w:t>
+      </w:r>
+    </w:p>
+    <w:p>
+      <w:pPr>
+        <w:spacing w:after="100"/>
+      </w:pPr>
+      <w:r>
+        <w:rPr>
+          <w:i/>
+          <w:iCs/>
+        </w:rPr>
+        <w:t xml:space="preserve">Download fresh rather than re-pointing the old folders: the new repos do not share all of the old history, so pulls into an old folder can fail.</w:t>
+      </w:r>
+    </w:p>
+    <w:p>
+      <w:pPr>
+        <w:pStyle w:val="Heading2"/>
+      </w:pPr>
+      <w:r>
+        <w:t xml:space="preserve">Part 3. Tools (GitHub Copilot app)</w:t>
+      </w:r>
+    </w:p>
+    <w:p>
+      <w:pPr>
+        <w:spacing w:after="100"/>
+      </w:pPr>
+      <w:r>
+        <w:rPr>
+          <w:i/>
+          <w:iCs/>
+        </w:rPr>
+        <w:t xml:space="preserve">AI tools quick start: three tools, each in its own repo. The repo address is at the start of each tool.</w:t>
+      </w:r>
+    </w:p>
+    <w:p>
+      <w:pPr>
+        <w:pStyle w:val="Heading3"/>
+      </w:pPr>
+      <w:r>
+        <w:t xml:space="preserve">We assume you already have</w:t>
       </w:r>
     </w:p>
     <w:p>
@@ -4488,31 +5819,19 @@
         <w:spacing w:after="40"/>
       </w:pPr>
       <w:r>
-        <w:t xml:space="preserve">Plans: </w:t>
-      </w:r>
-      <w:r>
-        <w:rPr>
-          <w:rFonts w:ascii="Consolas" w:cs="Consolas" w:eastAsia="Consolas" w:hAnsi="Consolas"/>
-          <w:color w:val="7F3F00"/>
-          <w:sz w:val="19"/>
-          <w:szCs w:val="19"/>
-        </w:rPr>
-        <w:t xml:space="preserve">excel_ai/plans/</w:t>
-      </w:r>
-      <w:r>
-        <w:t xml:space="preserve"> (e.g. </w:t>
-      </w:r>
-      <w:r>
-        <w:rPr>
-          <w:rFonts w:ascii="Consolas" w:cs="Consolas" w:eastAsia="Consolas" w:hAnsi="Consolas"/>
-          <w:color w:val="7F3F00"/>
-          <w:sz w:val="19"/>
-          <w:szCs w:val="19"/>
-        </w:rPr>
-        <w:t xml:space="preserve">Modules.md</w:t>
-      </w:r>
-      <w:r>
-        <w:t xml:space="preserve"> for the modular design).</w:t>
+        <w:t xml:space="preserve">The repo for your tool downloaded on your laptop (</w:t>
+      </w:r>
+      <w:r>
+        <w:rPr>
+          <w:rFonts w:ascii="Consolas" w:cs="Consolas" w:eastAsia="Consolas" w:hAnsi="Consolas"/>
+          <w:color w:val="7F3F00"/>
+          <w:sz w:val="19"/>
+          <w:szCs w:val="19"/>
+        </w:rPr>
+        <w:t xml:space="preserve">C:\Users\WB&lt;PID&gt;\Repos\&lt;folder&gt;</w:t>
+      </w:r>
+      <w:r>
+        <w:t xml:space="preserve">, Part 1 or 2) and up to date.</w:t>
       </w:r>
     </w:p>
     <w:p>
@@ -4525,31 +5844,7 @@
         <w:spacing w:after="40"/>
       </w:pPr>
       <w:r>
-        <w:t xml:space="preserve">Python model: </w:t>
-      </w:r>
-      <w:r>
-        <w:rPr>
-          <w:rFonts w:ascii="Consolas" w:cs="Consolas" w:eastAsia="Consolas" w:hAnsi="Consolas"/>
-          <w:color w:val="7F3F00"/>
-          <w:sz w:val="19"/>
-          <w:szCs w:val="19"/>
-        </w:rPr>
-        <w:t xml:space="preserve">coded/README.md</w:t>
-      </w:r>
-      <w:r>
-        <w:t xml:space="preserve"> and </w:t>
-      </w:r>
-      <w:r>
-        <w:rPr>
-          <w:rFonts w:ascii="Consolas" w:cs="Consolas" w:eastAsia="Consolas" w:hAnsi="Consolas"/>
-          <w:color w:val="7F3F00"/>
-          <w:sz w:val="19"/>
-          <w:szCs w:val="19"/>
-        </w:rPr>
-        <w:t xml:space="preserve">coded/TODO.md</w:t>
-      </w:r>
-      <w:r>
-        <w:t xml:space="preserve">.</w:t>
+        <w:t xml:space="preserve">The GitHub Copilot app installed (Microsoft Store) and signed in with your GitHub account.</w:t>
       </w:r>
     </w:p>
     <w:p>
@@ -4562,19 +5857,1774 @@
         <w:spacing w:after="40"/>
       </w:pPr>
       <w:r>
-        <w:t xml:space="preserve">Personal working folders: </w:t>
-      </w:r>
-      <w:r>
-        <w:rPr>
-          <w:rFonts w:ascii="Consolas" w:cs="Consolas" w:eastAsia="Consolas" w:hAnsi="Consolas"/>
-          <w:color w:val="7F3F00"/>
-          <w:sz w:val="19"/>
-          <w:szCs w:val="19"/>
-        </w:rPr>
-        <w:t xml:space="preserve">users/</w:t>
+        <w:t xml:space="preserve">Part 1 done (and Part 2 if you set up before the move). Not there yet? See </w:t>
+      </w:r>
+      <w:r>
+        <w:rPr>
+          <w:rFonts w:ascii="Consolas" w:cs="Consolas" w:eastAsia="Consolas" w:hAnsi="Consolas"/>
+          <w:color w:val="7F3F00"/>
+          <w:sz w:val="19"/>
+          <w:szCs w:val="19"/>
+        </w:rPr>
+        <w:t xml:space="preserve">Presentations/GitHub_Copilot_AI_User_Guide.pptx</w:t>
       </w:r>
       <w:r>
         <w:t xml:space="preserve">.</w:t>
+      </w:r>
+    </w:p>
+    <w:p>
+      <w:pPr>
+        <w:spacing w:after="100"/>
+      </w:pPr>
+      <w:r>
+        <w:t xml:space="preserve">Steps 1-2 set up a session. Then do Tool 1, 2 or 3. Step 3 saves your work.</w:t>
+      </w:r>
+    </w:p>
+    <w:p>
+      <w:pPr>
+        <w:pStyle w:val="Heading3"/>
+      </w:pPr>
+      <w:r>
+        <w:t xml:space="preserve">Step 1. Open the repo and start a session (once per task)</w:t>
+      </w:r>
+    </w:p>
+    <w:p>
+      <w:pPr>
+        <w:spacing w:after="100"/>
+      </w:pPr>
+      <w:r>
+        <w:rPr>
+          <w:b/>
+          <w:bCs/>
+        </w:rPr>
+        <w:t xml:space="preserve">1. Add the repo (first time only).</w:t>
+      </w:r>
+      <w:r>
+        <w:t xml:space="preserve"> In the sidebar, click + next to Projects, then Open folder. Pick the tool’s repo folder, for example </w:t>
+      </w:r>
+      <w:r>
+        <w:rPr>
+          <w:rFonts w:ascii="Consolas" w:cs="Consolas" w:eastAsia="Consolas" w:hAnsi="Consolas"/>
+          <w:color w:val="7F3F00"/>
+          <w:sz w:val="19"/>
+          <w:szCs w:val="19"/>
+        </w:rPr>
+        <w:t xml:space="preserve">Repos\climate-fiscal-ai-tools</w:t>
+      </w:r>
+      <w:r>
+        <w:t xml:space="preserve">. It stays in the sidebar.</w:t>
+      </w:r>
+    </w:p>
+    <w:p>
+      <w:pPr>
+        <w:spacing w:after="100"/>
+      </w:pPr>
+      <w:r>
+        <w:rPr>
+          <w:b/>
+          <w:bCs/>
+        </w:rPr>
+        <w:t xml:space="preserve">2. Start a session.</w:t>
+      </w:r>
+      <w:r>
+        <w:t xml:space="preserve"> Point at the repo in the sidebar and click the + next to it.</w:t>
+      </w:r>
+    </w:p>
+    <w:p>
+      <w:pPr>
+        <w:spacing w:after="100"/>
+      </w:pPr>
+      <w:r>
+        <w:rPr>
+          <w:b/>
+          <w:bCs/>
+        </w:rPr>
+        <w:t xml:space="preserve">3. Work in your folder.</w:t>
+      </w:r>
+      <w:r>
+        <w:t xml:space="preserve"> Under the prompt box, open the workspace selector and choose Current checkout. Copilot then edits the repo folder on your laptop.</w:t>
+      </w:r>
+    </w:p>
+    <w:p>
+      <w:pPr>
+        <w:spacing w:after="60"/>
+      </w:pPr>
+      <w:r>
+        <w:drawing>
+          <wp:inline distT="0" distB="0" distL="0" distR="0">
+            <wp:extent cx="3962400" cy="1219200"/>
+            <wp:effectExtent t="0" r="0" b="0" l="0"/>
+            <wp:docPr id="1" name="" descr="" title=""/>
+            <wp:cNvGraphicFramePr>
+              <a:graphicFrameLocks xmlns:a="http://schemas.openxmlformats.org/drawingml/2006/main" noChangeAspect="1"/>
+            </wp:cNvGraphicFramePr>
+            <a:graphic xmlns:a="http://schemas.openxmlformats.org/drawingml/2006/main">
+              <a:graphicData uri="http://schemas.openxmlformats.org/drawingml/2006/picture">
+                <pic:pic xmlns:pic="http://schemas.openxmlformats.org/drawingml/2006/picture">
+                  <pic:nvPicPr>
+                    <pic:cNvPr id="0" name="" descr=""/>
+                    <pic:cNvPicPr>
+                      <a:picLocks noChangeAspect="1" noChangeArrowheads="1"/>
+                    </pic:cNvPicPr>
+                  </pic:nvPicPr>
+                  <pic:blipFill>
+                    <a:blip r:embed="rId9" cstate="none"/>
+                    <a:srcRect/>
+                    <a:stretch>
+                      <a:fillRect/>
+                    </a:stretch>
+                  </pic:blipFill>
+                  <pic:spPr bwMode="auto">
+                    <a:xfrm>
+                      <a:off x="0" y="0"/>
+                      <a:ext cx="3962400" cy="1219200"/>
+                    </a:xfrm>
+                    <a:prstGeom prst="rect">
+                      <a:avLst/>
+                    </a:prstGeom>
+                  </pic:spPr>
+                </pic:pic>
+              </a:graphicData>
+            </a:graphic>
+          </wp:inline>
+        </w:drawing>
+      </w:r>
+    </w:p>
+    <w:p>
+      <w:pPr>
+        <w:spacing w:after="100"/>
+      </w:pPr>
+      <w:r>
+        <w:rPr>
+          <w:i/>
+          <w:iCs/>
+        </w:rPr>
+        <w:t xml:space="preserve">+ next to Projects, then Open folder</w:t>
+      </w:r>
+    </w:p>
+    <w:p>
+      <w:pPr>
+        <w:spacing w:after="60"/>
+      </w:pPr>
+      <w:r>
+        <w:drawing>
+          <wp:inline distT="0" distB="0" distL="0" distR="0">
+            <wp:extent cx="3962400" cy="1905000"/>
+            <wp:effectExtent t="0" r="0" b="0" l="0"/>
+            <wp:docPr id="1" name="" descr="" title=""/>
+            <wp:cNvGraphicFramePr>
+              <a:graphicFrameLocks xmlns:a="http://schemas.openxmlformats.org/drawingml/2006/main" noChangeAspect="1"/>
+            </wp:cNvGraphicFramePr>
+            <a:graphic xmlns:a="http://schemas.openxmlformats.org/drawingml/2006/main">
+              <a:graphicData uri="http://schemas.openxmlformats.org/drawingml/2006/picture">
+                <pic:pic xmlns:pic="http://schemas.openxmlformats.org/drawingml/2006/picture">
+                  <pic:nvPicPr>
+                    <pic:cNvPr id="0" name="" descr=""/>
+                    <pic:cNvPicPr>
+                      <a:picLocks noChangeAspect="1" noChangeArrowheads="1"/>
+                    </pic:cNvPicPr>
+                  </pic:nvPicPr>
+                  <pic:blipFill>
+                    <a:blip r:embed="rId10" cstate="none"/>
+                    <a:srcRect/>
+                    <a:stretch>
+                      <a:fillRect/>
+                    </a:stretch>
+                  </pic:blipFill>
+                  <pic:spPr bwMode="auto">
+                    <a:xfrm>
+                      <a:off x="0" y="0"/>
+                      <a:ext cx="3962400" cy="1905000"/>
+                    </a:xfrm>
+                    <a:prstGeom prst="rect">
+                      <a:avLst/>
+                    </a:prstGeom>
+                  </pic:spPr>
+                </pic:pic>
+              </a:graphicData>
+            </a:graphic>
+          </wp:inline>
+        </w:drawing>
+      </w:r>
+    </w:p>
+    <w:p>
+      <w:pPr>
+        <w:spacing w:after="100"/>
+      </w:pPr>
+      <w:r>
+        <w:rPr>
+          <w:i/>
+          <w:iCs/>
+        </w:rPr>
+        <w:t xml:space="preserve">Workspace selector, then Current checkout</w:t>
+      </w:r>
+    </w:p>
+    <w:p>
+      <w:pPr>
+        <w:pStyle w:val="Heading3"/>
+      </w:pPr>
+      <w:r>
+        <w:t xml:space="preserve">Step 2. Pick the model and the mode (every session)</w:t>
+      </w:r>
+    </w:p>
+    <w:p>
+      <w:pPr>
+        <w:spacing w:after="100"/>
+      </w:pPr>
+      <w:r>
+        <w:rPr>
+          <w:b/>
+          <w:bCs/>
+        </w:rPr>
+        <w:t xml:space="preserve">1. Model.</w:t>
+      </w:r>
+      <w:r>
+        <w:t xml:space="preserve"> Click the model chip under the prompt box. Switch Auto off, then pick Claude Sonnet for everyday work, Claude Opus for the excise research.</w:t>
+      </w:r>
+    </w:p>
+    <w:p>
+      <w:pPr>
+        <w:spacing w:after="100"/>
+      </w:pPr>
+      <w:r>
+        <w:rPr>
+          <w:b/>
+          <w:bCs/>
+        </w:rPr>
+        <w:t xml:space="preserve">2. Mode.</w:t>
+      </w:r>
+      <w:r>
+        <w:t xml:space="preserve"> Click the mode chip and pick Interactive: Copilot asks before it acts.</w:t>
+      </w:r>
+    </w:p>
+    <w:p>
+      <w:pPr>
+        <w:spacing w:after="100"/>
+      </w:pPr>
+      <w:r>
+        <w:rPr>
+          <w:b/>
+          <w:bCs/>
+        </w:rPr>
+        <w:t xml:space="preserve">3. Credits.</w:t>
+      </w:r>
+      <w:r>
+        <w:t xml:space="preserve"> Type </w:t>
+      </w:r>
+      <w:r>
+        <w:rPr>
+          <w:rFonts w:ascii="Consolas" w:cs="Consolas" w:eastAsia="Consolas" w:hAnsi="Consolas"/>
+          <w:color w:val="7F3F00"/>
+          <w:sz w:val="19"/>
+          <w:szCs w:val="19"/>
+        </w:rPr>
+        <w:t xml:space="preserve">/context</w:t>
+      </w:r>
+      <w:r>
+        <w:t xml:space="preserve"> at any time to see the AI credits the session has used.</w:t>
+      </w:r>
+    </w:p>
+    <w:p>
+      <w:pPr>
+        <w:spacing w:after="60"/>
+      </w:pPr>
+      <w:r>
+        <w:drawing>
+          <wp:inline distT="0" distB="0" distL="0" distR="0">
+            <wp:extent cx="3962400" cy="1171575"/>
+            <wp:effectExtent t="0" r="0" b="0" l="0"/>
+            <wp:docPr id="1" name="" descr="" title=""/>
+            <wp:cNvGraphicFramePr>
+              <a:graphicFrameLocks xmlns:a="http://schemas.openxmlformats.org/drawingml/2006/main" noChangeAspect="1"/>
+            </wp:cNvGraphicFramePr>
+            <a:graphic xmlns:a="http://schemas.openxmlformats.org/drawingml/2006/main">
+              <a:graphicData uri="http://schemas.openxmlformats.org/drawingml/2006/picture">
+                <pic:pic xmlns:pic="http://schemas.openxmlformats.org/drawingml/2006/picture">
+                  <pic:nvPicPr>
+                    <pic:cNvPr id="0" name="" descr=""/>
+                    <pic:cNvPicPr>
+                      <a:picLocks noChangeAspect="1" noChangeArrowheads="1"/>
+                    </pic:cNvPicPr>
+                  </pic:nvPicPr>
+                  <pic:blipFill>
+                    <a:blip r:embed="rId11" cstate="none"/>
+                    <a:srcRect/>
+                    <a:stretch>
+                      <a:fillRect/>
+                    </a:stretch>
+                  </pic:blipFill>
+                  <pic:spPr bwMode="auto">
+                    <a:xfrm>
+                      <a:off x="0" y="0"/>
+                      <a:ext cx="3962400" cy="1171575"/>
+                    </a:xfrm>
+                    <a:prstGeom prst="rect">
+                      <a:avLst/>
+                    </a:prstGeom>
+                  </pic:spPr>
+                </pic:pic>
+              </a:graphicData>
+            </a:graphic>
+          </wp:inline>
+        </w:drawing>
+      </w:r>
+    </w:p>
+    <w:p>
+      <w:pPr>
+        <w:spacing w:after="100"/>
+      </w:pPr>
+      <w:r>
+        <w:rPr>
+          <w:i/>
+          <w:iCs/>
+        </w:rPr>
+        <w:t xml:space="preserve">Model chip: Auto off, then Model</w:t>
+      </w:r>
+    </w:p>
+    <w:p>
+      <w:pPr>
+        <w:spacing w:after="60"/>
+      </w:pPr>
+      <w:r>
+        <w:drawing>
+          <wp:inline distT="0" distB="0" distL="0" distR="0">
+            <wp:extent cx="3962400" cy="1914525"/>
+            <wp:effectExtent t="0" r="0" b="0" l="0"/>
+            <wp:docPr id="1" name="" descr="" title=""/>
+            <wp:cNvGraphicFramePr>
+              <a:graphicFrameLocks xmlns:a="http://schemas.openxmlformats.org/drawingml/2006/main" noChangeAspect="1"/>
+            </wp:cNvGraphicFramePr>
+            <a:graphic xmlns:a="http://schemas.openxmlformats.org/drawingml/2006/main">
+              <a:graphicData uri="http://schemas.openxmlformats.org/drawingml/2006/picture">
+                <pic:pic xmlns:pic="http://schemas.openxmlformats.org/drawingml/2006/picture">
+                  <pic:nvPicPr>
+                    <pic:cNvPr id="0" name="" descr=""/>
+                    <pic:cNvPicPr>
+                      <a:picLocks noChangeAspect="1" noChangeArrowheads="1"/>
+                    </pic:cNvPicPr>
+                  </pic:nvPicPr>
+                  <pic:blipFill>
+                    <a:blip r:embed="rId12" cstate="none"/>
+                    <a:srcRect/>
+                    <a:stretch>
+                      <a:fillRect/>
+                    </a:stretch>
+                  </pic:blipFill>
+                  <pic:spPr bwMode="auto">
+                    <a:xfrm>
+                      <a:off x="0" y="0"/>
+                      <a:ext cx="3962400" cy="1914525"/>
+                    </a:xfrm>
+                    <a:prstGeom prst="rect">
+                      <a:avLst/>
+                    </a:prstGeom>
+                  </pic:spPr>
+                </pic:pic>
+              </a:graphicData>
+            </a:graphic>
+          </wp:inline>
+        </w:drawing>
+      </w:r>
+    </w:p>
+    <w:p>
+      <w:pPr>
+        <w:spacing w:after="100"/>
+      </w:pPr>
+      <w:r>
+        <w:rPr>
+          <w:i/>
+          <w:iCs/>
+        </w:rPr>
+        <w:t xml:space="preserve">Mode chip: pick Interactive</w:t>
+      </w:r>
+    </w:p>
+    <w:p>
+      <w:pPr>
+        <w:pStyle w:val="Heading3"/>
+      </w:pPr>
+      <w:r>
+        <w:t xml:space="preserve">Tool 1. Excise diagnostic for Indonesia (Claude Opus · Interactive)</w:t>
+      </w:r>
+    </w:p>
+    <w:p>
+      <w:pPr>
+        <w:spacing w:after="100"/>
+      </w:pPr>
+      <w:r>
+        <w:rPr>
+          <w:b/>
+          <w:bCs/>
+        </w:rPr>
+        <w:t xml:space="preserve">Repo:</w:t>
+      </w:r>
+      <w:r>
+        <w:t xml:space="preserve"> https://github.com/cpmodelai/climate-fiscal-ai-tools · </w:t>
+      </w:r>
+      <w:r>
+        <w:rPr>
+          <w:b/>
+          <w:bCs/>
+        </w:rPr>
+        <w:t xml:space="preserve">Folder:</w:t>
+      </w:r>
+      <w:r>
+        <w:t xml:space="preserve"> </w:t>
+      </w:r>
+      <w:r>
+        <w:rPr>
+          <w:rFonts w:ascii="Consolas" w:cs="Consolas" w:eastAsia="Consolas" w:hAnsi="Consolas"/>
+          <w:color w:val="7F3F00"/>
+          <w:sz w:val="19"/>
+          <w:szCs w:val="19"/>
+        </w:rPr>
+        <w:t xml:space="preserve">Repos\climate-fiscal-ai-tools</w:t>
+      </w:r>
+    </w:p>
+    <w:p>
+      <w:pPr>
+        <w:spacing w:after="100"/>
+      </w:pPr>
+      <w:r>
+        <w:rPr>
+          <w:b/>
+          <w:bCs/>
+        </w:rPr>
+        <w:t xml:space="preserve">⚠ Deep research uses a lot of credits. Send one prompt, read the answer, then send the next. Check /context as you go. Stop and fix anything wrong before going on.</w:t>
+      </w:r>
+    </w:p>
+    <w:p>
+      <w:pPr>
+        <w:spacing w:after="100"/>
+      </w:pPr>
+      <w:r>
+        <w:t xml:space="preserve">Attach the instructions: type @ and pick </w:t>
+      </w:r>
+      <w:r>
+        <w:rPr>
+          <w:rFonts w:ascii="Consolas" w:cs="Consolas" w:eastAsia="Consolas" w:hAnsi="Consolas"/>
+          <w:color w:val="7F3F00"/>
+          <w:sz w:val="19"/>
+          <w:szCs w:val="19"/>
+        </w:rPr>
+        <w:t xml:space="preserve">user_guide/excise_diagnostic_process.md</w:t>
+      </w:r>
+      <w:r>
+        <w:t xml:space="preserve"> (or drag the file onto the prompt box).</w:t>
+      </w:r>
+    </w:p>
+    <w:p>
+      <w:pPr>
+        <w:spacing w:after="100"/>
+      </w:pPr>
+      <w:r>
+        <w:rPr>
+          <w:b/>
+          <w:bCs/>
+        </w:rPr>
+        <w:t xml:space="preserve">Paste:</w:t>
+      </w:r>
+      <w:r>
+        <w:t xml:space="preserve"> </w:t>
+      </w:r>
+      <w:r>
+        <w:rPr>
+          <w:rFonts w:ascii="Consolas" w:cs="Consolas" w:eastAsia="Consolas" w:hAnsi="Consolas"/>
+          <w:color w:val="7F3F00"/>
+          <w:sz w:val="19"/>
+          <w:szCs w:val="19"/>
+        </w:rPr>
+        <w:t xml:space="preserve">@user_guide/excise_diagnostic_process.md Follow this file. Run stage A1 for Indonesia, 2020 to 2026-09-30. Search the web for the laws. Stop after A1.</w:t>
+      </w:r>
+    </w:p>
+    <w:p>
+      <w:pPr>
+        <w:spacing w:after="100"/>
+      </w:pPr>
+      <w:r>
+        <w:rPr>
+          <w:b/>
+          <w:bCs/>
+        </w:rPr>
+        <w:t xml:space="preserve">Then, one at a time:</w:t>
+      </w:r>
+      <w:r>
+        <w:t xml:space="preserve"> </w:t>
+      </w:r>
+      <w:r>
+        <w:rPr>
+          <w:rFonts w:ascii="Consolas" w:cs="Consolas" w:eastAsia="Consolas" w:hAnsi="Consolas"/>
+          <w:color w:val="7F3F00"/>
+          <w:sz w:val="19"/>
+          <w:szCs w:val="19"/>
+        </w:rPr>
+        <w:t xml:space="preserve">Run stage A2.</w:t>
+      </w:r>
+      <w:r>
+        <w:t xml:space="preserve"> · </w:t>
+      </w:r>
+      <w:r>
+        <w:rPr>
+          <w:rFonts w:ascii="Consolas" w:cs="Consolas" w:eastAsia="Consolas" w:hAnsi="Consolas"/>
+          <w:color w:val="7F3F00"/>
+          <w:sz w:val="19"/>
+          <w:szCs w:val="19"/>
+        </w:rPr>
+        <w:t xml:space="preserve">Run stage A3.</w:t>
+      </w:r>
+      <w:r>
+        <w:t xml:space="preserve"> · </w:t>
+      </w:r>
+      <w:r>
+        <w:rPr>
+          <w:rFonts w:ascii="Consolas" w:cs="Consolas" w:eastAsia="Consolas" w:hAnsi="Consolas"/>
+          <w:color w:val="7F3F00"/>
+          <w:sz w:val="19"/>
+          <w:szCs w:val="19"/>
+        </w:rPr>
+        <w:t xml:space="preserve">Run stage A4.</w:t>
+      </w:r>
+      <w:r>
+        <w:t xml:space="preserve"> · </w:t>
+      </w:r>
+      <w:r>
+        <w:rPr>
+          <w:rFonts w:ascii="Consolas" w:cs="Consolas" w:eastAsia="Consolas" w:hAnsi="Consolas"/>
+          <w:color w:val="7F3F00"/>
+          <w:sz w:val="19"/>
+          <w:szCs w:val="19"/>
+        </w:rPr>
+        <w:t xml:space="preserve">Run stage A5.</w:t>
+      </w:r>
+      <w:r>
+        <w:t xml:space="preserve"> · </w:t>
+      </w:r>
+      <w:r>
+        <w:rPr>
+          <w:rFonts w:ascii="Consolas" w:cs="Consolas" w:eastAsia="Consolas" w:hAnsi="Consolas"/>
+          <w:color w:val="7F3F00"/>
+          <w:sz w:val="19"/>
+          <w:szCs w:val="19"/>
+        </w:rPr>
+        <w:t xml:space="preserve">Run stage A6. Save the Word report and Excel workbook in ExciseDiagnostic/country_results/Indonesia/.</w:t>
+      </w:r>
+    </w:p>
+    <w:p>
+      <w:pPr>
+        <w:spacing w:after="100"/>
+      </w:pPr>
+      <w:r>
+        <w:rPr>
+          <w:b/>
+          <w:bCs/>
+        </w:rPr>
+        <w:t xml:space="preserve">Check:</w:t>
+      </w:r>
+      <w:r>
+        <w:t xml:space="preserve"> every rate quoted with its date and a source link; missing data says data_gap.</w:t>
+      </w:r>
+    </w:p>
+    <w:p>
+      <w:pPr>
+        <w:spacing w:after="60"/>
+      </w:pPr>
+      <w:r>
+        <w:drawing>
+          <wp:inline distT="0" distB="0" distL="0" distR="0">
+            <wp:extent cx="4686300" cy="2628900"/>
+            <wp:effectExtent t="0" r="0" b="0" l="0"/>
+            <wp:docPr id="1" name="" descr="" title=""/>
+            <wp:cNvGraphicFramePr>
+              <a:graphicFrameLocks xmlns:a="http://schemas.openxmlformats.org/drawingml/2006/main" noChangeAspect="1"/>
+            </wp:cNvGraphicFramePr>
+            <a:graphic xmlns:a="http://schemas.openxmlformats.org/drawingml/2006/main">
+              <a:graphicData uri="http://schemas.openxmlformats.org/drawingml/2006/picture">
+                <pic:pic xmlns:pic="http://schemas.openxmlformats.org/drawingml/2006/picture">
+                  <pic:nvPicPr>
+                    <pic:cNvPr id="0" name="" descr=""/>
+                    <pic:cNvPicPr>
+                      <a:picLocks noChangeAspect="1" noChangeArrowheads="1"/>
+                    </pic:cNvPicPr>
+                  </pic:nvPicPr>
+                  <pic:blipFill>
+                    <a:blip r:embed="rId13" cstate="none"/>
+                    <a:srcRect/>
+                    <a:stretch>
+                      <a:fillRect/>
+                    </a:stretch>
+                  </pic:blipFill>
+                  <pic:spPr bwMode="auto">
+                    <a:xfrm>
+                      <a:off x="0" y="0"/>
+                      <a:ext cx="4686300" cy="2628900"/>
+                    </a:xfrm>
+                    <a:prstGeom prst="rect">
+                      <a:avLst/>
+                    </a:prstGeom>
+                  </pic:spPr>
+                </pic:pic>
+              </a:graphicData>
+            </a:graphic>
+          </wp:inline>
+        </w:drawing>
+      </w:r>
+    </w:p>
+    <w:p>
+      <w:pPr>
+        <w:spacing w:after="100"/>
+      </w:pPr>
+      <w:r>
+        <w:rPr>
+          <w:i/>
+          <w:iCs/>
+        </w:rPr>
+        <w:t xml:space="preserve">A session at work: the steps on the left, the plan on the right</w:t>
+      </w:r>
+    </w:p>
+    <w:p>
+      <w:pPr>
+        <w:pStyle w:val="Heading3"/>
+      </w:pPr>
+      <w:r>
+        <w:t xml:space="preserve">Tool 2. Add tax indicators to the dashboard (Claude Sonnet · Interactive)</w:t>
+      </w:r>
+    </w:p>
+    <w:p>
+      <w:pPr>
+        <w:spacing w:after="100"/>
+      </w:pPr>
+      <w:r>
+        <w:rPr>
+          <w:b/>
+          <w:bCs/>
+        </w:rPr>
+        <w:t xml:space="preserve">Repo:</w:t>
+      </w:r>
+      <w:r>
+        <w:t xml:space="preserve"> https://github.com/cpmodelai/climate-fiscal-ai-tools · </w:t>
+      </w:r>
+      <w:r>
+        <w:rPr>
+          <w:b/>
+          <w:bCs/>
+        </w:rPr>
+        <w:t xml:space="preserve">Folder:</w:t>
+      </w:r>
+      <w:r>
+        <w:t xml:space="preserve"> </w:t>
+      </w:r>
+      <w:r>
+        <w:rPr>
+          <w:rFonts w:ascii="Consolas" w:cs="Consolas" w:eastAsia="Consolas" w:hAnsi="Consolas"/>
+          <w:color w:val="7F3F00"/>
+          <w:sz w:val="19"/>
+          <w:szCs w:val="19"/>
+        </w:rPr>
+        <w:t xml:space="preserve">Repos\climate-fiscal-ai-tools</w:t>
+      </w:r>
+    </w:p>
+    <w:p>
+      <w:pPr>
+        <w:spacing w:after="100"/>
+      </w:pPr>
+      <w:r>
+        <w:rPr>
+          <w:b/>
+          <w:bCs/>
+        </w:rPr>
+        <w:t xml:space="preserve">Paste:</w:t>
+      </w:r>
+      <w:r>
+        <w:t xml:space="preserve"> </w:t>
+      </w:r>
+      <w:r>
+        <w:rPr>
+          <w:rFonts w:ascii="Consolas" w:cs="Consolas" w:eastAsia="Consolas" w:hAnsi="Consolas"/>
+          <w:color w:val="7F3F00"/>
+          <w:sz w:val="19"/>
+          <w:szCs w:val="19"/>
+        </w:rPr>
+        <w:t xml:space="preserve">Add VAT, personal income tax, corporate income tax and excises (% of GDP) to the dashboard, under Tax revenue, from the IMF WoRLD file already in raw_data. Follow TaxMacroFiscalDashboard/build/README.md. Do not change anything else. Then rebuild and show me Indonesia.</w:t>
+      </w:r>
+    </w:p>
+    <w:p>
+      <w:pPr>
+        <w:spacing w:after="100"/>
+      </w:pPr>
+      <w:r>
+        <w:rPr>
+          <w:b/>
+          <w:bCs/>
+        </w:rPr>
+        <w:t xml:space="preserve">Then:</w:t>
+      </w:r>
+      <w:r>
+        <w:t xml:space="preserve"> </w:t>
+      </w:r>
+      <w:r>
+        <w:rPr>
+          <w:rFonts w:ascii="Consolas" w:cs="Consolas" w:eastAsia="Consolas" w:hAnsi="Consolas"/>
+          <w:color w:val="7F3F00"/>
+          <w:sz w:val="19"/>
+          <w:szCs w:val="19"/>
+        </w:rPr>
+        <w:t xml:space="preserve">Commit and push with a clear message.</w:t>
+      </w:r>
+    </w:p>
+    <w:p>
+      <w:pPr>
+        <w:spacing w:after="100"/>
+      </w:pPr>
+      <w:r>
+        <w:rPr>
+          <w:b/>
+          <w:bCs/>
+        </w:rPr>
+        <w:t xml:space="preserve">Check:</w:t>
+      </w:r>
+      <w:r>
+        <w:t xml:space="preserve"> Indonesia, % of GDP: tax 10.08 · VAT 3.52 · corporate 2.65 · personal 1.79 · excises 1.11</w:t>
+      </w:r>
+    </w:p>
+    <w:p>
+      <w:pPr>
+        <w:spacing w:after="60"/>
+      </w:pPr>
+      <w:r>
+        <w:drawing>
+          <wp:inline distT="0" distB="0" distL="0" distR="0">
+            <wp:extent cx="4686300" cy="2628900"/>
+            <wp:effectExtent t="0" r="0" b="0" l="0"/>
+            <wp:docPr id="1" name="" descr="" title=""/>
+            <wp:cNvGraphicFramePr>
+              <a:graphicFrameLocks xmlns:a="http://schemas.openxmlformats.org/drawingml/2006/main" noChangeAspect="1"/>
+            </wp:cNvGraphicFramePr>
+            <a:graphic xmlns:a="http://schemas.openxmlformats.org/drawingml/2006/main">
+              <a:graphicData uri="http://schemas.openxmlformats.org/drawingml/2006/picture">
+                <pic:pic xmlns:pic="http://schemas.openxmlformats.org/drawingml/2006/picture">
+                  <pic:nvPicPr>
+                    <pic:cNvPr id="0" name="" descr=""/>
+                    <pic:cNvPicPr>
+                      <a:picLocks noChangeAspect="1" noChangeArrowheads="1"/>
+                    </pic:cNvPicPr>
+                  </pic:nvPicPr>
+                  <pic:blipFill>
+                    <a:blip r:embed="rId14" cstate="none"/>
+                    <a:srcRect/>
+                    <a:stretch>
+                      <a:fillRect/>
+                    </a:stretch>
+                  </pic:blipFill>
+                  <pic:spPr bwMode="auto">
+                    <a:xfrm>
+                      <a:off x="0" y="0"/>
+                      <a:ext cx="4686300" cy="2628900"/>
+                    </a:xfrm>
+                    <a:prstGeom prst="rect">
+                      <a:avLst/>
+                    </a:prstGeom>
+                  </pic:spPr>
+                </pic:pic>
+              </a:graphicData>
+            </a:graphic>
+          </wp:inline>
+        </w:drawing>
+      </w:r>
+    </w:p>
+    <w:p>
+      <w:pPr>
+        <w:spacing w:after="100"/>
+      </w:pPr>
+      <w:r>
+        <w:rPr>
+          <w:i/>
+          <w:iCs/>
+        </w:rPr>
+        <w:t xml:space="preserve">The Changes view: every edit as a diff before you keep it</w:t>
+      </w:r>
+    </w:p>
+    <w:p>
+      <w:pPr>
+        <w:pStyle w:val="Heading3"/>
+      </w:pPr>
+      <w:r>
+        <w:t xml:space="preserve">Tool 3. Make an update to CPAT-AI (Claude Opus · Interactive)</w:t>
+      </w:r>
+    </w:p>
+    <w:p>
+      <w:pPr>
+        <w:spacing w:after="100"/>
+      </w:pPr>
+      <w:r>
+        <w:rPr>
+          <w:b/>
+          <w:bCs/>
+        </w:rPr>
+        <w:t xml:space="preserve">Repo:</w:t>
+      </w:r>
+      <w:r>
+        <w:t xml:space="preserve"> https://github.com/cpmodelai/cpat_ai · </w:t>
+      </w:r>
+      <w:r>
+        <w:rPr>
+          <w:b/>
+          <w:bCs/>
+        </w:rPr>
+        <w:t xml:space="preserve">Folder:</w:t>
+      </w:r>
+      <w:r>
+        <w:t xml:space="preserve"> </w:t>
+      </w:r>
+      <w:r>
+        <w:rPr>
+          <w:rFonts w:ascii="Consolas" w:cs="Consolas" w:eastAsia="Consolas" w:hAnsi="Consolas"/>
+          <w:color w:val="7F3F00"/>
+          <w:sz w:val="19"/>
+          <w:szCs w:val="19"/>
+        </w:rPr>
+        <w:t xml:space="preserve">Repos\CPAT-AI</w:t>
+      </w:r>
+    </w:p>
+    <w:p>
+      <w:pPr>
+        <w:spacing w:after="100"/>
+      </w:pPr>
+      <w:r>
+        <w:t xml:space="preserve">Attach the rules: type @ and pick </w:t>
+      </w:r>
+      <w:r>
+        <w:rPr>
+          <w:rFonts w:ascii="Consolas" w:cs="Consolas" w:eastAsia="Consolas" w:hAnsi="Consolas"/>
+          <w:color w:val="7F3F00"/>
+          <w:sz w:val="19"/>
+          <w:szCs w:val="19"/>
+        </w:rPr>
+        <w:t xml:space="preserve">AGENTS.md</w:t>
+      </w:r>
+      <w:r>
+        <w:t xml:space="preserve"> (or drag the file onto the prompt box). It points Copilot to </w:t>
+      </w:r>
+      <w:r>
+        <w:rPr>
+          <w:rFonts w:ascii="Consolas" w:cs="Consolas" w:eastAsia="Consolas" w:hAnsi="Consolas"/>
+          <w:color w:val="7F3F00"/>
+          <w:sz w:val="19"/>
+          <w:szCs w:val="19"/>
+        </w:rPr>
+        <w:t xml:space="preserve">NORMS.md</w:t>
+      </w:r>
+      <w:r>
+        <w:t xml:space="preserve">, </w:t>
+      </w:r>
+      <w:r>
+        <w:rPr>
+          <w:rFonts w:ascii="Consolas" w:cs="Consolas" w:eastAsia="Consolas" w:hAnsi="Consolas"/>
+          <w:color w:val="7F3F00"/>
+          <w:sz w:val="19"/>
+          <w:szCs w:val="19"/>
+        </w:rPr>
+        <w:t xml:space="preserve">CAVEATS.md</w:t>
+      </w:r>
+      <w:r>
+        <w:t xml:space="preserve"> and the to-do lists, so it follows the repo’s rules.</w:t>
+      </w:r>
+    </w:p>
+    <w:p>
+      <w:pPr>
+        <w:spacing w:after="100"/>
+      </w:pPr>
+      <w:r>
+        <w:rPr>
+          <w:b/>
+          <w:bCs/>
+        </w:rPr>
+        <w:t xml:space="preserve">Paste (fill in your change):</w:t>
+      </w:r>
+      <w:r>
+        <w:t xml:space="preserve"> </w:t>
+      </w:r>
+      <w:r>
+        <w:rPr>
+          <w:rFonts w:ascii="Consolas" w:cs="Consolas" w:eastAsia="Consolas" w:hAnsi="Consolas"/>
+          <w:color w:val="7F3F00"/>
+          <w:sz w:val="19"/>
+          <w:szCs w:val="19"/>
+        </w:rPr>
+        <w:t xml:space="preserve">@AGENTS.md Follow this file and the documents it points to. In the mitigation prototype, &lt;describe your change&gt;. Never replicate a legacy bug; replicate legacy issues and register them. Rebuild, run excel_ai/mitigation/check_quick.py and show me the result. Then add the entry at the bottom of CAVEATS.md and update excel_ai/plans/TODO.md.</w:t>
+      </w:r>
+    </w:p>
+    <w:p>
+      <w:pPr>
+        <w:spacing w:after="100"/>
+      </w:pPr>
+      <w:r>
+        <w:rPr>
+          <w:b/>
+          <w:bCs/>
+        </w:rPr>
+        <w:t xml:space="preserve">Then, one at a time:</w:t>
+      </w:r>
+      <w:r>
+        <w:t xml:space="preserve"> </w:t>
+      </w:r>
+      <w:r>
+        <w:rPr>
+          <w:rFonts w:ascii="Consolas" w:cs="Consolas" w:eastAsia="Consolas" w:hAnsi="Consolas"/>
+          <w:color w:val="7F3F00"/>
+          <w:sz w:val="19"/>
+          <w:szCs w:val="19"/>
+        </w:rPr>
+        <w:t xml:space="preserve">Show me the changes before you save them.</w:t>
+      </w:r>
+      <w:r>
+        <w:t xml:space="preserve"> · </w:t>
+      </w:r>
+      <w:r>
+        <w:rPr>
+          <w:rFonts w:ascii="Consolas" w:cs="Consolas" w:eastAsia="Consolas" w:hAnsi="Consolas"/>
+          <w:color w:val="7F3F00"/>
+          <w:sz w:val="19"/>
+          <w:szCs w:val="19"/>
+        </w:rPr>
+        <w:t xml:space="preserve">Commit and push with a clear message.</w:t>
+      </w:r>
+    </w:p>
+    <w:p>
+      <w:pPr>
+        <w:spacing w:after="100"/>
+      </w:pPr>
+      <w:r>
+        <w:rPr>
+          <w:b/>
+          <w:bCs/>
+        </w:rPr>
+        <w:t xml:space="preserve">Rules the repo sets (AGENTS.md):</w:t>
+      </w:r>
+    </w:p>
+    <w:p>
+      <w:pPr>
+        <w:pStyle w:val="ListParagraph"/>
+        <w:numPr>
+          <w:ilvl w:val="0"/>
+          <w:numId w:val="3"/>
+        </w:numPr>
+        <w:spacing w:after="40"/>
+      </w:pPr>
+      <w:r>
+        <w:t xml:space="preserve">Never edit a released workbook: the build writes a new version.</w:t>
+      </w:r>
+    </w:p>
+    <w:p>
+      <w:pPr>
+        <w:pStyle w:val="ListParagraph"/>
+        <w:numPr>
+          <w:ilvl w:val="0"/>
+          <w:numId w:val="3"/>
+        </w:numPr>
+        <w:spacing w:after="40"/>
+      </w:pPr>
+      <w:r>
+        <w:t xml:space="preserve">All data go in </w:t>
+      </w:r>
+      <w:r>
+        <w:rPr>
+          <w:rFonts w:ascii="Consolas" w:cs="Consolas" w:eastAsia="Consolas" w:hAnsi="Consolas"/>
+          <w:color w:val="7F3F00"/>
+          <w:sz w:val="19"/>
+          <w:szCs w:val="19"/>
+        </w:rPr>
+        <w:t xml:space="preserve">data/</w:t>
+      </w:r>
+      <w:r>
+        <w:t xml:space="preserve">, with the script that converts them.</w:t>
+      </w:r>
+    </w:p>
+    <w:p>
+      <w:pPr>
+        <w:pStyle w:val="ListParagraph"/>
+        <w:numPr>
+          <w:ilvl w:val="0"/>
+          <w:numId w:val="3"/>
+        </w:numPr>
+        <w:spacing w:after="40"/>
+      </w:pPr>
+      <w:r>
+        <w:t xml:space="preserve">Every finished task ends with an entry at the bottom of </w:t>
+      </w:r>
+      <w:r>
+        <w:rPr>
+          <w:rFonts w:ascii="Consolas" w:cs="Consolas" w:eastAsia="Consolas" w:hAnsi="Consolas"/>
+          <w:color w:val="7F3F00"/>
+          <w:sz w:val="19"/>
+          <w:szCs w:val="19"/>
+        </w:rPr>
+        <w:t xml:space="preserve">CAVEATS.md</w:t>
+      </w:r>
+      <w:r>
+        <w:t xml:space="preserve">.</w:t>
+      </w:r>
+    </w:p>
+    <w:p>
+      <w:pPr>
+        <w:pStyle w:val="ListParagraph"/>
+        <w:numPr>
+          <w:ilvl w:val="0"/>
+          <w:numId w:val="3"/>
+        </w:numPr>
+        <w:spacing w:after="40"/>
+      </w:pPr>
+      <w:r>
+        <w:t xml:space="preserve">Copilot does not commit unless you ask.</w:t>
+      </w:r>
+    </w:p>
+    <w:p>
+      <w:pPr>
+        <w:pStyle w:val="ListParagraph"/>
+        <w:numPr>
+          <w:ilvl w:val="0"/>
+          <w:numId w:val="3"/>
+        </w:numPr>
+        <w:spacing w:after="40"/>
+      </w:pPr>
+      <w:r>
+        <w:t xml:space="preserve">The checks need Python 3, openpyxl and LibreOffice. Use Claude Sonnet for text-only edits.</w:t>
+      </w:r>
+    </w:p>
+    <w:p>
+      <w:pPr>
+        <w:spacing w:after="100"/>
+      </w:pPr>
+      <w:r>
+        <w:rPr>
+          <w:b/>
+          <w:bCs/>
+        </w:rPr>
+        <w:t xml:space="preserve">Check:</w:t>
+      </w:r>
+      <w:r>
+        <w:t xml:space="preserve"> </w:t>
+      </w:r>
+      <w:r>
+        <w:rPr>
+          <w:rFonts w:ascii="Consolas" w:cs="Consolas" w:eastAsia="Consolas" w:hAnsi="Consolas"/>
+          <w:color w:val="7F3F00"/>
+          <w:sz w:val="19"/>
+          <w:szCs w:val="19"/>
+        </w:rPr>
+        <w:t xml:space="preserve">check_quick.py</w:t>
+      </w:r>
+      <w:r>
+        <w:t xml:space="preserve"> says PASS; a new entry at the bottom of </w:t>
+      </w:r>
+      <w:r>
+        <w:rPr>
+          <w:rFonts w:ascii="Consolas" w:cs="Consolas" w:eastAsia="Consolas" w:hAnsi="Consolas"/>
+          <w:color w:val="7F3F00"/>
+          <w:sz w:val="19"/>
+          <w:szCs w:val="19"/>
+        </w:rPr>
+        <w:t xml:space="preserve">CAVEATS.md</w:t>
+      </w:r>
+      <w:r>
+        <w:t xml:space="preserve">; the change shows on github.com/cpmodelai/cpat_ai.</w:t>
+      </w:r>
+    </w:p>
+    <w:p>
+      <w:pPr>
+        <w:pStyle w:val="Heading3"/>
+      </w:pPr>
+      <w:r>
+        <w:t xml:space="preserve">Step 3. Save your work to GitHub</w:t>
+      </w:r>
+    </w:p>
+    <w:p>
+      <w:pPr>
+        <w:spacing w:after="100"/>
+      </w:pPr>
+      <w:r>
+        <w:rPr>
+          <w:b/>
+          <w:bCs/>
+        </w:rPr>
+        <w:t xml:space="preserve">1. Ask Copilot.</w:t>
+      </w:r>
+      <w:r>
+        <w:t xml:space="preserve"> Type: </w:t>
+      </w:r>
+      <w:r>
+        <w:rPr>
+          <w:rFonts w:ascii="Consolas" w:cs="Consolas" w:eastAsia="Consolas" w:hAnsi="Consolas"/>
+          <w:color w:val="7F3F00"/>
+          <w:sz w:val="19"/>
+          <w:szCs w:val="19"/>
+        </w:rPr>
+        <w:t xml:space="preserve">Commit and push with a clear message.</w:t>
+      </w:r>
+      <w:r>
+        <w:t xml:space="preserve"> Approve what it shows.</w:t>
+      </w:r>
+    </w:p>
+    <w:p>
+      <w:pPr>
+        <w:spacing w:after="100"/>
+      </w:pPr>
+      <w:r>
+        <w:rPr>
+          <w:b/>
+          <w:bCs/>
+        </w:rPr>
+        <w:t xml:space="preserve">2. Or use the script.</w:t>
+      </w:r>
+      <w:r>
+        <w:t xml:space="preserve"> Double-click </w:t>
+      </w:r>
+      <w:r>
+        <w:rPr>
+          <w:rFonts w:ascii="Consolas" w:cs="Consolas" w:eastAsia="Consolas" w:hAnsi="Consolas"/>
+          <w:color w:val="7F3F00"/>
+          <w:sz w:val="19"/>
+          <w:szCs w:val="19"/>
+        </w:rPr>
+        <w:t xml:space="preserve">SyncAllRepos.bat</w:t>
+      </w:r>
+      <w:r>
+        <w:t xml:space="preserve"> in your Repos folder (all repos at once), or </w:t>
+      </w:r>
+      <w:r>
+        <w:rPr>
+          <w:rFonts w:ascii="Consolas" w:cs="Consolas" w:eastAsia="Consolas" w:hAnsi="Consolas"/>
+          <w:color w:val="7F3F00"/>
+          <w:sz w:val="19"/>
+          <w:szCs w:val="19"/>
+        </w:rPr>
+        <w:t xml:space="preserve">SyncRepo.bat</w:t>
+      </w:r>
+      <w:r>
+        <w:t xml:space="preserve"> in the repo folder where there is one.</w:t>
+      </w:r>
+    </w:p>
+    <w:p>
+      <w:pPr>
+        <w:spacing w:after="100"/>
+      </w:pPr>
+      <w:r>
+        <w:rPr>
+          <w:b/>
+          <w:bCs/>
+        </w:rPr>
+        <w:t xml:space="preserve">3. Check.</w:t>
+      </w:r>
+      <w:r>
+        <w:t xml:space="preserve"> On github.com/cpmodelai/climate-fiscal-ai-tools (Tools 1-2) or github.com/cpmodelai/cpat_ai (Tool 3), your change shows as the latest commit.</w:t>
+      </w:r>
+    </w:p>
+    <w:p>
+      <w:pPr>
+        <w:spacing w:after="100"/>
+      </w:pPr>
+      <w:r>
+        <w:rPr>
+          <w:i/>
+          <w:iCs/>
+        </w:rPr>
+        <w:t xml:space="preserve">With Claude instead: on claude.ai make a Project, add excise_diagnostic_process.md, switch on Research, and paste the same prompts.</w:t>
+      </w:r>
+    </w:p>
+    <w:p>
+      <w:pPr>
+        <w:pStyle w:val="Heading2"/>
+      </w:pPr>
+      <w:r>
+        <w:t xml:space="preserve">Part 4. Git in brief</w:t>
+      </w:r>
+    </w:p>
+    <w:p>
+      <w:pPr>
+        <w:spacing w:after="100"/>
+      </w:pPr>
+      <w:r>
+        <w:t xml:space="preserve">Git keeps every version of every file in a repo. Your Repos folder holds a local copy of each repo; GitHub holds the shared copy. The scripts in </w:t>
+      </w:r>
+      <w:r>
+        <w:rPr>
+          <w:b/>
+          <w:bCs/>
+        </w:rPr>
+        <w:t xml:space="preserve">repo-tools</w:t>
+      </w:r>
+      <w:r>
+        <w:t xml:space="preserve"> (</w:t>
+      </w:r>
+      <w:r>
+        <w:rPr>
+          <w:rFonts w:ascii="Consolas" w:cs="Consolas" w:eastAsia="Consolas" w:hAnsi="Consolas"/>
+          <w:color w:val="7F3F00"/>
+          <w:sz w:val="19"/>
+          <w:szCs w:val="19"/>
+        </w:rPr>
+        <w:t xml:space="preserve">CloneRepos.bat</w:t>
+      </w:r>
+      <w:r>
+        <w:t xml:space="preserve">, </w:t>
+      </w:r>
+      <w:r>
+        <w:rPr>
+          <w:rFonts w:ascii="Consolas" w:cs="Consolas" w:eastAsia="Consolas" w:hAnsi="Consolas"/>
+          <w:color w:val="7F3F00"/>
+          <w:sz w:val="19"/>
+          <w:szCs w:val="19"/>
+        </w:rPr>
+        <w:t xml:space="preserve">SyncRepo.bat</w:t>
+      </w:r>
+      <w:r>
+        <w:t xml:space="preserve">, </w:t>
+      </w:r>
+      <w:r>
+        <w:rPr>
+          <w:rFonts w:ascii="Consolas" w:cs="Consolas" w:eastAsia="Consolas" w:hAnsi="Consolas"/>
+          <w:color w:val="7F3F00"/>
+          <w:sz w:val="19"/>
+          <w:szCs w:val="19"/>
+        </w:rPr>
+        <w:t xml:space="preserve">SyncAllRepos.bat</w:t>
+      </w:r>
+      <w:r>
+        <w:t xml:space="preserve">) do the usual steps for you.</w:t>
+      </w:r>
+    </w:p>
+    <w:tbl>
+      <w:tblPr>
+        <w:tblW w:type="dxa" w:w="9638"/>
+        <w:tblBorders>
+          <w:top w:val="single" w:color="auto" w:sz="4"/>
+          <w:left w:val="single" w:color="auto" w:sz="4"/>
+          <w:bottom w:val="single" w:color="auto" w:sz="4"/>
+          <w:right w:val="single" w:color="auto" w:sz="4"/>
+          <w:insideH w:val="single" w:color="auto" w:sz="4"/>
+          <w:insideV w:val="single" w:color="auto" w:sz="4"/>
+        </w:tblBorders>
+      </w:tblPr>
+      <w:tblGrid>
+        <w:gridCol w:w="2000"/>
+        <w:gridCol w:w="7638"/>
+      </w:tblGrid>
+      <w:tr>
+        <w:trPr>
+          <w:tblHeader/>
+        </w:trPr>
+        <w:tc>
+          <w:tcPr>
+            <w:tcW w:type="dxa" w:w="2000"/>
+            <w:tcBorders>
+              <w:top w:val="single" w:color="BFBFBF" w:sz="4"/>
+              <w:left w:val="single" w:color="BFBFBF" w:sz="4"/>
+              <w:bottom w:val="single" w:color="BFBFBF" w:sz="4"/>
+              <w:right w:val="single" w:color="BFBFBF" w:sz="4"/>
+            </w:tcBorders>
+            <w:shd w:fill="DCE6F1" w:color="auto" w:val="clear"/>
+            <w:tcMar>
+              <w:top w:type="dxa" w:w="50"/>
+              <w:left w:type="dxa" w:w="90"/>
+              <w:bottom w:type="dxa" w:w="50"/>
+              <w:right w:type="dxa" w:w="90"/>
+            </w:tcMar>
+          </w:tcPr>
+          <w:p>
+            <w:r>
+              <w:rPr>
+                <w:b/>
+                <w:bCs/>
+              </w:rPr>
+              <w:t xml:space="preserve">Word</w:t>
+            </w:r>
+          </w:p>
+        </w:tc>
+        <w:tc>
+          <w:tcPr>
+            <w:tcW w:type="dxa" w:w="7638"/>
+            <w:tcBorders>
+              <w:top w:val="single" w:color="BFBFBF" w:sz="4"/>
+              <w:left w:val="single" w:color="BFBFBF" w:sz="4"/>
+              <w:bottom w:val="single" w:color="BFBFBF" w:sz="4"/>
+              <w:right w:val="single" w:color="BFBFBF" w:sz="4"/>
+            </w:tcBorders>
+            <w:shd w:fill="DCE6F1" w:color="auto" w:val="clear"/>
+            <w:tcMar>
+              <w:top w:type="dxa" w:w="50"/>
+              <w:left w:type="dxa" w:w="90"/>
+              <w:bottom w:type="dxa" w:w="50"/>
+              <w:right w:type="dxa" w:w="90"/>
+            </w:tcMar>
+          </w:tcPr>
+          <w:p>
+            <w:r>
+              <w:rPr>
+                <w:b/>
+                <w:bCs/>
+              </w:rPr>
+              <w:t xml:space="preserve">What it means</w:t>
+            </w:r>
+          </w:p>
+        </w:tc>
+      </w:tr>
+      <w:tr>
+        <w:trPr>
+          <w:tblHeader w:val="false"/>
+        </w:trPr>
+        <w:tc>
+          <w:tcPr>
+            <w:tcW w:type="dxa" w:w="2000"/>
+            <w:tcBorders>
+              <w:top w:val="single" w:color="BFBFBF" w:sz="4"/>
+              <w:left w:val="single" w:color="BFBFBF" w:sz="4"/>
+              <w:bottom w:val="single" w:color="BFBFBF" w:sz="4"/>
+              <w:right w:val="single" w:color="BFBFBF" w:sz="4"/>
+            </w:tcBorders>
+            <w:tcMar>
+              <w:top w:type="dxa" w:w="50"/>
+              <w:left w:type="dxa" w:w="90"/>
+              <w:bottom w:type="dxa" w:w="50"/>
+              <w:right w:type="dxa" w:w="90"/>
+            </w:tcMar>
+          </w:tcPr>
+          <w:p>
+            <w:r>
+              <w:t xml:space="preserve">clone</w:t>
+            </w:r>
+          </w:p>
+        </w:tc>
+        <w:tc>
+          <w:tcPr>
+            <w:tcW w:type="dxa" w:w="7638"/>
+            <w:tcBorders>
+              <w:top w:val="single" w:color="BFBFBF" w:sz="4"/>
+              <w:left w:val="single" w:color="BFBFBF" w:sz="4"/>
+              <w:bottom w:val="single" w:color="BFBFBF" w:sz="4"/>
+              <w:right w:val="single" w:color="BFBFBF" w:sz="4"/>
+            </w:tcBorders>
+            <w:tcMar>
+              <w:top w:type="dxa" w:w="50"/>
+              <w:left w:type="dxa" w:w="90"/>
+              <w:bottom w:type="dxa" w:w="50"/>
+              <w:right w:type="dxa" w:w="90"/>
+            </w:tcMar>
+          </w:tcPr>
+          <w:p>
+            <w:r>
+              <w:t xml:space="preserve">Download a repo to your laptop, once (</w:t>
+            </w:r>
+            <w:r>
+              <w:rPr>
+                <w:rFonts w:ascii="Consolas" w:cs="Consolas" w:eastAsia="Consolas" w:hAnsi="Consolas"/>
+                <w:color w:val="7F3F00"/>
+                <w:sz w:val="19"/>
+                <w:szCs w:val="19"/>
+              </w:rPr>
+              <w:t xml:space="preserve">CloneRepos.bat</w:t>
+            </w:r>
+            <w:r>
+              <w:t xml:space="preserve">).</w:t>
+            </w:r>
+          </w:p>
+        </w:tc>
+      </w:tr>
+      <w:tr>
+        <w:trPr>
+          <w:tblHeader w:val="false"/>
+        </w:trPr>
+        <w:tc>
+          <w:tcPr>
+            <w:tcW w:type="dxa" w:w="2000"/>
+            <w:tcBorders>
+              <w:top w:val="single" w:color="BFBFBF" w:sz="4"/>
+              <w:left w:val="single" w:color="BFBFBF" w:sz="4"/>
+              <w:bottom w:val="single" w:color="BFBFBF" w:sz="4"/>
+              <w:right w:val="single" w:color="BFBFBF" w:sz="4"/>
+            </w:tcBorders>
+            <w:tcMar>
+              <w:top w:type="dxa" w:w="50"/>
+              <w:left w:type="dxa" w:w="90"/>
+              <w:bottom w:type="dxa" w:w="50"/>
+              <w:right w:type="dxa" w:w="90"/>
+            </w:tcMar>
+          </w:tcPr>
+          <w:p>
+            <w:r>
+              <w:t xml:space="preserve">pull</w:t>
+            </w:r>
+          </w:p>
+        </w:tc>
+        <w:tc>
+          <w:tcPr>
+            <w:tcW w:type="dxa" w:w="7638"/>
+            <w:tcBorders>
+              <w:top w:val="single" w:color="BFBFBF" w:sz="4"/>
+              <w:left w:val="single" w:color="BFBFBF" w:sz="4"/>
+              <w:bottom w:val="single" w:color="BFBFBF" w:sz="4"/>
+              <w:right w:val="single" w:color="BFBFBF" w:sz="4"/>
+            </w:tcBorders>
+            <w:tcMar>
+              <w:top w:type="dxa" w:w="50"/>
+              <w:left w:type="dxa" w:w="90"/>
+              <w:bottom w:type="dxa" w:w="50"/>
+              <w:right w:type="dxa" w:w="90"/>
+            </w:tcMar>
+          </w:tcPr>
+          <w:p>
+            <w:r>
+              <w:t xml:space="preserve">Get everyone else’s changes from GitHub.</w:t>
+            </w:r>
+          </w:p>
+        </w:tc>
+      </w:tr>
+      <w:tr>
+        <w:trPr>
+          <w:tblHeader w:val="false"/>
+        </w:trPr>
+        <w:tc>
+          <w:tcPr>
+            <w:tcW w:type="dxa" w:w="2000"/>
+            <w:tcBorders>
+              <w:top w:val="single" w:color="BFBFBF" w:sz="4"/>
+              <w:left w:val="single" w:color="BFBFBF" w:sz="4"/>
+              <w:bottom w:val="single" w:color="BFBFBF" w:sz="4"/>
+              <w:right w:val="single" w:color="BFBFBF" w:sz="4"/>
+            </w:tcBorders>
+            <w:tcMar>
+              <w:top w:type="dxa" w:w="50"/>
+              <w:left w:type="dxa" w:w="90"/>
+              <w:bottom w:type="dxa" w:w="50"/>
+              <w:right w:type="dxa" w:w="90"/>
+            </w:tcMar>
+          </w:tcPr>
+          <w:p>
+            <w:r>
+              <w:t xml:space="preserve">commit</w:t>
+            </w:r>
+          </w:p>
+        </w:tc>
+        <w:tc>
+          <w:tcPr>
+            <w:tcW w:type="dxa" w:w="7638"/>
+            <w:tcBorders>
+              <w:top w:val="single" w:color="BFBFBF" w:sz="4"/>
+              <w:left w:val="single" w:color="BFBFBF" w:sz="4"/>
+              <w:bottom w:val="single" w:color="BFBFBF" w:sz="4"/>
+              <w:right w:val="single" w:color="BFBFBF" w:sz="4"/>
+            </w:tcBorders>
+            <w:tcMar>
+              <w:top w:type="dxa" w:w="50"/>
+              <w:left w:type="dxa" w:w="90"/>
+              <w:bottom w:type="dxa" w:w="50"/>
+              <w:right w:type="dxa" w:w="90"/>
+            </w:tcMar>
+          </w:tcPr>
+          <w:p>
+            <w:r>
+              <w:t xml:space="preserve">Save a snapshot of your changes, with a one-line message.</w:t>
+            </w:r>
+          </w:p>
+        </w:tc>
+      </w:tr>
+      <w:tr>
+        <w:trPr>
+          <w:tblHeader w:val="false"/>
+        </w:trPr>
+        <w:tc>
+          <w:tcPr>
+            <w:tcW w:type="dxa" w:w="2000"/>
+            <w:tcBorders>
+              <w:top w:val="single" w:color="BFBFBF" w:sz="4"/>
+              <w:left w:val="single" w:color="BFBFBF" w:sz="4"/>
+              <w:bottom w:val="single" w:color="BFBFBF" w:sz="4"/>
+              <w:right w:val="single" w:color="BFBFBF" w:sz="4"/>
+            </w:tcBorders>
+            <w:tcMar>
+              <w:top w:type="dxa" w:w="50"/>
+              <w:left w:type="dxa" w:w="90"/>
+              <w:bottom w:type="dxa" w:w="50"/>
+              <w:right w:type="dxa" w:w="90"/>
+            </w:tcMar>
+          </w:tcPr>
+          <w:p>
+            <w:r>
+              <w:t xml:space="preserve">push</w:t>
+            </w:r>
+          </w:p>
+        </w:tc>
+        <w:tc>
+          <w:tcPr>
+            <w:tcW w:type="dxa" w:w="7638"/>
+            <w:tcBorders>
+              <w:top w:val="single" w:color="BFBFBF" w:sz="4"/>
+              <w:left w:val="single" w:color="BFBFBF" w:sz="4"/>
+              <w:bottom w:val="single" w:color="BFBFBF" w:sz="4"/>
+              <w:right w:val="single" w:color="BFBFBF" w:sz="4"/>
+            </w:tcBorders>
+            <w:tcMar>
+              <w:top w:type="dxa" w:w="50"/>
+              <w:left w:type="dxa" w:w="90"/>
+              <w:bottom w:type="dxa" w:w="50"/>
+              <w:right w:type="dxa" w:w="90"/>
+            </w:tcMar>
+          </w:tcPr>
+          <w:p>
+            <w:r>
+              <w:t xml:space="preserve">Send your commits to GitHub so others get them.</w:t>
+            </w:r>
+          </w:p>
+        </w:tc>
+      </w:tr>
+      <w:tr>
+        <w:trPr>
+          <w:tblHeader w:val="false"/>
+        </w:trPr>
+        <w:tc>
+          <w:tcPr>
+            <w:tcW w:type="dxa" w:w="2000"/>
+            <w:tcBorders>
+              <w:top w:val="single" w:color="BFBFBF" w:sz="4"/>
+              <w:left w:val="single" w:color="BFBFBF" w:sz="4"/>
+              <w:bottom w:val="single" w:color="BFBFBF" w:sz="4"/>
+              <w:right w:val="single" w:color="BFBFBF" w:sz="4"/>
+            </w:tcBorders>
+            <w:tcMar>
+              <w:top w:type="dxa" w:w="50"/>
+              <w:left w:type="dxa" w:w="90"/>
+              <w:bottom w:type="dxa" w:w="50"/>
+              <w:right w:type="dxa" w:w="90"/>
+            </w:tcMar>
+          </w:tcPr>
+          <w:p>
+            <w:r>
+              <w:t xml:space="preserve">branch</w:t>
+            </w:r>
+          </w:p>
+        </w:tc>
+        <w:tc>
+          <w:tcPr>
+            <w:tcW w:type="dxa" w:w="7638"/>
+            <w:tcBorders>
+              <w:top w:val="single" w:color="BFBFBF" w:sz="4"/>
+              <w:left w:val="single" w:color="BFBFBF" w:sz="4"/>
+              <w:bottom w:val="single" w:color="BFBFBF" w:sz="4"/>
+              <w:right w:val="single" w:color="BFBFBF" w:sz="4"/>
+            </w:tcBorders>
+            <w:tcMar>
+              <w:top w:type="dxa" w:w="50"/>
+              <w:left w:type="dxa" w:w="90"/>
+              <w:bottom w:type="dxa" w:w="50"/>
+              <w:right w:type="dxa" w:w="90"/>
+            </w:tcMar>
+          </w:tcPr>
+          <w:p>
+            <w:r>
+              <w:t xml:space="preserve">A parallel line of work. </w:t>
+            </w:r>
+            <w:r>
+              <w:rPr>
+                <w:rFonts w:ascii="Consolas" w:cs="Consolas" w:eastAsia="Consolas" w:hAnsi="Consolas"/>
+                <w:color w:val="7F3F00"/>
+                <w:sz w:val="19"/>
+                <w:szCs w:val="19"/>
+              </w:rPr>
+              <w:t xml:space="preserve">main</w:t>
+            </w:r>
+            <w:r>
+              <w:t xml:space="preserve"> is the shared one; AI sessions often work on their own branch.</w:t>
+            </w:r>
+          </w:p>
+        </w:tc>
+      </w:tr>
+      <w:tr>
+        <w:trPr>
+          <w:tblHeader w:val="false"/>
+        </w:trPr>
+        <w:tc>
+          <w:tcPr>
+            <w:tcW w:type="dxa" w:w="2000"/>
+            <w:tcBorders>
+              <w:top w:val="single" w:color="BFBFBF" w:sz="4"/>
+              <w:left w:val="single" w:color="BFBFBF" w:sz="4"/>
+              <w:bottom w:val="single" w:color="BFBFBF" w:sz="4"/>
+              <w:right w:val="single" w:color="BFBFBF" w:sz="4"/>
+            </w:tcBorders>
+            <w:tcMar>
+              <w:top w:type="dxa" w:w="50"/>
+              <w:left w:type="dxa" w:w="90"/>
+              <w:bottom w:type="dxa" w:w="50"/>
+              <w:right w:type="dxa" w:w="90"/>
+            </w:tcMar>
+          </w:tcPr>
+          <w:p>
+            <w:r>
+              <w:t xml:space="preserve">pull request (PR)</w:t>
+            </w:r>
+          </w:p>
+        </w:tc>
+        <w:tc>
+          <w:tcPr>
+            <w:tcW w:type="dxa" w:w="7638"/>
+            <w:tcBorders>
+              <w:top w:val="single" w:color="BFBFBF" w:sz="4"/>
+              <w:left w:val="single" w:color="BFBFBF" w:sz="4"/>
+              <w:bottom w:val="single" w:color="BFBFBF" w:sz="4"/>
+              <w:right w:val="single" w:color="BFBFBF" w:sz="4"/>
+            </w:tcBorders>
+            <w:tcMar>
+              <w:top w:type="dxa" w:w="50"/>
+              <w:left w:type="dxa" w:w="90"/>
+              <w:bottom w:type="dxa" w:w="50"/>
+              <w:right w:type="dxa" w:w="90"/>
+            </w:tcMar>
+          </w:tcPr>
+          <w:p>
+            <w:r>
+              <w:t xml:space="preserve">A request to merge a branch into </w:t>
+            </w:r>
+            <w:r>
+              <w:rPr>
+                <w:rFonts w:ascii="Consolas" w:cs="Consolas" w:eastAsia="Consolas" w:hAnsi="Consolas"/>
+                <w:color w:val="7F3F00"/>
+                <w:sz w:val="19"/>
+                <w:szCs w:val="19"/>
+              </w:rPr>
+              <w:t xml:space="preserve">main</w:t>
+            </w:r>
+            <w:r>
+              <w:t xml:space="preserve">, reviewed on github.com.</w:t>
+            </w:r>
+          </w:p>
+        </w:tc>
+      </w:tr>
+      <w:tr>
+        <w:trPr>
+          <w:tblHeader w:val="false"/>
+        </w:trPr>
+        <w:tc>
+          <w:tcPr>
+            <w:tcW w:type="dxa" w:w="2000"/>
+            <w:tcBorders>
+              <w:top w:val="single" w:color="BFBFBF" w:sz="4"/>
+              <w:left w:val="single" w:color="BFBFBF" w:sz="4"/>
+              <w:bottom w:val="single" w:color="BFBFBF" w:sz="4"/>
+              <w:right w:val="single" w:color="BFBFBF" w:sz="4"/>
+            </w:tcBorders>
+            <w:tcMar>
+              <w:top w:type="dxa" w:w="50"/>
+              <w:left w:type="dxa" w:w="90"/>
+              <w:bottom w:type="dxa" w:w="50"/>
+              <w:right w:type="dxa" w:w="90"/>
+            </w:tcMar>
+          </w:tcPr>
+          <w:p>
+            <w:r>
+              <w:t xml:space="preserve">merge conflict</w:t>
+            </w:r>
+          </w:p>
+        </w:tc>
+        <w:tc>
+          <w:tcPr>
+            <w:tcW w:type="dxa" w:w="7638"/>
+            <w:tcBorders>
+              <w:top w:val="single" w:color="BFBFBF" w:sz="4"/>
+              <w:left w:val="single" w:color="BFBFBF" w:sz="4"/>
+              <w:bottom w:val="single" w:color="BFBFBF" w:sz="4"/>
+              <w:right w:val="single" w:color="BFBFBF" w:sz="4"/>
+            </w:tcBorders>
+            <w:tcMar>
+              <w:top w:type="dxa" w:w="50"/>
+              <w:left w:type="dxa" w:w="90"/>
+              <w:bottom w:type="dxa" w:w="50"/>
+              <w:right w:type="dxa" w:w="90"/>
+            </w:tcMar>
+          </w:tcPr>
+          <w:p>
+            <w:r>
+              <w:t xml:space="preserve">You and someone else changed the same lines; git asks which version to keep.</w:t>
+            </w:r>
+          </w:p>
+        </w:tc>
+      </w:tr>
+    </w:tbl>
+    <w:p>
+      <w:pPr>
+        <w:spacing w:after="100" w:before="120"/>
+      </w:pPr>
+      <w:r>
+        <w:rPr>
+          <w:b/>
+          <w:bCs/>
+        </w:rPr>
+        <w:t xml:space="preserve">Every day:</w:t>
+      </w:r>
+      <w:r>
+        <w:t xml:space="preserve"> double-click </w:t>
+      </w:r>
+      <w:r>
+        <w:rPr>
+          <w:rFonts w:ascii="Consolas" w:cs="Consolas" w:eastAsia="Consolas" w:hAnsi="Consolas"/>
+          <w:color w:val="7F3F00"/>
+          <w:sz w:val="19"/>
+          <w:szCs w:val="19"/>
+        </w:rPr>
+        <w:t xml:space="preserve">SyncAllRepos.bat</w:t>
+      </w:r>
+      <w:r>
+        <w:t xml:space="preserve"> (or </w:t>
+      </w:r>
+      <w:r>
+        <w:rPr>
+          <w:rFonts w:ascii="Consolas" w:cs="Consolas" w:eastAsia="Consolas" w:hAnsi="Consolas"/>
+          <w:color w:val="7F3F00"/>
+          <w:sz w:val="19"/>
+          <w:szCs w:val="19"/>
+        </w:rPr>
+        <w:t xml:space="preserve">SyncRepo.bat</w:t>
+      </w:r>
+      <w:r>
+        <w:t xml:space="preserve"> in one repo). It switches to </w:t>
+      </w:r>
+      <w:r>
+        <w:rPr>
+          <w:rFonts w:ascii="Consolas" w:cs="Consolas" w:eastAsia="Consolas" w:hAnsi="Consolas"/>
+          <w:color w:val="7F3F00"/>
+          <w:sz w:val="19"/>
+          <w:szCs w:val="19"/>
+        </w:rPr>
+        <w:t xml:space="preserve">main</w:t>
+      </w:r>
+      <w:r>
+        <w:t xml:space="preserve">, pulls, then commits and pushes your changes with the message you type.</w:t>
+      </w:r>
+    </w:p>
+    <w:p>
+      <w:pPr>
+        <w:spacing w:after="100"/>
+      </w:pPr>
+      <w:r>
+        <w:rPr>
+          <w:b/>
+          <w:bCs/>
+        </w:rPr>
+        <w:t xml:space="preserve">If the sync stops with a conflict or a failed push, use GitHub Desktop.</w:t>
+      </w:r>
+      <w:r>
+        <w:t xml:space="preserve"> File → Add local repository, pick the repo folder. It lists the files in conflict; for each one choose Open in editor (or “Use mine” / “Use theirs”), keep the right text, then click Continue merge, then Push origin. For a binary file (Excel, Word) pick one whole version and copy your changes into it by hand. If in doubt, copy your changed files somewhere safe first, or ask an AI session to resolve the merge.</w:t>
+      </w:r>
+    </w:p>
+    <w:p>
+      <w:pPr>
+        <w:spacing w:after="100"/>
+      </w:pPr>
+      <w:r>
+        <w:rPr>
+          <w:b/>
+          <w:bCs/>
+        </w:rPr>
+        <w:t xml:space="preserve">Never commit real data.</w:t>
+      </w:r>
+      <w:r>
+        <w:t xml:space="preserve"> Before every sync, check the list of changed files: no CPAT workbook or export holding proprietary data (see the CPAT-AI quick start, section 4).</w:t>
       </w:r>
     </w:p>
     <w:sectPr>
@@ -5033,5 +8083,22 @@
       <w:szCs w:val="23"/>
     </w:rPr>
   </w:style>
+  <w:style w:type="paragraph" w:styleId="Heading3">
+    <w:name w:val="Heading 3"/>
+    <w:basedOn w:val="Normal"/>
+    <w:next w:val="Normal"/>
+    <w:qFormat/>
+    <w:pPr>
+      <w:spacing w:after="60" w:before="140"/>
+      <w:outlineLvl w:val="2"/>
+    </w:pPr>
+    <w:rPr>
+      <w:b/>
+      <w:bCs/>
+      <w:color w:val="2E75B6"/>
+      <w:sz w:val="21"/>
+      <w:szCs w:val="21"/>
+    </w:rPr>
+  </w:style>
 </w:styles>
 </file>
</xml_diff>

<commit_message>
Quick start: key documents split into human-readable documents, key PowerPoints and computer-readable files
Co-Authored-By: Claude Opus 5.5 <noreply@anthropic.com>
Claude-Session: https://claude.ai/code/session_01VSHkeGCB7nXrurxDYPdfYr
</commit_message>
<xml_diff>
--- a/HumanReadme-QuickStart.docx
+++ b/HumanReadme-QuickStart.docx
@@ -68,6 +68,14 @@
       </w:r>
       <w:r>
         <w:t xml:space="preserve">.</w:t>
+      </w:r>
+    </w:p>
+    <w:p>
+      <w:pPr>
+        <w:pStyle w:val="Heading2"/>
+      </w:pPr>
+      <w:r>
+        <w:t xml:space="preserve">Human-readable documents</w:t>
       </w:r>
     </w:p>
     <w:tbl>
@@ -195,7 +203,666 @@
           </w:tcPr>
           <w:p>
             <w:r>
-              <w:t xml:space="preserve">This guide (root folder). Linked from </w:t>
+              <w:t xml:space="preserve">This guide (root folder), with the setup guide as Appendix A.</w:t>
+            </w:r>
+          </w:p>
+        </w:tc>
+      </w:tr>
+      <w:tr>
+        <w:trPr>
+          <w:tblHeader w:val="false"/>
+        </w:trPr>
+        <w:tc>
+          <w:tcPr>
+            <w:tcW w:type="dxa" w:w="3700"/>
+            <w:tcBorders>
+              <w:top w:val="single" w:color="BFBFBF" w:sz="4"/>
+              <w:left w:val="single" w:color="BFBFBF" w:sz="4"/>
+              <w:bottom w:val="single" w:color="BFBFBF" w:sz="4"/>
+              <w:right w:val="single" w:color="BFBFBF" w:sz="4"/>
+            </w:tcBorders>
+            <w:tcMar>
+              <w:top w:type="dxa" w:w="50"/>
+              <w:left w:type="dxa" w:w="90"/>
+              <w:bottom w:type="dxa" w:w="50"/>
+              <w:right w:type="dxa" w:w="90"/>
+            </w:tcMar>
+          </w:tcPr>
+          <w:p>
+            <w:r>
+              <w:rPr>
+                <w:rFonts w:ascii="Consolas" w:cs="Consolas" w:eastAsia="Consolas" w:hAnsi="Consolas"/>
+                <w:color w:val="7F3F00"/>
+                <w:sz w:val="19"/>
+                <w:szCs w:val="19"/>
+              </w:rPr>
+              <w:t xml:space="preserve">excel_ai/mitigation/CPAT-AI-Mitigation_Documentation.docx</w:t>
+            </w:r>
+          </w:p>
+        </w:tc>
+        <w:tc>
+          <w:tcPr>
+            <w:tcW w:type="dxa" w:w="5938"/>
+            <w:tcBorders>
+              <w:top w:val="single" w:color="BFBFBF" w:sz="4"/>
+              <w:left w:val="single" w:color="BFBFBF" w:sz="4"/>
+              <w:bottom w:val="single" w:color="BFBFBF" w:sz="4"/>
+              <w:right w:val="single" w:color="BFBFBF" w:sz="4"/>
+            </w:tcBorders>
+            <w:tcMar>
+              <w:top w:type="dxa" w:w="50"/>
+              <w:left w:type="dxa" w:w="90"/>
+              <w:bottom w:type="dxa" w:w="50"/>
+              <w:right w:type="dxa" w:w="90"/>
+            </w:tcMar>
+          </w:tcPr>
+          <w:p>
+            <w:r>
+              <w:t xml:space="preserve">Short documentation of the mitigation prototype: what it is, quick start, how it works, limits.</w:t>
+            </w:r>
+          </w:p>
+        </w:tc>
+      </w:tr>
+      <w:tr>
+        <w:trPr>
+          <w:tblHeader w:val="false"/>
+        </w:trPr>
+        <w:tc>
+          <w:tcPr>
+            <w:tcW w:type="dxa" w:w="3700"/>
+            <w:tcBorders>
+              <w:top w:val="single" w:color="BFBFBF" w:sz="4"/>
+              <w:left w:val="single" w:color="BFBFBF" w:sz="4"/>
+              <w:bottom w:val="single" w:color="BFBFBF" w:sz="4"/>
+              <w:right w:val="single" w:color="BFBFBF" w:sz="4"/>
+            </w:tcBorders>
+            <w:tcMar>
+              <w:top w:type="dxa" w:w="50"/>
+              <w:left w:type="dxa" w:w="90"/>
+              <w:bottom w:type="dxa" w:w="50"/>
+              <w:right w:type="dxa" w:w="90"/>
+            </w:tcMar>
+          </w:tcPr>
+          <w:p>
+            <w:r>
+              <w:rPr>
+                <w:rFonts w:ascii="Consolas" w:cs="Consolas" w:eastAsia="Consolas" w:hAnsi="Consolas"/>
+                <w:color w:val="7F3F00"/>
+                <w:sz w:val="19"/>
+                <w:szCs w:val="19"/>
+              </w:rPr>
+              <w:t xml:space="preserve">excel_ai/mitigation/CPAT-AI-Mitigation_Methods.docx</w:t>
+            </w:r>
+          </w:p>
+        </w:tc>
+        <w:tc>
+          <w:tcPr>
+            <w:tcW w:type="dxa" w:w="5938"/>
+            <w:tcBorders>
+              <w:top w:val="single" w:color="BFBFBF" w:sz="4"/>
+              <w:left w:val="single" w:color="BFBFBF" w:sz="4"/>
+              <w:bottom w:val="single" w:color="BFBFBF" w:sz="4"/>
+              <w:right w:val="single" w:color="BFBFBF" w:sz="4"/>
+            </w:tcBorders>
+            <w:tcMar>
+              <w:top w:type="dxa" w:w="50"/>
+              <w:left w:type="dxa" w:w="90"/>
+              <w:bottom w:type="dxa" w:w="50"/>
+              <w:right w:type="dxa" w:w="90"/>
+            </w:tcMar>
+          </w:tcPr>
+          <w:p>
+            <w:r>
+              <w:t xml:space="preserve">Methods volume: one chapter per block, with equations.</w:t>
+            </w:r>
+          </w:p>
+        </w:tc>
+      </w:tr>
+      <w:tr>
+        <w:trPr>
+          <w:tblHeader w:val="false"/>
+        </w:trPr>
+        <w:tc>
+          <w:tcPr>
+            <w:tcW w:type="dxa" w:w="3700"/>
+            <w:tcBorders>
+              <w:top w:val="single" w:color="BFBFBF" w:sz="4"/>
+              <w:left w:val="single" w:color="BFBFBF" w:sz="4"/>
+              <w:bottom w:val="single" w:color="BFBFBF" w:sz="4"/>
+              <w:right w:val="single" w:color="BFBFBF" w:sz="4"/>
+            </w:tcBorders>
+            <w:tcMar>
+              <w:top w:type="dxa" w:w="50"/>
+              <w:left w:type="dxa" w:w="90"/>
+              <w:bottom w:type="dxa" w:w="50"/>
+              <w:right w:type="dxa" w:w="90"/>
+            </w:tcMar>
+          </w:tcPr>
+          <w:p>
+            <w:r>
+              <w:rPr>
+                <w:rFonts w:ascii="Consolas" w:cs="Consolas" w:eastAsia="Consolas" w:hAnsi="Consolas"/>
+                <w:color w:val="7F3F00"/>
+                <w:sz w:val="19"/>
+                <w:szCs w:val="19"/>
+              </w:rPr>
+              <w:t xml:space="preserve">excel_ai/Tracking_Legacy_Bugs_v&lt;version&gt;.xlsx</w:t>
+            </w:r>
+          </w:p>
+        </w:tc>
+        <w:tc>
+          <w:tcPr>
+            <w:tcW w:type="dxa" w:w="5938"/>
+            <w:tcBorders>
+              <w:top w:val="single" w:color="BFBFBF" w:sz="4"/>
+              <w:left w:val="single" w:color="BFBFBF" w:sz="4"/>
+              <w:bottom w:val="single" w:color="BFBFBF" w:sz="4"/>
+              <w:right w:val="single" w:color="BFBFBF" w:sz="4"/>
+            </w:tcBorders>
+            <w:tcMar>
+              <w:top w:type="dxa" w:w="50"/>
+              <w:left w:type="dxa" w:w="90"/>
+              <w:bottom w:type="dxa" w:w="50"/>
+              <w:right w:type="dxa" w:w="90"/>
+            </w:tcMar>
+          </w:tcPr>
+          <w:p>
+            <w:r>
+              <w:rPr>
+                <w:b/>
+                <w:bCs/>
+              </w:rPr>
+              <w:t xml:space="preserve">The master list of bugs and issues</w:t>
+            </w:r>
+            <w:r>
+              <w:t xml:space="preserve">, every module, with the CPAT team’s own tabs.</w:t>
+            </w:r>
+          </w:p>
+        </w:tc>
+      </w:tr>
+      <w:tr>
+        <w:trPr>
+          <w:tblHeader w:val="false"/>
+        </w:trPr>
+        <w:tc>
+          <w:tcPr>
+            <w:tcW w:type="dxa" w:w="3700"/>
+            <w:tcBorders>
+              <w:top w:val="single" w:color="BFBFBF" w:sz="4"/>
+              <w:left w:val="single" w:color="BFBFBF" w:sz="4"/>
+              <w:bottom w:val="single" w:color="BFBFBF" w:sz="4"/>
+              <w:right w:val="single" w:color="BFBFBF" w:sz="4"/>
+            </w:tcBorders>
+            <w:tcMar>
+              <w:top w:type="dxa" w:w="50"/>
+              <w:left w:type="dxa" w:w="90"/>
+              <w:bottom w:type="dxa" w:w="50"/>
+              <w:right w:type="dxa" w:w="90"/>
+            </w:tcMar>
+          </w:tcPr>
+          <w:p>
+            <w:r>
+              <w:rPr>
+                <w:rFonts w:ascii="Consolas" w:cs="Consolas" w:eastAsia="Consolas" w:hAnsi="Consolas"/>
+                <w:color w:val="7F3F00"/>
+                <w:sz w:val="19"/>
+                <w:szCs w:val="19"/>
+              </w:rPr>
+              <w:t xml:space="preserve">excel_ai/Legacy_CPAT_Bugs_v&lt;version&gt;.docx</w:t>
+            </w:r>
+          </w:p>
+        </w:tc>
+        <w:tc>
+          <w:tcPr>
+            <w:tcW w:type="dxa" w:w="5938"/>
+            <w:tcBorders>
+              <w:top w:val="single" w:color="BFBFBF" w:sz="4"/>
+              <w:left w:val="single" w:color="BFBFBF" w:sz="4"/>
+              <w:bottom w:val="single" w:color="BFBFBF" w:sz="4"/>
+              <w:right w:val="single" w:color="BFBFBF" w:sz="4"/>
+            </w:tcBorders>
+            <w:tcMar>
+              <w:top w:type="dxa" w:w="50"/>
+              <w:left w:type="dxa" w:w="90"/>
+              <w:bottom w:type="dxa" w:w="50"/>
+              <w:right w:type="dxa" w:w="90"/>
+            </w:tcMar>
+          </w:tcPr>
+          <w:p>
+            <w:r>
+              <w:t xml:space="preserve">Every legacy bug found, with its cell-level fix plan for legacy CPAT.</w:t>
+            </w:r>
+          </w:p>
+        </w:tc>
+      </w:tr>
+      <w:tr>
+        <w:trPr>
+          <w:tblHeader w:val="false"/>
+        </w:trPr>
+        <w:tc>
+          <w:tcPr>
+            <w:tcW w:type="dxa" w:w="3700"/>
+            <w:tcBorders>
+              <w:top w:val="single" w:color="BFBFBF" w:sz="4"/>
+              <w:left w:val="single" w:color="BFBFBF" w:sz="4"/>
+              <w:bottom w:val="single" w:color="BFBFBF" w:sz="4"/>
+              <w:right w:val="single" w:color="BFBFBF" w:sz="4"/>
+            </w:tcBorders>
+            <w:tcMar>
+              <w:top w:type="dxa" w:w="50"/>
+              <w:left w:type="dxa" w:w="90"/>
+              <w:bottom w:type="dxa" w:w="50"/>
+              <w:right w:type="dxa" w:w="90"/>
+            </w:tcMar>
+          </w:tcPr>
+          <w:p>
+            <w:r>
+              <w:rPr>
+                <w:rFonts w:ascii="Consolas" w:cs="Consolas" w:eastAsia="Consolas" w:hAnsi="Consolas"/>
+                <w:color w:val="7F3F00"/>
+                <w:sz w:val="19"/>
+                <w:szCs w:val="19"/>
+              </w:rPr>
+              <w:t xml:space="preserve">excel_ai/CPAT-AI_CodesMap_v&lt;version&gt;.xlsx</w:t>
+            </w:r>
+          </w:p>
+        </w:tc>
+        <w:tc>
+          <w:tcPr>
+            <w:tcW w:type="dxa" w:w="5938"/>
+            <w:tcBorders>
+              <w:top w:val="single" w:color="BFBFBF" w:sz="4"/>
+              <w:left w:val="single" w:color="BFBFBF" w:sz="4"/>
+              <w:bottom w:val="single" w:color="BFBFBF" w:sz="4"/>
+              <w:right w:val="single" w:color="BFBFBF" w:sz="4"/>
+            </w:tcBorders>
+            <w:tcMar>
+              <w:top w:type="dxa" w:w="50"/>
+              <w:left w:type="dxa" w:w="90"/>
+              <w:bottom w:type="dxa" w:w="50"/>
+              <w:right w:type="dxa" w:w="90"/>
+            </w:tcMar>
+          </w:tcPr>
+          <w:p>
+            <w:r>
+              <w:t xml:space="preserve">Codes, variables and every input (legacy row, name, Python key).</w:t>
+            </w:r>
+          </w:p>
+        </w:tc>
+      </w:tr>
+      <w:tr>
+        <w:trPr>
+          <w:tblHeader w:val="false"/>
+        </w:trPr>
+        <w:tc>
+          <w:tcPr>
+            <w:tcW w:type="dxa" w:w="3700"/>
+            <w:tcBorders>
+              <w:top w:val="single" w:color="BFBFBF" w:sz="4"/>
+              <w:left w:val="single" w:color="BFBFBF" w:sz="4"/>
+              <w:bottom w:val="single" w:color="BFBFBF" w:sz="4"/>
+              <w:right w:val="single" w:color="BFBFBF" w:sz="4"/>
+            </w:tcBorders>
+            <w:tcMar>
+              <w:top w:type="dxa" w:w="50"/>
+              <w:left w:type="dxa" w:w="90"/>
+              <w:bottom w:type="dxa" w:w="50"/>
+              <w:right w:type="dxa" w:w="90"/>
+            </w:tcMar>
+          </w:tcPr>
+          <w:p>
+            <w:r>
+              <w:rPr>
+                <w:rFonts w:ascii="Consolas" w:cs="Consolas" w:eastAsia="Consolas" w:hAnsi="Consolas"/>
+                <w:color w:val="7F3F00"/>
+                <w:sz w:val="19"/>
+                <w:szCs w:val="19"/>
+              </w:rPr>
+              <w:t xml:space="preserve">other/SetupGuide.docx</w:t>
+            </w:r>
+          </w:p>
+        </w:tc>
+        <w:tc>
+          <w:tcPr>
+            <w:tcW w:type="dxa" w:w="5938"/>
+            <w:tcBorders>
+              <w:top w:val="single" w:color="BFBFBF" w:sz="4"/>
+              <w:left w:val="single" w:color="BFBFBF" w:sz="4"/>
+              <w:bottom w:val="single" w:color="BFBFBF" w:sz="4"/>
+              <w:right w:val="single" w:color="BFBFBF" w:sz="4"/>
+            </w:tcBorders>
+            <w:tcMar>
+              <w:top w:type="dxa" w:w="50"/>
+              <w:left w:type="dxa" w:w="90"/>
+              <w:bottom w:type="dxa" w:w="50"/>
+              <w:right w:type="dxa" w:w="90"/>
+            </w:tcMar>
+          </w:tcPr>
+          <w:p>
+            <w:r>
+              <w:t xml:space="preserve">Getting set up: GitHub, the repos, the AI tools, git in brief (same as Appendix A).</w:t>
+            </w:r>
+          </w:p>
+        </w:tc>
+      </w:tr>
+    </w:tbl>
+    <w:p>
+      <w:pPr>
+        <w:pStyle w:val="Heading2"/>
+      </w:pPr>
+      <w:r>
+        <w:t xml:space="preserve">Key PowerPoints</w:t>
+      </w:r>
+    </w:p>
+    <w:tbl>
+      <w:tblPr>
+        <w:tblW w:type="dxa" w:w="9638"/>
+        <w:tblBorders>
+          <w:top w:val="single" w:color="auto" w:sz="4"/>
+          <w:left w:val="single" w:color="auto" w:sz="4"/>
+          <w:bottom w:val="single" w:color="auto" w:sz="4"/>
+          <w:right w:val="single" w:color="auto" w:sz="4"/>
+          <w:insideH w:val="single" w:color="auto" w:sz="4"/>
+          <w:insideV w:val="single" w:color="auto" w:sz="4"/>
+        </w:tblBorders>
+      </w:tblPr>
+      <w:tblGrid>
+        <w:gridCol w:w="3700"/>
+        <w:gridCol w:w="5938"/>
+      </w:tblGrid>
+      <w:tr>
+        <w:trPr>
+          <w:tblHeader/>
+        </w:trPr>
+        <w:tc>
+          <w:tcPr>
+            <w:tcW w:type="dxa" w:w="3700"/>
+            <w:tcBorders>
+              <w:top w:val="single" w:color="BFBFBF" w:sz="4"/>
+              <w:left w:val="single" w:color="BFBFBF" w:sz="4"/>
+              <w:bottom w:val="single" w:color="BFBFBF" w:sz="4"/>
+              <w:right w:val="single" w:color="BFBFBF" w:sz="4"/>
+            </w:tcBorders>
+            <w:shd w:fill="DCE6F1" w:color="auto" w:val="clear"/>
+            <w:tcMar>
+              <w:top w:type="dxa" w:w="50"/>
+              <w:left w:type="dxa" w:w="90"/>
+              <w:bottom w:type="dxa" w:w="50"/>
+              <w:right w:type="dxa" w:w="90"/>
+            </w:tcMar>
+          </w:tcPr>
+          <w:p>
+            <w:r>
+              <w:rPr>
+                <w:b/>
+                <w:bCs/>
+              </w:rPr>
+              <w:t xml:space="preserve">Deck</w:t>
+            </w:r>
+          </w:p>
+        </w:tc>
+        <w:tc>
+          <w:tcPr>
+            <w:tcW w:type="dxa" w:w="5938"/>
+            <w:tcBorders>
+              <w:top w:val="single" w:color="BFBFBF" w:sz="4"/>
+              <w:left w:val="single" w:color="BFBFBF" w:sz="4"/>
+              <w:bottom w:val="single" w:color="BFBFBF" w:sz="4"/>
+              <w:right w:val="single" w:color="BFBFBF" w:sz="4"/>
+            </w:tcBorders>
+            <w:shd w:fill="DCE6F1" w:color="auto" w:val="clear"/>
+            <w:tcMar>
+              <w:top w:type="dxa" w:w="50"/>
+              <w:left w:type="dxa" w:w="90"/>
+              <w:bottom w:type="dxa" w:w="50"/>
+              <w:right w:type="dxa" w:w="90"/>
+            </w:tcMar>
+          </w:tcPr>
+          <w:p>
+            <w:r>
+              <w:rPr>
+                <w:b/>
+                <w:bCs/>
+              </w:rPr>
+              <w:t xml:space="preserve">What it is for</w:t>
+            </w:r>
+          </w:p>
+        </w:tc>
+      </w:tr>
+      <w:tr>
+        <w:trPr>
+          <w:tblHeader w:val="false"/>
+        </w:trPr>
+        <w:tc>
+          <w:tcPr>
+            <w:tcW w:type="dxa" w:w="3700"/>
+            <w:tcBorders>
+              <w:top w:val="single" w:color="BFBFBF" w:sz="4"/>
+              <w:left w:val="single" w:color="BFBFBF" w:sz="4"/>
+              <w:bottom w:val="single" w:color="BFBFBF" w:sz="4"/>
+              <w:right w:val="single" w:color="BFBFBF" w:sz="4"/>
+            </w:tcBorders>
+            <w:tcMar>
+              <w:top w:type="dxa" w:w="50"/>
+              <w:left w:type="dxa" w:w="90"/>
+              <w:bottom w:type="dxa" w:w="50"/>
+              <w:right w:type="dxa" w:w="90"/>
+            </w:tcMar>
+          </w:tcPr>
+          <w:p>
+            <w:r>
+              <w:rPr>
+                <w:rFonts w:ascii="Consolas" w:cs="Consolas" w:eastAsia="Consolas" w:hAnsi="Consolas"/>
+                <w:color w:val="7F3F00"/>
+                <w:sz w:val="19"/>
+                <w:szCs w:val="19"/>
+              </w:rPr>
+              <w:t xml:space="preserve">excel_ai/CPAT-AI_Overview_v&lt;version&gt;.pptx</w:t>
+            </w:r>
+          </w:p>
+        </w:tc>
+        <w:tc>
+          <w:tcPr>
+            <w:tcW w:type="dxa" w:w="5938"/>
+            <w:tcBorders>
+              <w:top w:val="single" w:color="BFBFBF" w:sz="4"/>
+              <w:left w:val="single" w:color="BFBFBF" w:sz="4"/>
+              <w:bottom w:val="single" w:color="BFBFBF" w:sz="4"/>
+              <w:right w:val="single" w:color="BFBFBF" w:sz="4"/>
+            </w:tcBorders>
+            <w:tcMar>
+              <w:top w:type="dxa" w:w="50"/>
+              <w:left w:type="dxa" w:w="90"/>
+              <w:bottom w:type="dxa" w:w="50"/>
+              <w:right w:type="dxa" w:w="90"/>
+            </w:tcMar>
+          </w:tcPr>
+          <w:p>
+            <w:r>
+              <w:t xml:space="preserve">The CPAT-AI deck: status, how to use the prototype, results. The quickest overview.</w:t>
+            </w:r>
+          </w:p>
+        </w:tc>
+      </w:tr>
+      <w:tr>
+        <w:trPr>
+          <w:tblHeader w:val="false"/>
+        </w:trPr>
+        <w:tc>
+          <w:tcPr>
+            <w:tcW w:type="dxa" w:w="3700"/>
+            <w:tcBorders>
+              <w:top w:val="single" w:color="BFBFBF" w:sz="4"/>
+              <w:left w:val="single" w:color="BFBFBF" w:sz="4"/>
+              <w:bottom w:val="single" w:color="BFBFBF" w:sz="4"/>
+              <w:right w:val="single" w:color="BFBFBF" w:sz="4"/>
+            </w:tcBorders>
+            <w:tcMar>
+              <w:top w:type="dxa" w:w="50"/>
+              <w:left w:type="dxa" w:w="90"/>
+              <w:bottom w:type="dxa" w:w="50"/>
+              <w:right w:type="dxa" w:w="90"/>
+            </w:tcMar>
+          </w:tcPr>
+          <w:p>
+            <w:r>
+              <w:rPr>
+                <w:rFonts w:ascii="Consolas" w:cs="Consolas" w:eastAsia="Consolas" w:hAnsi="Consolas"/>
+                <w:color w:val="7F3F00"/>
+                <w:sz w:val="19"/>
+                <w:szCs w:val="19"/>
+              </w:rPr>
+              <w:t xml:space="preserve">other/presentations/AIClimate-FiscalTools_v2.6.pptx</w:t>
+            </w:r>
+          </w:p>
+        </w:tc>
+        <w:tc>
+          <w:tcPr>
+            <w:tcW w:type="dxa" w:w="5938"/>
+            <w:tcBorders>
+              <w:top w:val="single" w:color="BFBFBF" w:sz="4"/>
+              <w:left w:val="single" w:color="BFBFBF" w:sz="4"/>
+              <w:bottom w:val="single" w:color="BFBFBF" w:sz="4"/>
+              <w:right w:val="single" w:color="BFBFBF" w:sz="4"/>
+            </w:tcBorders>
+            <w:tcMar>
+              <w:top w:type="dxa" w:w="50"/>
+              <w:left w:type="dxa" w:w="90"/>
+              <w:bottom w:type="dxa" w:w="50"/>
+              <w:right w:type="dxa" w:w="90"/>
+            </w:tcMar>
+          </w:tcPr>
+          <w:p>
+            <w:r>
+              <w:t xml:space="preserve">The overarching deck on the team’s AI climate-fiscal tools, CPAT-AI among them.</w:t>
+            </w:r>
+          </w:p>
+        </w:tc>
+      </w:tr>
+    </w:tbl>
+    <w:p>
+      <w:pPr>
+        <w:pStyle w:val="Heading2"/>
+      </w:pPr>
+      <w:r>
+        <w:t xml:space="preserve">Computer-readable files</w:t>
+      </w:r>
+    </w:p>
+    <w:p>
+      <w:pPr>
+        <w:spacing w:after="100"/>
+      </w:pPr>
+      <w:r>
+        <w:t xml:space="preserve">Plain-text (Markdown) files that the AI and the scripts read; GitHub shows them formatted, so people can read them too.</w:t>
+      </w:r>
+    </w:p>
+    <w:tbl>
+      <w:tblPr>
+        <w:tblW w:type="dxa" w:w="9638"/>
+        <w:tblBorders>
+          <w:top w:val="single" w:color="auto" w:sz="4"/>
+          <w:left w:val="single" w:color="auto" w:sz="4"/>
+          <w:bottom w:val="single" w:color="auto" w:sz="4"/>
+          <w:right w:val="single" w:color="auto" w:sz="4"/>
+          <w:insideH w:val="single" w:color="auto" w:sz="4"/>
+          <w:insideV w:val="single" w:color="auto" w:sz="4"/>
+        </w:tblBorders>
+      </w:tblPr>
+      <w:tblGrid>
+        <w:gridCol w:w="3700"/>
+        <w:gridCol w:w="5938"/>
+      </w:tblGrid>
+      <w:tr>
+        <w:trPr>
+          <w:tblHeader/>
+        </w:trPr>
+        <w:tc>
+          <w:tcPr>
+            <w:tcW w:type="dxa" w:w="3700"/>
+            <w:tcBorders>
+              <w:top w:val="single" w:color="BFBFBF" w:sz="4"/>
+              <w:left w:val="single" w:color="BFBFBF" w:sz="4"/>
+              <w:bottom w:val="single" w:color="BFBFBF" w:sz="4"/>
+              <w:right w:val="single" w:color="BFBFBF" w:sz="4"/>
+            </w:tcBorders>
+            <w:shd w:fill="DCE6F1" w:color="auto" w:val="clear"/>
+            <w:tcMar>
+              <w:top w:type="dxa" w:w="50"/>
+              <w:left w:type="dxa" w:w="90"/>
+              <w:bottom w:type="dxa" w:w="50"/>
+              <w:right w:type="dxa" w:w="90"/>
+            </w:tcMar>
+          </w:tcPr>
+          <w:p>
+            <w:r>
+              <w:rPr>
+                <w:b/>
+                <w:bCs/>
+              </w:rPr>
+              <w:t xml:space="preserve">File</w:t>
+            </w:r>
+          </w:p>
+        </w:tc>
+        <w:tc>
+          <w:tcPr>
+            <w:tcW w:type="dxa" w:w="5938"/>
+            <w:tcBorders>
+              <w:top w:val="single" w:color="BFBFBF" w:sz="4"/>
+              <w:left w:val="single" w:color="BFBFBF" w:sz="4"/>
+              <w:bottom w:val="single" w:color="BFBFBF" w:sz="4"/>
+              <w:right w:val="single" w:color="BFBFBF" w:sz="4"/>
+            </w:tcBorders>
+            <w:shd w:fill="DCE6F1" w:color="auto" w:val="clear"/>
+            <w:tcMar>
+              <w:top w:type="dxa" w:w="50"/>
+              <w:left w:type="dxa" w:w="90"/>
+              <w:bottom w:type="dxa" w:w="50"/>
+              <w:right w:type="dxa" w:w="90"/>
+            </w:tcMar>
+          </w:tcPr>
+          <w:p>
+            <w:r>
+              <w:rPr>
+                <w:b/>
+                <w:bCs/>
+              </w:rPr>
+              <w:t xml:space="preserve">What it is for</w:t>
+            </w:r>
+          </w:p>
+        </w:tc>
+      </w:tr>
+      <w:tr>
+        <w:trPr>
+          <w:tblHeader w:val="false"/>
+        </w:trPr>
+        <w:tc>
+          <w:tcPr>
+            <w:tcW w:type="dxa" w:w="3700"/>
+            <w:tcBorders>
+              <w:top w:val="single" w:color="BFBFBF" w:sz="4"/>
+              <w:left w:val="single" w:color="BFBFBF" w:sz="4"/>
+              <w:bottom w:val="single" w:color="BFBFBF" w:sz="4"/>
+              <w:right w:val="single" w:color="BFBFBF" w:sz="4"/>
+            </w:tcBorders>
+            <w:tcMar>
+              <w:top w:type="dxa" w:w="50"/>
+              <w:left w:type="dxa" w:w="90"/>
+              <w:bottom w:type="dxa" w:w="50"/>
+              <w:right w:type="dxa" w:w="90"/>
+            </w:tcMar>
+          </w:tcPr>
+          <w:p>
+            <w:r>
+              <w:rPr>
+                <w:rFonts w:ascii="Consolas" w:cs="Consolas" w:eastAsia="Consolas" w:hAnsi="Consolas"/>
+                <w:color w:val="7F3F00"/>
+                <w:sz w:val="19"/>
+                <w:szCs w:val="19"/>
+              </w:rPr>
+              <w:t xml:space="preserve">README.md</w:t>
+            </w:r>
+            <w:r>
+              <w:t xml:space="preserve">, </w:t>
             </w:r>
             <w:r>
               <w:rPr>
@@ -206,8 +873,27 @@
               </w:rPr>
               <w:t xml:space="preserve">excel_ai/README.md</w:t>
             </w:r>
-            <w:r>
-              <w:t xml:space="preserve">.</w:t>
+          </w:p>
+        </w:tc>
+        <w:tc>
+          <w:tcPr>
+            <w:tcW w:type="dxa" w:w="5938"/>
+            <w:tcBorders>
+              <w:top w:val="single" w:color="BFBFBF" w:sz="4"/>
+              <w:left w:val="single" w:color="BFBFBF" w:sz="4"/>
+              <w:bottom w:val="single" w:color="BFBFBF" w:sz="4"/>
+              <w:right w:val="single" w:color="BFBFBF" w:sz="4"/>
+            </w:tcBorders>
+            <w:tcMar>
+              <w:top w:type="dxa" w:w="50"/>
+              <w:left w:type="dxa" w:w="90"/>
+              <w:bottom w:type="dxa" w:w="50"/>
+              <w:right w:type="dxa" w:w="90"/>
+            </w:tcMar>
+          </w:tcPr>
+          <w:p>
+            <w:r>
+              <w:t xml:space="preserve">Front page of the repo and of the Excel prototypes: who reads what, folder map. Each module folder has its own README.</w:t>
             </w:r>
           </w:p>
         </w:tc>
@@ -240,54 +926,11 @@
                 <w:sz w:val="19"/>
                 <w:szCs w:val="19"/>
               </w:rPr>
-              <w:t xml:space="preserve">README.md</w:t>
-            </w:r>
-          </w:p>
-        </w:tc>
-        <w:tc>
-          <w:tcPr>
-            <w:tcW w:type="dxa" w:w="5938"/>
-            <w:tcBorders>
-              <w:top w:val="single" w:color="BFBFBF" w:sz="4"/>
-              <w:left w:val="single" w:color="BFBFBF" w:sz="4"/>
-              <w:bottom w:val="single" w:color="BFBFBF" w:sz="4"/>
-              <w:right w:val="single" w:color="BFBFBF" w:sz="4"/>
-            </w:tcBorders>
-            <w:tcMar>
-              <w:top w:type="dxa" w:w="50"/>
-              <w:left w:type="dxa" w:w="90"/>
-              <w:bottom w:type="dxa" w:w="50"/>
-              <w:right w:type="dxa" w:w="90"/>
-            </w:tcMar>
-          </w:tcPr>
-          <w:p>
-            <w:r>
-              <w:t xml:space="preserve">Front page of the repo: who reads what, and the folder map.</w:t>
-            </w:r>
-          </w:p>
-        </w:tc>
-      </w:tr>
-      <w:tr>
-        <w:trPr>
-          <w:tblHeader w:val="false"/>
-        </w:trPr>
-        <w:tc>
-          <w:tcPr>
-            <w:tcW w:type="dxa" w:w="3700"/>
-            <w:tcBorders>
-              <w:top w:val="single" w:color="BFBFBF" w:sz="4"/>
-              <w:left w:val="single" w:color="BFBFBF" w:sz="4"/>
-              <w:bottom w:val="single" w:color="BFBFBF" w:sz="4"/>
-              <w:right w:val="single" w:color="BFBFBF" w:sz="4"/>
-            </w:tcBorders>
-            <w:tcMar>
-              <w:top w:type="dxa" w:w="50"/>
-              <w:left w:type="dxa" w:w="90"/>
-              <w:bottom w:type="dxa" w:w="50"/>
-              <w:right w:type="dxa" w:w="90"/>
-            </w:tcMar>
-          </w:tcPr>
-          <w:p>
+              <w:t xml:space="preserve">AGENTS.md</w:t>
+            </w:r>
+            <w:r>
+              <w:t xml:space="preserve"> (and </w:t>
+            </w:r>
             <w:r>
               <w:rPr>
                 <w:rFonts w:ascii="Consolas" w:cs="Consolas" w:eastAsia="Consolas" w:hAnsi="Consolas"/>
@@ -295,7 +938,10 @@
                 <w:sz w:val="19"/>
                 <w:szCs w:val="19"/>
               </w:rPr>
-              <w:t xml:space="preserve">excel_ai/README.md</w:t>
+              <w:t xml:space="preserve">CLAUDE.md</w:t>
+            </w:r>
+            <w:r>
+              <w:t xml:space="preserve">)</w:t>
             </w:r>
           </w:p>
         </w:tc>
@@ -317,7 +963,7 @@
           </w:tcPr>
           <w:p>
             <w:r>
-              <w:t xml:space="preserve">The Excel prototypes: main files and folders.</w:t>
+              <w:t xml:space="preserve">The entry point for any AI working in the repo.</w:t>
             </w:r>
           </w:p>
         </w:tc>
@@ -350,7 +996,7 @@
                 <w:sz w:val="19"/>
                 <w:szCs w:val="19"/>
               </w:rPr>
-              <w:t xml:space="preserve">excel_ai/CPAT-AI_Overview_v&lt;version&gt;.pptx</w:t>
+              <w:t xml:space="preserve">NORMS.md</w:t>
             </w:r>
           </w:p>
         </w:tc>
@@ -372,7 +1018,7 @@
           </w:tcPr>
           <w:p>
             <w:r>
-              <w:t xml:space="preserve">Slide deck: status, how to use it, results. The quickest human overview.</w:t>
+              <w:t xml:space="preserve">The rules for every task (people and AI alike).</w:t>
             </w:r>
           </w:p>
         </w:tc>
@@ -405,7 +1051,7 @@
                 <w:sz w:val="19"/>
                 <w:szCs w:val="19"/>
               </w:rPr>
-              <w:t xml:space="preserve">excel_ai/mitigation/CPAT-AI-Mitigation_Documentation.docx</w:t>
+              <w:t xml:space="preserve">CAVEATS.md</w:t>
             </w:r>
           </w:p>
         </w:tc>
@@ -427,179 +1073,7 @@
           </w:tcPr>
           <w:p>
             <w:r>
-              <w:t xml:space="preserve">Short documentation of the mitigation prototype: what it is, quick start, how it works, limits.</w:t>
-            </w:r>
-          </w:p>
-        </w:tc>
-      </w:tr>
-      <w:tr>
-        <w:trPr>
-          <w:tblHeader w:val="false"/>
-        </w:trPr>
-        <w:tc>
-          <w:tcPr>
-            <w:tcW w:type="dxa" w:w="3700"/>
-            <w:tcBorders>
-              <w:top w:val="single" w:color="BFBFBF" w:sz="4"/>
-              <w:left w:val="single" w:color="BFBFBF" w:sz="4"/>
-              <w:bottom w:val="single" w:color="BFBFBF" w:sz="4"/>
-              <w:right w:val="single" w:color="BFBFBF" w:sz="4"/>
-            </w:tcBorders>
-            <w:tcMar>
-              <w:top w:type="dxa" w:w="50"/>
-              <w:left w:type="dxa" w:w="90"/>
-              <w:bottom w:type="dxa" w:w="50"/>
-              <w:right w:type="dxa" w:w="90"/>
-            </w:tcMar>
-          </w:tcPr>
-          <w:p>
-            <w:r>
-              <w:rPr>
-                <w:rFonts w:ascii="Consolas" w:cs="Consolas" w:eastAsia="Consolas" w:hAnsi="Consolas"/>
-                <w:color w:val="7F3F00"/>
-                <w:sz w:val="19"/>
-                <w:szCs w:val="19"/>
-              </w:rPr>
-              <w:t xml:space="preserve">excel_ai/mitigation/CPAT-AI-Mitigation_Methods.docx</w:t>
-            </w:r>
-          </w:p>
-        </w:tc>
-        <w:tc>
-          <w:tcPr>
-            <w:tcW w:type="dxa" w:w="5938"/>
-            <w:tcBorders>
-              <w:top w:val="single" w:color="BFBFBF" w:sz="4"/>
-              <w:left w:val="single" w:color="BFBFBF" w:sz="4"/>
-              <w:bottom w:val="single" w:color="BFBFBF" w:sz="4"/>
-              <w:right w:val="single" w:color="BFBFBF" w:sz="4"/>
-            </w:tcBorders>
-            <w:tcMar>
-              <w:top w:type="dxa" w:w="50"/>
-              <w:left w:type="dxa" w:w="90"/>
-              <w:bottom w:type="dxa" w:w="50"/>
-              <w:right w:type="dxa" w:w="90"/>
-            </w:tcMar>
-          </w:tcPr>
-          <w:p>
-            <w:r>
-              <w:t xml:space="preserve">Methods volume: one chapter per block, with equations.</w:t>
-            </w:r>
-          </w:p>
-        </w:tc>
-      </w:tr>
-      <w:tr>
-        <w:trPr>
-          <w:tblHeader w:val="false"/>
-        </w:trPr>
-        <w:tc>
-          <w:tcPr>
-            <w:tcW w:type="dxa" w:w="3700"/>
-            <w:tcBorders>
-              <w:top w:val="single" w:color="BFBFBF" w:sz="4"/>
-              <w:left w:val="single" w:color="BFBFBF" w:sz="4"/>
-              <w:bottom w:val="single" w:color="BFBFBF" w:sz="4"/>
-              <w:right w:val="single" w:color="BFBFBF" w:sz="4"/>
-            </w:tcBorders>
-            <w:tcMar>
-              <w:top w:type="dxa" w:w="50"/>
-              <w:left w:type="dxa" w:w="90"/>
-              <w:bottom w:type="dxa" w:w="50"/>
-              <w:right w:type="dxa" w:w="90"/>
-            </w:tcMar>
-          </w:tcPr>
-          <w:p>
-            <w:r>
-              <w:rPr>
-                <w:rFonts w:ascii="Consolas" w:cs="Consolas" w:eastAsia="Consolas" w:hAnsi="Consolas"/>
-                <w:color w:val="7F3F00"/>
-                <w:sz w:val="19"/>
-                <w:szCs w:val="19"/>
-              </w:rPr>
-              <w:t xml:space="preserve">excel_ai/Tracking_Legacy_Bugs_v&lt;version&gt;.xlsx</w:t>
-            </w:r>
-          </w:p>
-        </w:tc>
-        <w:tc>
-          <w:tcPr>
-            <w:tcW w:type="dxa" w:w="5938"/>
-            <w:tcBorders>
-              <w:top w:val="single" w:color="BFBFBF" w:sz="4"/>
-              <w:left w:val="single" w:color="BFBFBF" w:sz="4"/>
-              <w:bottom w:val="single" w:color="BFBFBF" w:sz="4"/>
-              <w:right w:val="single" w:color="BFBFBF" w:sz="4"/>
-            </w:tcBorders>
-            <w:tcMar>
-              <w:top w:type="dxa" w:w="50"/>
-              <w:left w:type="dxa" w:w="90"/>
-              <w:bottom w:type="dxa" w:w="50"/>
-              <w:right w:type="dxa" w:w="90"/>
-            </w:tcMar>
-          </w:tcPr>
-          <w:p>
-            <w:r>
-              <w:rPr>
-                <w:b/>
-                <w:bCs/>
-              </w:rPr>
-              <w:t xml:space="preserve">The master list of bugs and issues</w:t>
-            </w:r>
-            <w:r>
-              <w:t xml:space="preserve">, every module, with the CPAT team’s own tabs.</w:t>
-            </w:r>
-          </w:p>
-        </w:tc>
-      </w:tr>
-      <w:tr>
-        <w:trPr>
-          <w:tblHeader w:val="false"/>
-        </w:trPr>
-        <w:tc>
-          <w:tcPr>
-            <w:tcW w:type="dxa" w:w="3700"/>
-            <w:tcBorders>
-              <w:top w:val="single" w:color="BFBFBF" w:sz="4"/>
-              <w:left w:val="single" w:color="BFBFBF" w:sz="4"/>
-              <w:bottom w:val="single" w:color="BFBFBF" w:sz="4"/>
-              <w:right w:val="single" w:color="BFBFBF" w:sz="4"/>
-            </w:tcBorders>
-            <w:tcMar>
-              <w:top w:type="dxa" w:w="50"/>
-              <w:left w:type="dxa" w:w="90"/>
-              <w:bottom w:type="dxa" w:w="50"/>
-              <w:right w:type="dxa" w:w="90"/>
-            </w:tcMar>
-          </w:tcPr>
-          <w:p>
-            <w:r>
-              <w:rPr>
-                <w:rFonts w:ascii="Consolas" w:cs="Consolas" w:eastAsia="Consolas" w:hAnsi="Consolas"/>
-                <w:color w:val="7F3F00"/>
-                <w:sz w:val="19"/>
-                <w:szCs w:val="19"/>
-              </w:rPr>
-              <w:t xml:space="preserve">excel_ai/Legacy_CPAT_Bugs_v&lt;version&gt;.docx</w:t>
-            </w:r>
-          </w:p>
-        </w:tc>
-        <w:tc>
-          <w:tcPr>
-            <w:tcW w:type="dxa" w:w="5938"/>
-            <w:tcBorders>
-              <w:top w:val="single" w:color="BFBFBF" w:sz="4"/>
-              <w:left w:val="single" w:color="BFBFBF" w:sz="4"/>
-              <w:bottom w:val="single" w:color="BFBFBF" w:sz="4"/>
-              <w:right w:val="single" w:color="BFBFBF" w:sz="4"/>
-            </w:tcBorders>
-            <w:tcMar>
-              <w:top w:type="dxa" w:w="50"/>
-              <w:left w:type="dxa" w:w="90"/>
-              <w:bottom w:type="dxa" w:w="50"/>
-              <w:right w:type="dxa" w:w="90"/>
-            </w:tcMar>
-          </w:tcPr>
-          <w:p>
-            <w:r>
-              <w:t xml:space="preserve">Every legacy bug found, with its cell-level fix plan for legacy CPAT.</w:t>
+              <w:t xml:space="preserve">Log of every finished task and its caveats (newest at the bottom).</w:t>
             </w:r>
           </w:p>
         </w:tc>
@@ -699,226 +1173,6 @@
                 <w:sz w:val="19"/>
                 <w:szCs w:val="19"/>
               </w:rPr>
-              <w:t xml:space="preserve">excel_ai/CPAT-AI_CodesMap_v&lt;version&gt;.xlsx</w:t>
-            </w:r>
-          </w:p>
-        </w:tc>
-        <w:tc>
-          <w:tcPr>
-            <w:tcW w:type="dxa" w:w="5938"/>
-            <w:tcBorders>
-              <w:top w:val="single" w:color="BFBFBF" w:sz="4"/>
-              <w:left w:val="single" w:color="BFBFBF" w:sz="4"/>
-              <w:bottom w:val="single" w:color="BFBFBF" w:sz="4"/>
-              <w:right w:val="single" w:color="BFBFBF" w:sz="4"/>
-            </w:tcBorders>
-            <w:tcMar>
-              <w:top w:type="dxa" w:w="50"/>
-              <w:left w:type="dxa" w:w="90"/>
-              <w:bottom w:type="dxa" w:w="50"/>
-              <w:right w:type="dxa" w:w="90"/>
-            </w:tcMar>
-          </w:tcPr>
-          <w:p>
-            <w:r>
-              <w:t xml:space="preserve">Codes, variables and every input (legacy row, name, Python key).</w:t>
-            </w:r>
-          </w:p>
-        </w:tc>
-      </w:tr>
-      <w:tr>
-        <w:trPr>
-          <w:tblHeader w:val="false"/>
-        </w:trPr>
-        <w:tc>
-          <w:tcPr>
-            <w:tcW w:type="dxa" w:w="3700"/>
-            <w:tcBorders>
-              <w:top w:val="single" w:color="BFBFBF" w:sz="4"/>
-              <w:left w:val="single" w:color="BFBFBF" w:sz="4"/>
-              <w:bottom w:val="single" w:color="BFBFBF" w:sz="4"/>
-              <w:right w:val="single" w:color="BFBFBF" w:sz="4"/>
-            </w:tcBorders>
-            <w:tcMar>
-              <w:top w:type="dxa" w:w="50"/>
-              <w:left w:type="dxa" w:w="90"/>
-              <w:bottom w:type="dxa" w:w="50"/>
-              <w:right w:type="dxa" w:w="90"/>
-            </w:tcMar>
-          </w:tcPr>
-          <w:p>
-            <w:r>
-              <w:rPr>
-                <w:rFonts w:ascii="Consolas" w:cs="Consolas" w:eastAsia="Consolas" w:hAnsi="Consolas"/>
-                <w:color w:val="7F3F00"/>
-                <w:sz w:val="19"/>
-                <w:szCs w:val="19"/>
-              </w:rPr>
-              <w:t xml:space="preserve">NORMS.md</w:t>
-            </w:r>
-          </w:p>
-        </w:tc>
-        <w:tc>
-          <w:tcPr>
-            <w:tcW w:type="dxa" w:w="5938"/>
-            <w:tcBorders>
-              <w:top w:val="single" w:color="BFBFBF" w:sz="4"/>
-              <w:left w:val="single" w:color="BFBFBF" w:sz="4"/>
-              <w:bottom w:val="single" w:color="BFBFBF" w:sz="4"/>
-              <w:right w:val="single" w:color="BFBFBF" w:sz="4"/>
-            </w:tcBorders>
-            <w:tcMar>
-              <w:top w:type="dxa" w:w="50"/>
-              <w:left w:type="dxa" w:w="90"/>
-              <w:bottom w:type="dxa" w:w="50"/>
-              <w:right w:type="dxa" w:w="90"/>
-            </w:tcMar>
-          </w:tcPr>
-          <w:p>
-            <w:r>
-              <w:t xml:space="preserve">The rules for every task (people and AI alike).</w:t>
-            </w:r>
-          </w:p>
-        </w:tc>
-      </w:tr>
-      <w:tr>
-        <w:trPr>
-          <w:tblHeader w:val="false"/>
-        </w:trPr>
-        <w:tc>
-          <w:tcPr>
-            <w:tcW w:type="dxa" w:w="3700"/>
-            <w:tcBorders>
-              <w:top w:val="single" w:color="BFBFBF" w:sz="4"/>
-              <w:left w:val="single" w:color="BFBFBF" w:sz="4"/>
-              <w:bottom w:val="single" w:color="BFBFBF" w:sz="4"/>
-              <w:right w:val="single" w:color="BFBFBF" w:sz="4"/>
-            </w:tcBorders>
-            <w:tcMar>
-              <w:top w:type="dxa" w:w="50"/>
-              <w:left w:type="dxa" w:w="90"/>
-              <w:bottom w:type="dxa" w:w="50"/>
-              <w:right w:type="dxa" w:w="90"/>
-            </w:tcMar>
-          </w:tcPr>
-          <w:p>
-            <w:r>
-              <w:rPr>
-                <w:rFonts w:ascii="Consolas" w:cs="Consolas" w:eastAsia="Consolas" w:hAnsi="Consolas"/>
-                <w:color w:val="7F3F00"/>
-                <w:sz w:val="19"/>
-                <w:szCs w:val="19"/>
-              </w:rPr>
-              <w:t xml:space="preserve">AGENTS.md</w:t>
-            </w:r>
-          </w:p>
-        </w:tc>
-        <w:tc>
-          <w:tcPr>
-            <w:tcW w:type="dxa" w:w="5938"/>
-            <w:tcBorders>
-              <w:top w:val="single" w:color="BFBFBF" w:sz="4"/>
-              <w:left w:val="single" w:color="BFBFBF" w:sz="4"/>
-              <w:bottom w:val="single" w:color="BFBFBF" w:sz="4"/>
-              <w:right w:val="single" w:color="BFBFBF" w:sz="4"/>
-            </w:tcBorders>
-            <w:tcMar>
-              <w:top w:type="dxa" w:w="50"/>
-              <w:left w:type="dxa" w:w="90"/>
-              <w:bottom w:type="dxa" w:w="50"/>
-              <w:right w:type="dxa" w:w="90"/>
-            </w:tcMar>
-          </w:tcPr>
-          <w:p>
-            <w:r>
-              <w:t xml:space="preserve">The entry point for any AI working in the repo.</w:t>
-            </w:r>
-          </w:p>
-        </w:tc>
-      </w:tr>
-      <w:tr>
-        <w:trPr>
-          <w:tblHeader w:val="false"/>
-        </w:trPr>
-        <w:tc>
-          <w:tcPr>
-            <w:tcW w:type="dxa" w:w="3700"/>
-            <w:tcBorders>
-              <w:top w:val="single" w:color="BFBFBF" w:sz="4"/>
-              <w:left w:val="single" w:color="BFBFBF" w:sz="4"/>
-              <w:bottom w:val="single" w:color="BFBFBF" w:sz="4"/>
-              <w:right w:val="single" w:color="BFBFBF" w:sz="4"/>
-            </w:tcBorders>
-            <w:tcMar>
-              <w:top w:type="dxa" w:w="50"/>
-              <w:left w:type="dxa" w:w="90"/>
-              <w:bottom w:type="dxa" w:w="50"/>
-              <w:right w:type="dxa" w:w="90"/>
-            </w:tcMar>
-          </w:tcPr>
-          <w:p>
-            <w:r>
-              <w:rPr>
-                <w:rFonts w:ascii="Consolas" w:cs="Consolas" w:eastAsia="Consolas" w:hAnsi="Consolas"/>
-                <w:color w:val="7F3F00"/>
-                <w:sz w:val="19"/>
-                <w:szCs w:val="19"/>
-              </w:rPr>
-              <w:t xml:space="preserve">CAVEATS.md</w:t>
-            </w:r>
-          </w:p>
-        </w:tc>
-        <w:tc>
-          <w:tcPr>
-            <w:tcW w:type="dxa" w:w="5938"/>
-            <w:tcBorders>
-              <w:top w:val="single" w:color="BFBFBF" w:sz="4"/>
-              <w:left w:val="single" w:color="BFBFBF" w:sz="4"/>
-              <w:bottom w:val="single" w:color="BFBFBF" w:sz="4"/>
-              <w:right w:val="single" w:color="BFBFBF" w:sz="4"/>
-            </w:tcBorders>
-            <w:tcMar>
-              <w:top w:type="dxa" w:w="50"/>
-              <w:left w:type="dxa" w:w="90"/>
-              <w:bottom w:type="dxa" w:w="50"/>
-              <w:right w:type="dxa" w:w="90"/>
-            </w:tcMar>
-          </w:tcPr>
-          <w:p>
-            <w:r>
-              <w:t xml:space="preserve">Log of every finished task and its caveats (newest at the bottom).</w:t>
-            </w:r>
-          </w:p>
-        </w:tc>
-      </w:tr>
-      <w:tr>
-        <w:trPr>
-          <w:tblHeader w:val="false"/>
-        </w:trPr>
-        <w:tc>
-          <w:tcPr>
-            <w:tcW w:type="dxa" w:w="3700"/>
-            <w:tcBorders>
-              <w:top w:val="single" w:color="BFBFBF" w:sz="4"/>
-              <w:left w:val="single" w:color="BFBFBF" w:sz="4"/>
-              <w:bottom w:val="single" w:color="BFBFBF" w:sz="4"/>
-              <w:right w:val="single" w:color="BFBFBF" w:sz="4"/>
-            </w:tcBorders>
-            <w:tcMar>
-              <w:top w:type="dxa" w:w="50"/>
-              <w:left w:type="dxa" w:w="90"/>
-              <w:bottom w:type="dxa" w:w="50"/>
-              <w:right w:type="dxa" w:w="90"/>
-            </w:tcMar>
-          </w:tcPr>
-          <w:p>
-            <w:r>
-              <w:rPr>
-                <w:rFonts w:ascii="Consolas" w:cs="Consolas" w:eastAsia="Consolas" w:hAnsi="Consolas"/>
-                <w:color w:val="7F3F00"/>
-                <w:sz w:val="19"/>
-                <w:szCs w:val="19"/>
-              </w:rPr>
               <w:t xml:space="preserve">excel_ai/plans/TODO.md</w:t>
             </w:r>
           </w:p>
@@ -1002,93 +1256,6 @@
         </w:tc>
       </w:tr>
     </w:tbl>
-    <w:p>
-      <w:pPr>
-        <w:spacing w:after="100" w:before="120"/>
-      </w:pPr>
-      <w:r>
-        <w:rPr>
-          <w:b/>
-          <w:bCs/>
-        </w:rPr>
-        <w:t xml:space="preserve">Human-readable files</w:t>
-      </w:r>
-      <w:r>
-        <w:t xml:space="preserve"> are the </w:t>
-      </w:r>
-      <w:r>
-        <w:rPr>
-          <w:rFonts w:ascii="Consolas" w:cs="Consolas" w:eastAsia="Consolas" w:hAnsi="Consolas"/>
-          <w:color w:val="7F3F00"/>
-          <w:sz w:val="19"/>
-          <w:szCs w:val="19"/>
-        </w:rPr>
-        <w:t xml:space="preserve">.docx</w:t>
-      </w:r>
-      <w:r>
-        <w:t xml:space="preserve">, </w:t>
-      </w:r>
-      <w:r>
-        <w:rPr>
-          <w:rFonts w:ascii="Consolas" w:cs="Consolas" w:eastAsia="Consolas" w:hAnsi="Consolas"/>
-          <w:color w:val="7F3F00"/>
-          <w:sz w:val="19"/>
-          <w:szCs w:val="19"/>
-        </w:rPr>
-        <w:t xml:space="preserve">.pptx</w:t>
-      </w:r>
-      <w:r>
-        <w:t xml:space="preserve"> and </w:t>
-      </w:r>
-      <w:r>
-        <w:rPr>
-          <w:rFonts w:ascii="Consolas" w:cs="Consolas" w:eastAsia="Consolas" w:hAnsi="Consolas"/>
-          <w:color w:val="7F3F00"/>
-          <w:sz w:val="19"/>
-          <w:szCs w:val="19"/>
-        </w:rPr>
-        <w:t xml:space="preserve">.xlsx</w:t>
-      </w:r>
-      <w:r>
-        <w:t xml:space="preserve"> files at the top of </w:t>
-      </w:r>
-      <w:r>
-        <w:rPr>
-          <w:rFonts w:ascii="Consolas" w:cs="Consolas" w:eastAsia="Consolas" w:hAnsi="Consolas"/>
-          <w:color w:val="7F3F00"/>
-          <w:sz w:val="19"/>
-          <w:szCs w:val="19"/>
-        </w:rPr>
-        <w:t xml:space="preserve">excel_ai/</w:t>
-      </w:r>
-      <w:r>
-        <w:t xml:space="preserve"> and in </w:t>
-      </w:r>
-      <w:r>
-        <w:rPr>
-          <w:rFonts w:ascii="Consolas" w:cs="Consolas" w:eastAsia="Consolas" w:hAnsi="Consolas"/>
-          <w:color w:val="7F3F00"/>
-          <w:sz w:val="19"/>
-          <w:szCs w:val="19"/>
-        </w:rPr>
-        <w:t xml:space="preserve">excel_ai/mitigation/</w:t>
-      </w:r>
-      <w:r>
-        <w:t xml:space="preserve">, plus the </w:t>
-      </w:r>
-      <w:r>
-        <w:rPr>
-          <w:rFonts w:ascii="Consolas" w:cs="Consolas" w:eastAsia="Consolas" w:hAnsi="Consolas"/>
-          <w:color w:val="7F3F00"/>
-          <w:sz w:val="19"/>
-          <w:szCs w:val="19"/>
-        </w:rPr>
-        <w:t xml:space="preserve">.md</w:t>
-      </w:r>
-      <w:r>
-        <w:t xml:space="preserve"> files (which GitHub shows formatted). Everything else is mostly code.</w:t>
-      </w:r>
-    </w:p>
     <w:p>
       <w:pPr>
         <w:pStyle w:val="Heading1"/>
@@ -1416,7 +1583,7 @@
                 <w:b/>
                 <w:bCs/>
               </w:rPr>
-              <w:t xml:space="preserve">File (in `excel_ai/`)</w:t>
+              <w:t xml:space="preserve">File (in excel_ai/)</w:t>
             </w:r>
           </w:p>
         </w:tc>
@@ -4806,7 +4973,7 @@
       <w:r>
         <w:t xml:space="preserve"> and find your folder: WB followed by your PID). Download </w:t>
       </w:r>
-      <w:hyperlink w:history="1" r:id="rIdxjhqssjcs7cpwydyodsjf">
+      <w:hyperlink w:history="1" r:id="rId8wt7jz_v2z4wi516zk5cn">
         <w:r>
           <w:rPr>
             <w:rStyle w:val="Hyperlink"/>

</xml_diff>

<commit_message>
Release v9.0: mitigation prototype v9.0 and Distribution v1.3 (quick check, paste test, distribution check PASS); register book, tracker, codes map, deck v9.0; documentation; quick start counts; v8.5 files to releases/
Co-Authored-By: Claude Opus 5.5 <noreply@anthropic.com>
Claude-Session: https://claude.ai/code/session_01VSHkeKwNkWs41Crw9ahfLc
</commit_message>
<xml_diff>
--- a/HumanReadme-QuickStart.docx
+++ b/HumanReadme-QuickStart.docx
@@ -15,20 +15,17 @@
         <w:spacing w:after="200"/>
       </w:pPr>
       <w:r>
-        <w:t xml:space="preserve">A short, human-readable orientation to the </w:t>
-      </w:r>
-      <w:r>
-        <w:rPr>
-          <w:rFonts w:ascii="Consolas" w:cs="Consolas" w:eastAsia="Consolas" w:hAnsi="Consolas"/>
-          <w:color w:val="7F3F00"/>
-          <w:sz w:val="19"/>
-          <w:szCs w:val="19"/>
-        </w:rPr>
-        <w:t xml:space="preserve">cpat_ai</w:t>
-      </w:r>
-      <w:r>
-        <w:t xml:space="preserve"> repository, mostly about the Excel prototype. Written 2026-10-29 for prototype v8.5. The detail lives in the documents listed in section 1; this guide only points to them.</w:t>
-      </w:r>
+        <w:t>A short, human-readable orientation to the cpat_ai repository, mostly about the Excel prototype. Written 2026-10-29 for prototype v8.5, updated for v9.0. The detail lives in the documents listed in section 1; this guide only points to them.</w:t>
+      </w:r>
+      <w:r>
+        <w:rPr>
+          <w:rFonts w:ascii="Consolas" w:cs="Consolas" w:eastAsia="Consolas" w:hAnsi="Consolas"/>
+          <w:color w:val="7F3F00"/>
+          <w:sz w:val="19"/>
+          <w:szCs w:val="19"/>
+        </w:rPr>
+      </w:r>
+      <w:r/>
     </w:p>
     <w:p>
       <w:pPr>
@@ -43,32 +40,26 @@
         <w:spacing w:after="100"/>
       </w:pPr>
       <w:r>
-        <w:t xml:space="preserve">Paths are relative to the repository root. Files named </w:t>
-      </w:r>
-      <w:r>
-        <w:rPr>
-          <w:rFonts w:ascii="Consolas" w:cs="Consolas" w:eastAsia="Consolas" w:hAnsi="Consolas"/>
-          <w:color w:val="7F3F00"/>
-          <w:sz w:val="19"/>
-          <w:szCs w:val="19"/>
-        </w:rPr>
-        <w:t xml:space="preserve">_v&lt;version&gt;</w:t>
-      </w:r>
-      <w:r>
-        <w:t xml:space="preserve"> carry the current version (today v8.5); older versions are in </w:t>
-      </w:r>
-      <w:r>
-        <w:rPr>
-          <w:rFonts w:ascii="Consolas" w:cs="Consolas" w:eastAsia="Consolas" w:hAnsi="Consolas"/>
-          <w:color w:val="7F3F00"/>
-          <w:sz w:val="19"/>
-          <w:szCs w:val="19"/>
-        </w:rPr>
-        <w:t xml:space="preserve">excel_ai/releases/</w:t>
-      </w:r>
-      <w:r>
-        <w:t xml:space="preserve">.</w:t>
-      </w:r>
+        <w:t>Paths are relative to the repository root. Files named _v&lt;version&gt; carry the current version (today v9.0); older versions are in excel_ai/releases/.</w:t>
+      </w:r>
+      <w:r>
+        <w:rPr>
+          <w:rFonts w:ascii="Consolas" w:cs="Consolas" w:eastAsia="Consolas" w:hAnsi="Consolas"/>
+          <w:color w:val="7F3F00"/>
+          <w:sz w:val="19"/>
+          <w:szCs w:val="19"/>
+        </w:rPr>
+      </w:r>
+      <w:r/>
+      <w:r>
+        <w:rPr>
+          <w:rFonts w:ascii="Consolas" w:cs="Consolas" w:eastAsia="Consolas" w:hAnsi="Consolas"/>
+          <w:color w:val="7F3F00"/>
+          <w:sz w:val="19"/>
+          <w:szCs w:val="19"/>
+        </w:rPr>
+      </w:r>
+      <w:r/>
     </w:p>
     <w:p>
       <w:pPr>
@@ -3131,7 +3122,7 @@
         <w:pStyle w:val="Heading2"/>
       </w:pPr>
       <w:r>
-        <w:t xml:space="preserve">Where things stand (v8.5)</w:t>
+        <w:t>Where things stand (v9.0)</w:t>
       </w:r>
     </w:p>
     <w:tbl>
@@ -3231,7 +3222,7 @@
           </w:tcPr>
           <w:p>
             <w:r>
-              <w:t xml:space="preserve">168 legacy bugs (L)</w:t>
+              <w:t>222 legacy bugs (L)</w:t>
             </w:r>
           </w:p>
         </w:tc>
@@ -3253,18 +3244,15 @@
           </w:tcPr>
           <w:p>
             <w:r>
-              <w:t xml:space="preserve">All fixed in the prototype. In legacy 465 (CPAT team): 52 fixed, 8 fixed with caveats, 2 marked fixed but not fixed, </w:t>
+              <w:t>Fixed in the prototype, except 26 in parts not built (R4, R5, R12 deferred and a few display rows). In legacy 465 (CPAT team): 52 fixed, 9 fixed with caveats, 2 marked fixed but not fixed, 159 outstanding.</w:t>
             </w:r>
             <w:r>
               <w:rPr>
                 <w:b/>
                 <w:bCs/>
               </w:rPr>
-              <w:t xml:space="preserve">106 outstanding</w:t>
-            </w:r>
-            <w:r>
-              <w:t xml:space="preserve">.</w:t>
-            </w:r>
+            </w:r>
+            <w:r/>
           </w:p>
         </w:tc>
       </w:tr>
@@ -3339,7 +3327,7 @@
           </w:tcPr>
           <w:p>
             <w:r>
-              <w:t xml:space="preserve">82 issues (I), 12 of them data problems</w:t>
+              <w:t>134 issues (I), 14 of them data problems</w:t>
             </w:r>
           </w:p>
         </w:tc>
@@ -3361,7 +3349,7 @@
           </w:tcPr>
           <w:p>
             <w:r>
-              <w:t xml:space="preserve">53 accepted, 18 resolved, 5 dropped, 6 open (plus the open data problems).</w:t>
+              <w:t>90 accepted, 18 resolved, 4 closed, 4 dropped, 18 open (including the open data problems).</w:t>
             </w:r>
           </w:p>
         </w:tc>
@@ -3388,7 +3376,7 @@
           </w:tcPr>
           <w:p>
             <w:r>
-              <w:t xml:space="preserve">40 departures (LD), 9 upgrades (U)</w:t>
+              <w:t>35 departures (LD), 9 upgrades (U)</w:t>
             </w:r>
           </w:p>
         </w:tc>
@@ -3498,11 +3486,9 @@
           <w:b/>
           <w:bCs/>
         </w:rPr>
-        <w:t xml:space="preserve">I99:</w:t>
-      </w:r>
-      <w:r>
-        <w:t xml:space="preserve"> the prototype keeps corrected Egypt electricity prices (user decision); they go to the CPAT data team.</w:t>
-      </w:r>
+        <w:t>I148 (Extremely high): the current-account data are typed for Egypt only (other countries need the WEO data).</w:t>
+      </w:r>
+      <w:r/>
     </w:p>
     <w:p>
       <w:pPr>
@@ -3518,11 +3504,9 @@
           <w:b/>
           <w:bCs/>
         </w:rPr>
-        <w:t xml:space="preserve">I1:</w:t>
-      </w:r>
-      <w:r>
-        <w:t xml:space="preserve"> the prototype has not yet had a full run in Excel 365 by the team (it is built and checked in LibreOffice).</w:t>
-      </w:r>
+        <w:t>R4 CBAM process emissions, R5 green public investment and R12 industrial emissions intensity are deferred (legacy work in progress; design notes on branch wip-r4-r5-r12). I1: the prototype has not yet had a full run in Excel 365 by the team (it is built and checked in LibreOffice).</w:t>
+      </w:r>
+      <w:r/>
     </w:p>
     <w:p>
       <w:pPr>
@@ -3647,47 +3631,36 @@
           <w:b/>
           <w:bCs/>
         </w:rPr>
-        <w:t xml:space="preserve">Versions</w:t>
-      </w:r>
-      <w:r>
-        <w:t xml:space="preserve"> (section 5): never edit a released workbook; build the next version. Main files are </w:t>
-      </w:r>
-      <w:r>
-        <w:rPr>
-          <w:rFonts w:ascii="Consolas" w:cs="Consolas" w:eastAsia="Consolas" w:hAnsi="Consolas"/>
-          <w:color w:val="7F3F00"/>
-          <w:sz w:val="19"/>
-          <w:szCs w:val="19"/>
-        </w:rPr>
-        <w:t xml:space="preserve">&lt;Name&gt;_v&lt;version&gt;</w:t>
-      </w:r>
-      <w:r>
-        <w:t xml:space="preserve">, e.g. </w:t>
-      </w:r>
-      <w:r>
-        <w:rPr>
-          <w:rFonts w:ascii="Consolas" w:cs="Consolas" w:eastAsia="Consolas" w:hAnsi="Consolas"/>
-          <w:color w:val="7F3F00"/>
-          <w:sz w:val="19"/>
-          <w:szCs w:val="19"/>
-        </w:rPr>
-        <w:t xml:space="preserve">CPAT-AI-Mitigation-Prototype_v8.5.xlsm</w:t>
-      </w:r>
-      <w:r>
-        <w:t xml:space="preserve">; older ones go to </w:t>
-      </w:r>
-      <w:r>
-        <w:rPr>
-          <w:rFonts w:ascii="Consolas" w:cs="Consolas" w:eastAsia="Consolas" w:hAnsi="Consolas"/>
-          <w:color w:val="7F3F00"/>
-          <w:sz w:val="19"/>
-          <w:szCs w:val="19"/>
-        </w:rPr>
-        <w:t xml:space="preserve">releases/</w:t>
-      </w:r>
-      <w:r>
-        <w:t xml:space="preserve">.</w:t>
-      </w:r>
+        <w:t>Versions (section 5): never edit a released workbook; build the next version. Main files are &lt;Name&gt;_v&lt;version&gt;, e.g. CPAT-AI-Mitigation-Prototype_v9.0.xlsm; older ones go to releases/.</w:t>
+      </w:r>
+      <w:r/>
+      <w:r>
+        <w:rPr>
+          <w:rFonts w:ascii="Consolas" w:cs="Consolas" w:eastAsia="Consolas" w:hAnsi="Consolas"/>
+          <w:color w:val="7F3F00"/>
+          <w:sz w:val="19"/>
+          <w:szCs w:val="19"/>
+        </w:rPr>
+      </w:r>
+      <w:r/>
+      <w:r>
+        <w:rPr>
+          <w:rFonts w:ascii="Consolas" w:cs="Consolas" w:eastAsia="Consolas" w:hAnsi="Consolas"/>
+          <w:color w:val="7F3F00"/>
+          <w:sz w:val="19"/>
+          <w:szCs w:val="19"/>
+        </w:rPr>
+      </w:r>
+      <w:r/>
+      <w:r>
+        <w:rPr>
+          <w:rFonts w:ascii="Consolas" w:cs="Consolas" w:eastAsia="Consolas" w:hAnsi="Consolas"/>
+          <w:color w:val="7F3F00"/>
+          <w:sz w:val="19"/>
+          <w:szCs w:val="19"/>
+        </w:rPr>
+      </w:r>
+      <w:r/>
     </w:p>
     <w:p>
       <w:pPr>
@@ -4042,20 +4015,17 @@
         <w:spacing w:after="40"/>
       </w:pPr>
       <w:r>
-        <w:t xml:space="preserve">“What changed between v8.4 and v8.5?” (it reads </w:t>
-      </w:r>
-      <w:r>
-        <w:rPr>
-          <w:rFonts w:ascii="Consolas" w:cs="Consolas" w:eastAsia="Consolas" w:hAnsi="Consolas"/>
-          <w:color w:val="7F3F00"/>
-          <w:sz w:val="19"/>
-          <w:szCs w:val="19"/>
-        </w:rPr>
-        <w:t xml:space="preserve">CAVEATS.md</w:t>
-      </w:r>
-      <w:r>
-        <w:t xml:space="preserve"> and the version log)</w:t>
-      </w:r>
+        <w:t>“What changed between v8.5 and v9.0?” (it reads CAVEATS.md and the version log)</w:t>
+      </w:r>
+      <w:r>
+        <w:rPr>
+          <w:rFonts w:ascii="Consolas" w:cs="Consolas" w:eastAsia="Consolas" w:hAnsi="Consolas"/>
+          <w:color w:val="7F3F00"/>
+          <w:sz w:val="19"/>
+          <w:szCs w:val="19"/>
+        </w:rPr>
+      </w:r>
+      <w:r/>
     </w:p>
     <w:p>
       <w:pPr>

</xml_diff>

<commit_message>
Versions rebased to three parts: Mitigation X.Y -> 0.X.Y (9.0 -> 0.9.0), Distribution 1.Y -> 0.1.Y (1.3 -> 0.1.3)
User decision 2026-10-29 ("Everything"): released files renamed (contents keep the old numbers), deck image
prefix v0_9_0_, VERSION and version logs, version parsers (check_quick, check_full) for three-part versions,
comments, records, plans, register texts and the quick start guide rebased; NORMS 5a rule; BUGS/ISSUES regenerated.

Co-Authored-By: Claude Opus 5.5 <noreply@anthropic.com>
Claude-Session: https://claude.ai/code/session_01VSHkeKwNkWs41Crw9ahfLc
</commit_message>
<xml_diff>
--- a/HumanReadme-QuickStart.docx
+++ b/HumanReadme-QuickStart.docx
@@ -15,7 +15,7 @@
         <w:spacing w:after="200"/>
       </w:pPr>
       <w:r>
-        <w:t>A short, human-readable orientation to the cpat_ai repository, mostly about the Excel prototype. Written 2026-10-29 for prototype v8.5, updated for v9.0. The detail lives in the documents listed in section 1; this guide only points to them.</w:t>
+        <w:t>A short, human-readable orientation to the cpat_ai repository, mostly about the Excel prototype. Written 2026-10-29 for prototype v0.8.5, updated for v0.9.0. The detail lives in the documents listed in section 1; this guide only points to them.</w:t>
       </w:r>
       <w:r>
         <w:rPr>
@@ -40,7 +40,7 @@
         <w:spacing w:after="100"/>
       </w:pPr>
       <w:r>
-        <w:t>Paths are relative to the repository root. Files named _v&lt;version&gt; carry the current version (today v9.0); older versions are in excel_ai/releases/.</w:t>
+        <w:t>Paths are relative to the repository root. Files named _v&lt;version&gt; carry the current version (today v0.9.0); older versions are in excel_ai/releases/.</w:t>
       </w:r>
       <w:r>
         <w:rPr>
@@ -3122,7 +3122,7 @@
         <w:pStyle w:val="Heading2"/>
       </w:pPr>
       <w:r>
-        <w:t>Where things stand (v9.0)</w:t>
+        <w:t>Where things stand (v0.9.0)</w:t>
       </w:r>
     </w:p>
     <w:tbl>
@@ -3631,7 +3631,7 @@
           <w:b/>
           <w:bCs/>
         </w:rPr>
-        <w:t>Versions (section 5): never edit a released workbook; build the next version. Main files are &lt;Name&gt;_v&lt;version&gt;, e.g. CPAT-AI-Mitigation-Prototype_v9.0.xlsm; older ones go to releases/.</w:t>
+        <w:t>Versions (section 5): never edit a released workbook; build the next version. Main files are &lt;Name&gt;_v&lt;version&gt;, e.g. CPAT-AI-Mitigation-Prototype_v0.9.0.xlsm; older ones go to releases/.</w:t>
       </w:r>
       <w:r/>
       <w:r>
@@ -4015,7 +4015,7 @@
         <w:spacing w:after="40"/>
       </w:pPr>
       <w:r>
-        <w:t>“What changed between v8.5 and v9.0?” (it reads CAVEATS.md and the version log)</w:t>
+        <w:t>“What changed between v0.8.5 and v0.9.0?” (it reads CAVEATS.md and the version log)</w:t>
       </w:r>
       <w:r>
         <w:rPr>
@@ -7765,6 +7765,8 @@
       </w:r>
     </w:p>
     <w:sectPr>
+      <w:headerReference w:type="default" r:id="rId15"/>
+      <w:footerReference w:type="default" r:id="rId17"/>
       <w:pgSz w:w="11906" w:h="16838" w:orient="portrait"/>
       <w:pgMar w:top="1134" w:right="1134" w:bottom="1134" w:left="1134" w:header="708" w:footer="708" w:gutter="0"/>
       <w:pgNumType/>
@@ -7815,6 +7817,16 @@
 </w:endnotes>
 </file>
 
+<file path=word/footer1.xml><?xml version="1.0" encoding="utf-8"?>
+<w:ftr xmlns:m="http://schemas.openxmlformats.org/officeDocument/2006/math" xmlns:mc="http://schemas.openxmlformats.org/markup-compatibility/2006" xmlns:mo="http://schemas.microsoft.com/office/mac/office/2008/main" xmlns:mv="urn:schemas-microsoft-com:mac:vml" xmlns:o="urn:schemas-microsoft-com:office:office" xmlns:r="http://schemas.openxmlformats.org/officeDocument/2006/relationships" xmlns:v="urn:schemas-microsoft-com:vml" xmlns:w10="urn:schemas-microsoft-com:office:word" xmlns:w14="http://schemas.microsoft.com/office/word/2010/wordml" xmlns:w="http://schemas.openxmlformats.org/wordprocessingml/2006/main" xmlns:wne="http://schemas.microsoft.com/office/word/2006/wordml" xmlns:wp14="http://schemas.microsoft.com/office/word/2010/wordprocessingDrawing" xmlns:wp="http://schemas.openxmlformats.org/drawingml/2006/wordprocessingDrawing" xmlns:wpc="http://schemas.microsoft.com/office/word/2010/wordprocessingCanvas" xmlns:wpg="http://schemas.microsoft.com/office/word/2010/wordprocessingGroup" xmlns:wpi="http://schemas.microsoft.com/office/word/2010/wordprocessingInk" xmlns:wps="http://schemas.microsoft.com/office/word/2010/wordprocessingShape" mc:Ignorable="w14 wp14">
+  <w:p>
+    <w:pPr>
+      <w:pStyle w:val="Footer"/>
+    </w:pPr>
+  </w:p>
+</w:ftr>
+</file>
+
 <file path=word/footnotes.xml><?xml version="1.0" encoding="utf-8"?>
 <w:footnotes xmlns:wpc="http://schemas.microsoft.com/office/word/2010/wordprocessingCanvas" xmlns:mc="http://schemas.openxmlformats.org/markup-compatibility/2006" xmlns:o="urn:schemas-microsoft-com:office:office" xmlns:r="http://schemas.openxmlformats.org/officeDocument/2006/relationships" xmlns:m="http://schemas.openxmlformats.org/officeDocument/2006/math" xmlns:v="urn:schemas-microsoft-com:vml" xmlns:wp14="http://schemas.microsoft.com/office/word/2010/wordprocessingDrawing" xmlns:wp="http://schemas.openxmlformats.org/drawingml/2006/wordprocessingDrawing" xmlns:w10="urn:schemas-microsoft-com:office:word" xmlns:w="http://schemas.openxmlformats.org/wordprocessingml/2006/main" xmlns:w14="http://schemas.microsoft.com/office/word/2010/wordml" xmlns:w15="http://schemas.microsoft.com/office/word/2012/wordml" xmlns:wpg="http://schemas.microsoft.com/office/word/2010/wordprocessingGroup" xmlns:wpi="http://schemas.microsoft.com/office/word/2010/wordprocessingInk" xmlns:wne="http://schemas.microsoft.com/office/word/2006/wordml" xmlns:wps="http://schemas.microsoft.com/office/word/2010/wordprocessingShape" mc:Ignorable="w14 w15 wp14">
   <w:footnote w:type="separator" w:id="-1">
@@ -7850,6 +7862,16 @@
     </w:p>
   </w:footnote>
 </w:footnotes>
+</file>
+
+<file path=word/header1.xml><?xml version="1.0" encoding="utf-8"?>
+<w:hdr xmlns:m="http://schemas.openxmlformats.org/officeDocument/2006/math" xmlns:mc="http://schemas.openxmlformats.org/markup-compatibility/2006" xmlns:mo="http://schemas.microsoft.com/office/mac/office/2008/main" xmlns:mv="urn:schemas-microsoft-com:mac:vml" xmlns:o="urn:schemas-microsoft-com:office:office" xmlns:r="http://schemas.openxmlformats.org/officeDocument/2006/relationships" xmlns:v="urn:schemas-microsoft-com:vml" xmlns:w10="urn:schemas-microsoft-com:office:word" xmlns:w14="http://schemas.microsoft.com/office/word/2010/wordml" xmlns:w="http://schemas.openxmlformats.org/wordprocessingml/2006/main" xmlns:wne="http://schemas.microsoft.com/office/word/2006/wordml" xmlns:wp14="http://schemas.microsoft.com/office/word/2010/wordprocessingDrawing" xmlns:wp="http://schemas.openxmlformats.org/drawingml/2006/wordprocessingDrawing" xmlns:wpc="http://schemas.microsoft.com/office/word/2010/wordprocessingCanvas" xmlns:wpg="http://schemas.microsoft.com/office/word/2010/wordprocessingGroup" xmlns:wpi="http://schemas.microsoft.com/office/word/2010/wordprocessingInk" xmlns:wps="http://schemas.microsoft.com/office/word/2010/wordprocessingShape" mc:Ignorable="w14 wp14">
+  <w:p>
+    <w:pPr>
+      <w:pStyle w:val="Header"/>
+    </w:pPr>
+  </w:p>
+</w:hdr>
 </file>
 
 <file path=word/numbering.xml><?xml version="1.0" encoding="utf-8"?>

</xml_diff>

<commit_message>
Release 1.0: decks, website books, QuickStart and changelogs
Excel-AI deck CPAT-AI_Overview_v1.0.0.pptx (Coded CPAT slide; counts from BUGS.md and
ISSUES.md; the full-check note names the version it last ran on); Coded CPAT deck
Coded-CPAT_Overview_v1.0.0p1.0.pptx; both website books re-rendered (64 tests pass);
equation lists and spec Word copies regenerated; HumanReadme-QuickStart.docx at 1.0.0;
CAVEATS entry for the release.

Co-Authored-By: Claude Opus 5.5 <noreply@anthropic.com>
Claude-Session: https://claude.ai/code/session_01VSHkeG2g7jKJXypZEVGQ8n
</commit_message>
<xml_diff>
--- a/HumanReadme-QuickStart.docx
+++ b/HumanReadme-QuickStart.docx
@@ -15,7 +15,7 @@
         <w:spacing w:after="200"/>
       </w:pPr>
       <w:r>
-        <w:t>A short, human-readable orientation to the cpat_ai repository, mostly about the Excel prototype. Written 2026-10-29 for prototype v0.8.5, updated for v0.9.0. The detail lives in the documents listed in section 1; this guide only points to them.</w:t>
+        <w:t>A short, human-readable orientation to the cpat_ai repository, mostly about the Excel prototype. Written 2026-10-29 for prototype v0.8.5, updated for the first full release, v1.0.0. The detail lives in the documents listed in section 1; this guide only points to them.</w:t>
       </w:r>
       <w:r>
         <w:rPr>
@@ -40,7 +40,7 @@
         <w:spacing w:after="100"/>
       </w:pPr>
       <w:r>
-        <w:t>Paths are relative to the repository root. Files named _v&lt;version&gt; carry the current version (today v0.9.0); older versions are in excel_ai/releases/.</w:t>
+        <w:t>Paths are relative to the repository root. Files named _v&lt;version&gt; carry the current version (today v1.0.0); older versions are in excel_ai/releases/.</w:t>
       </w:r>
       <w:r>
         <w:rPr>
@@ -2158,33 +2158,25 @@
           <w:b/>
           <w:bCs/>
         </w:rPr>
-        <w:t xml:space="preserve">The repo has a data store</w:t>
-      </w:r>
-      <w:r>
-        <w:t xml:space="preserve"> in </w:t>
-      </w:r>
-      <w:r>
-        <w:rPr>
-          <w:rFonts w:ascii="Consolas" w:cs="Consolas" w:eastAsia="Consolas" w:hAnsi="Consolas"/>
-          <w:color w:val="7F3F00"/>
-          <w:sz w:val="19"/>
-          <w:szCs w:val="19"/>
-        </w:rPr>
-        <w:t xml:space="preserve">data/</w:t>
-      </w:r>
-      <w:r>
-        <w:t xml:space="preserve">: the CPAT data tables in Python and CPAT layouts, with the scripts that convert them. The data are real except for the </w:t>
-      </w:r>
-      <w:r>
-        <w:rPr>
-          <w:b/>
-          <w:bCs/>
-        </w:rPr>
-        <w:t xml:space="preserve">four proprietary tables</w:t>
-      </w:r>
-      <w:r>
-        <w:t xml:space="preserve">, where dummy data with the same layout are used.</w:t>
-      </w:r>
+        <w:t>The repo has a data store in data/: the CPAT data tables in Python and CPAT layouts, with the scripts that convert them. Coded CPAT reads data/tidy/: the public legacy tables plus the Egypt rows of the proprietary tables that the public legacy file contains. Every table in data/dummy/ is dummy (fake values in the real formats), not only the four proprietary ones.</w:t>
+      </w:r>
+      <w:r/>
+      <w:r>
+        <w:rPr>
+          <w:rFonts w:ascii="Consolas" w:cs="Consolas" w:eastAsia="Consolas" w:hAnsi="Consolas"/>
+          <w:color w:val="7F3F00"/>
+          <w:sz w:val="19"/>
+          <w:szCs w:val="19"/>
+        </w:rPr>
+      </w:r>
+      <w:r/>
+      <w:r>
+        <w:rPr>
+          <w:b/>
+          <w:bCs/>
+        </w:rPr>
+      </w:r>
+      <w:r/>
     </w:p>
     <w:p>
       <w:pPr>
@@ -3122,7 +3114,7 @@
         <w:pStyle w:val="Heading2"/>
       </w:pPr>
       <w:r>
-        <w:t>Where things stand (v0.9.0)</w:t>
+        <w:t>Where things stand (v1.0.0)</w:t>
       </w:r>
     </w:p>
     <w:tbl>
@@ -3222,7 +3214,7 @@
           </w:tcPr>
           <w:p>
             <w:r>
-              <w:t>222 legacy bugs (L)</w:t>
+              <w:t>227 legacy bugs (L)</w:t>
             </w:r>
           </w:p>
         </w:tc>
@@ -3244,7 +3236,7 @@
           </w:tcPr>
           <w:p>
             <w:r>
-              <w:t>Fixed in the prototype, except 26 in parts not built (R4, R5, R12 deferred and a few display rows). In legacy 465 (CPAT team): 52 fixed, 9 fixed with caveats, 2 marked fixed but not fixed, 159 outstanding.</w:t>
+              <w:t>Fixed in the prototype, except 26 in parts not built (R4, R5, R12 deferred and a few display rows). In legacy 465 (CPAT team): 52 fixed, 9 fixed with caveats, 2 marked fixed but not fixed, 164 outstanding.</w:t>
             </w:r>
             <w:r>
               <w:rPr>
@@ -3278,7 +3270,7 @@
           </w:tcPr>
           <w:p>
             <w:r>
-              <w:t xml:space="preserve">14 prototype bugs (M)</w:t>
+              <w:t>22 prototype bugs (M)</w:t>
             </w:r>
           </w:p>
         </w:tc>
@@ -3300,7 +3292,7 @@
           </w:tcPr>
           <w:p>
             <w:r>
-              <w:t xml:space="preserve">All fixed.</w:t>
+              <w:t>All fixed (1 withdrawn: not a bug); M15-M22 were found by Coded CPAT.</w:t>
             </w:r>
           </w:p>
         </w:tc>
@@ -3327,7 +3319,7 @@
           </w:tcPr>
           <w:p>
             <w:r>
-              <w:t>134 issues (I), 14 of them data problems</w:t>
+              <w:t>135 issues (I), 14 of them data problems</w:t>
             </w:r>
           </w:p>
         </w:tc>
@@ -3349,7 +3341,7 @@
           </w:tcPr>
           <w:p>
             <w:r>
-              <w:t>90 accepted, 18 resolved, 4 closed, 4 dropped, 18 open (including the open data problems).</w:t>
+              <w:t>90 accepted, 19 open, 18 resolved, 4 dropped, 4 closed (the open ones include the open data problems).</w:t>
             </w:r>
           </w:p>
         </w:tc>
@@ -3631,7 +3623,7 @@
           <w:b/>
           <w:bCs/>
         </w:rPr>
-        <w:t>Versions (section 5): never edit a released workbook; build the next version. Main files are &lt;Name&gt;_v&lt;version&gt;, e.g. CPAT-AI-Mitigation-Prototype_v0.9.0.xlsm; older ones go to releases/.</w:t>
+        <w:t>Versions (section 5): never edit a released workbook; build the next version. Main files are &lt;Name&gt;_v&lt;version&gt;, e.g. CPAT-AI-Mitigation-Prototype_v1.0.0.xlsm; older ones go to releases/.</w:t>
       </w:r>
       <w:r/>
       <w:r>
@@ -4015,7 +4007,7 @@
         <w:spacing w:after="40"/>
       </w:pPr>
       <w:r>
-        <w:t>“What changed between v0.8.5 and v0.9.0?” (it reads CAVEATS.md and the version log)</w:t>
+        <w:t>“What changed between v0.9.2 and v1.0.0?” (it reads CAVEATS.md and the version log)</w:t>
       </w:r>
       <w:r>
         <w:rPr>
@@ -4607,32 +4599,26 @@
         <w:spacing w:after="40"/>
       </w:pPr>
       <w:r>
-        <w:t xml:space="preserve">Python model: </w:t>
-      </w:r>
-      <w:r>
-        <w:rPr>
-          <w:rFonts w:ascii="Consolas" w:cs="Consolas" w:eastAsia="Consolas" w:hAnsi="Consolas"/>
-          <w:color w:val="7F3F00"/>
-          <w:sz w:val="19"/>
-          <w:szCs w:val="19"/>
-        </w:rPr>
-        <w:t xml:space="preserve">coded/README.md</w:t>
-      </w:r>
-      <w:r>
-        <w:t xml:space="preserve"> and </w:t>
-      </w:r>
-      <w:r>
-        <w:rPr>
-          <w:rFonts w:ascii="Consolas" w:cs="Consolas" w:eastAsia="Consolas" w:hAnsi="Consolas"/>
-          <w:color w:val="7F3F00"/>
-          <w:sz w:val="19"/>
-          <w:szCs w:val="19"/>
-        </w:rPr>
-        <w:t xml:space="preserve">coded/TODO.md</w:t>
-      </w:r>
-      <w:r>
-        <w:t xml:space="preserve">.</w:t>
-      </w:r>
+        <w:t>Python model (Coded CPAT 1.0.0p1.0, equal to the prototype code by code): coded/README.md, its deck coded/cpat_documentation/Coded-CPAT_Overview_v&lt;version&gt;.pptx and the Coded CPAT tab of the website.</w:t>
+      </w:r>
+      <w:r>
+        <w:rPr>
+          <w:rFonts w:ascii="Consolas" w:cs="Consolas" w:eastAsia="Consolas" w:hAnsi="Consolas"/>
+          <w:color w:val="7F3F00"/>
+          <w:sz w:val="19"/>
+          <w:szCs w:val="19"/>
+        </w:rPr>
+      </w:r>
+      <w:r/>
+      <w:r>
+        <w:rPr>
+          <w:rFonts w:ascii="Consolas" w:cs="Consolas" w:eastAsia="Consolas" w:hAnsi="Consolas"/>
+          <w:color w:val="7F3F00"/>
+          <w:sz w:val="19"/>
+          <w:szCs w:val="19"/>
+        </w:rPr>
+      </w:r>
+      <w:r/>
     </w:p>
     <w:p>
       <w:pPr>

</xml_diff>